<commit_message>
feat: Add Evaluation section
</commit_message>
<xml_diff>
--- a/МаркоЕрдељи_зборник.docx
+++ b/МаркоЕрдељи_зборник.docx
@@ -902,7 +902,21 @@
           <w:rtl w:val="0"/>
           <w:lang w:val="pt-PT"/>
         </w:rPr>
-        <w:t xml:space="preserve">[2][3]. Reeves </w:t>
+        <w:t>[2</w:t>
+      </w:r>
+      <w:r>
+        <w:rPr>
+          <w:rtl w:val="0"/>
+          <w:lang w:val="en-US"/>
+        </w:rPr>
+        <w:t xml:space="preserve">, </w:t>
+      </w:r>
+      <w:r>
+        <w:rPr>
+          <w:rtl w:val="0"/>
+          <w:lang w:val="pt-PT"/>
+        </w:rPr>
+        <w:t xml:space="preserve">3]. Reeves </w:t>
       </w:r>
       <w:r>
         <w:rPr>
@@ -987,9 +1001,23 @@
       <w:r>
         <w:rPr>
           <w:rtl w:val="0"/>
+        </w:rPr>
+        <w:t xml:space="preserve">. </w:t>
+      </w:r>
+      <w:r>
+        <w:rPr>
+          <w:i w:val="1"/>
+          <w:iCs w:val="1"/>
+          <w:rtl w:val="0"/>
           <w:lang w:val="en-US"/>
         </w:rPr>
-        <w:t xml:space="preserve">. container runtime) </w:t>
+        <w:t>container runtime</w:t>
+      </w:r>
+      <w:r>
+        <w:rPr>
+          <w:rtl w:val="0"/>
+        </w:rPr>
+        <w:t xml:space="preserve">) </w:t>
       </w:r>
       <w:r>
         <w:rPr>
@@ -1091,7 +1119,21 @@
           <w:rtl w:val="0"/>
           <w:lang w:val="pt-PT"/>
         </w:rPr>
-        <w:t xml:space="preserve">[4][5]. </w:t>
+        <w:t>[4</w:t>
+      </w:r>
+      <w:r>
+        <w:rPr>
+          <w:rtl w:val="0"/>
+          <w:lang w:val="en-US"/>
+        </w:rPr>
+        <w:t xml:space="preserve">, </w:t>
+      </w:r>
+      <w:r>
+        <w:rPr>
+          <w:rtl w:val="0"/>
+          <w:lang w:val="pt-PT"/>
+        </w:rPr>
+        <w:t xml:space="preserve">5]. </w:t>
       </w:r>
       <w:r>
         <w:rPr>
@@ -1153,9 +1195,23 @@
       <w:r>
         <w:rPr>
           <w:rtl w:val="0"/>
+        </w:rPr>
+        <w:t xml:space="preserve">. </w:t>
+      </w:r>
+      <w:r>
+        <w:rPr>
+          <w:i w:val="1"/>
+          <w:iCs w:val="1"/>
+          <w:rtl w:val="0"/>
           <w:lang w:val="en-US"/>
         </w:rPr>
-        <w:t xml:space="preserve">. zero-day vulnerabilities) </w:t>
+        <w:t>zero-day vulnerabilities</w:t>
+      </w:r>
+      <w:r>
+        <w:rPr>
+          <w:rtl w:val="0"/>
+        </w:rPr>
+        <w:t xml:space="preserve">) </w:t>
       </w:r>
       <w:r>
         <w:rPr>
@@ -1968,11 +2024,6 @@
     </w:p>
     <w:p>
       <w:pPr>
-        <w:pStyle w:val="0 - Текст рада"/>
-      </w:pPr>
-    </w:p>
-    <w:p>
-      <w:pPr>
         <w:pStyle w:val="Default"/>
         <w:tabs>
           <w:tab w:val="left" w:pos="593"/>
@@ -2283,6 +2334,185 @@
         </w:rPr>
         <w:t>.</w:t>
       </w:r>
+      <w:r>
+        <w:rPr>
+          <w:rFonts w:ascii="Times New Roman" w:cs="Times New Roman" w:hAnsi="Times New Roman" w:eastAsia="Times New Roman"/>
+          <w:outline w:val="0"/>
+          <w:color w:val="000000"/>
+          <w:sz w:val="20"/>
+          <w:szCs w:val="20"/>
+          <w:shd w:val="clear" w:color="auto" w:fill="fffeff"/>
+          <w14:textFill>
+            <w14:solidFill>
+              <w14:srgbClr w14:val="000000">
+                <w14:alpha w14:val="14999"/>
+              </w14:srgbClr>
+            </w14:solidFill>
+          </w14:textFill>
+        </w:rPr>
+        <mc:AlternateContent>
+          <mc:Choice Requires="wpg">
+            <w:drawing xmlns:a="http://schemas.openxmlformats.org/drawingml/2006/main">
+              <wp:anchor distT="152400" distB="152400" distL="152400" distR="152400" simplePos="0" relativeHeight="251659264" behindDoc="0" locked="0" layoutInCell="1" allowOverlap="1">
+                <wp:simplePos x="0" y="0"/>
+                <wp:positionH relativeFrom="margin">
+                  <wp:posOffset>304271</wp:posOffset>
+                </wp:positionH>
+                <wp:positionV relativeFrom="line">
+                  <wp:posOffset>508390</wp:posOffset>
+                </wp:positionV>
+                <wp:extent cx="5507777" cy="4345774"/>
+                <wp:effectExtent l="0" t="0" r="0" b="0"/>
+                <wp:wrapSquare wrapText="bothSides" distL="152400" distR="152400" distT="152400" distB="152400"/>
+                <wp:docPr id="1073741828" name="officeArt object" descr="Image Gallery"/>
+                <wp:cNvGraphicFramePr/>
+                <a:graphic xmlns:a="http://schemas.openxmlformats.org/drawingml/2006/main">
+                  <a:graphicData uri="http://schemas.microsoft.com/office/word/2010/wordprocessingGroup">
+                    <wpg:wgp>
+                      <wpg:cNvGrpSpPr/>
+                      <wpg:grpSpPr>
+                        <a:xfrm>
+                          <a:off x="0" y="0"/>
+                          <a:ext cx="5507777" cy="4345774"/>
+                          <a:chOff x="0" y="-325344"/>
+                          <a:chExt cx="5507776" cy="4345773"/>
+                        </a:xfrm>
+                      </wpg:grpSpPr>
+                      <pic:pic xmlns:pic="http://schemas.openxmlformats.org/drawingml/2006/picture">
+                        <pic:nvPicPr>
+                          <pic:cNvPr id="1073741826" name="arhitektura-sistema.png" descr="arhitektura-sistema.png"/>
+                          <pic:cNvPicPr>
+                            <a:picLocks noChangeAspect="1"/>
+                          </pic:cNvPicPr>
+                        </pic:nvPicPr>
+                        <pic:blipFill>
+                          <a:blip r:embed="rId7">
+                            <a:extLst/>
+                          </a:blip>
+                          <a:srcRect l="2003" t="0" r="2003" b="0"/>
+                          <a:stretch>
+                            <a:fillRect/>
+                          </a:stretch>
+                        </pic:blipFill>
+                        <pic:spPr>
+                          <a:xfrm>
+                            <a:off x="0" y="0"/>
+                            <a:ext cx="5507777" cy="4020430"/>
+                          </a:xfrm>
+                          <a:prstGeom prst="rect">
+                            <a:avLst/>
+                          </a:prstGeom>
+                          <a:ln w="12700" cap="flat">
+                            <a:noFill/>
+                            <a:miter lim="400000"/>
+                          </a:ln>
+                          <a:effectLst/>
+                        </pic:spPr>
+                      </pic:pic>
+                      <wps:wsp>
+                        <wps:cNvPr id="1073741827" name="Слика 1 Архитектура система"/>
+                        <wps:cNvSpPr/>
+                        <wps:spPr>
+                          <a:xfrm>
+                            <a:off x="0" y="-325345"/>
+                            <a:ext cx="5507777" cy="223745"/>
+                          </a:xfrm>
+                          <a:prstGeom prst="roundRect">
+                            <a:avLst>
+                              <a:gd name="adj" fmla="val 0"/>
+                            </a:avLst>
+                          </a:prstGeom>
+                          <a:noFill/>
+                          <a:ln w="12700" cap="flat">
+                            <a:noFill/>
+                            <a:miter lim="400000"/>
+                          </a:ln>
+                          <a:effectLst/>
+                        </wps:spPr>
+                        <wps:txbx>
+                          <w:txbxContent>
+                            <w:p>
+                              <w:pPr>
+                                <w:pStyle w:val="caption"/>
+                                <w:suppressAutoHyphens w:val="1"/>
+                              </w:pPr>
+                              <w:r>
+                                <w:rPr>
+                                  <w:rtl w:val="0"/>
+                                </w:rPr>
+                                <w:t xml:space="preserve">Слика </w:t>
+                              </w:r>
+                              <w:r>
+                                <w:rPr>
+                                  <w:rtl w:val="0"/>
+                                  <w:lang w:val="ru-RU"/>
+                                </w:rPr>
+                                <w:t xml:space="preserve">1 </w:t>
+                              </w:r>
+                              <w:r>
+                                <w:rPr>
+                                  <w:rtl w:val="0"/>
+                                </w:rPr>
+                                <w:t>Архитектура система</w:t>
+                              </w:r>
+                            </w:p>
+                          </w:txbxContent>
+                        </wps:txbx>
+                        <wps:bodyPr wrap="square" lIns="50800" tIns="50800" rIns="50800" bIns="50800" numCol="1" anchor="t">
+                          <a:noAutofit/>
+                        </wps:bodyPr>
+                      </wps:wsp>
+                    </wpg:wgp>
+                  </a:graphicData>
+                </a:graphic>
+              </wp:anchor>
+            </w:drawing>
+          </mc:Choice>
+          <mc:Fallback>
+            <w:pict>
+              <v:group id="_x0000_s1026" style="visibility:visible;position:absolute;margin-left:24.0pt;margin-top:40.0pt;width:433.7pt;height:342.2pt;z-index:251659264;mso-position-horizontal:absolute;mso-position-horizontal-relative:margin;mso-position-vertical:absolute;mso-position-vertical-relative:line;mso-wrap-distance-left:12.0pt;mso-wrap-distance-top:12.0pt;mso-wrap-distance-right:12.0pt;mso-wrap-distance-bottom:12.0pt;" coordorigin="0,-325344" coordsize="5507776,4345773">
+                <w10:wrap type="square" side="bothSides" anchorx="margin"/>
+                <v:shape id="_x0000_s1027" type="#_x0000_t75" style="position:absolute;left:0;top:0;width:5507776;height:4020429;">
+                  <v:imagedata r:id="rId7" o:title="arhitektura-sistema.png" cropleft="2.0%" cropright="2.0%"/>
+                </v:shape>
+                <v:roundrect id="_x0000_s1028" style="position:absolute;left:0;top:-325344;width:5507776;height:223744;" adj="0">
+                  <v:fill on="f"/>
+                  <v:stroke on="f" weight="1.0pt" dashstyle="solid" endcap="flat" miterlimit="400.0%" joinstyle="miter" linestyle="single" startarrow="none" startarrowwidth="medium" startarrowlength="medium" endarrow="none" endarrowwidth="medium" endarrowlength="medium"/>
+                  <v:textbox>
+                    <w:txbxContent>
+                      <w:p>
+                        <w:pPr>
+                          <w:pStyle w:val="caption"/>
+                          <w:suppressAutoHyphens w:val="1"/>
+                        </w:pPr>
+                        <w:r>
+                          <w:rPr>
+                            <w:rtl w:val="0"/>
+                          </w:rPr>
+                          <w:t xml:space="preserve">Слика </w:t>
+                        </w:r>
+                        <w:r>
+                          <w:rPr>
+                            <w:rtl w:val="0"/>
+                            <w:lang w:val="ru-RU"/>
+                          </w:rPr>
+                          <w:t xml:space="preserve">1 </w:t>
+                        </w:r>
+                        <w:r>
+                          <w:rPr>
+                            <w:rtl w:val="0"/>
+                          </w:rPr>
+                          <w:t>Архитектура система</w:t>
+                        </w:r>
+                      </w:p>
+                    </w:txbxContent>
+                  </v:textbox>
+                </v:roundrect>
+              </v:group>
+            </w:pict>
+          </mc:Fallback>
+        </mc:AlternateContent>
+      </w:r>
     </w:p>
     <w:p>
       <w:pPr>
@@ -3144,52 +3374,2851 @@
     </w:p>
     <w:p>
       <w:pPr>
-        <w:pStyle w:val="0 - Текст рада"/>
-      </w:pPr>
-    </w:p>
-    <w:p>
-      <w:pPr>
-        <w:pStyle w:val="0 - Текст рада"/>
-      </w:pPr>
-    </w:p>
-    <w:p>
-      <w:pPr>
-        <w:pStyle w:val="0 - Текст рада"/>
-      </w:pPr>
-    </w:p>
-    <w:p>
-      <w:pPr>
-        <w:pStyle w:val="0 - Текст рада"/>
-      </w:pPr>
-    </w:p>
-    <w:p>
-      <w:pPr>
-        <w:pStyle w:val="0 - Текст рада"/>
-      </w:pPr>
-    </w:p>
-    <w:p>
-      <w:pPr>
-        <w:pStyle w:val="0 - Текст рада"/>
-      </w:pPr>
-    </w:p>
-    <w:p>
-      <w:pPr>
-        <w:pStyle w:val="0 - Текст рада"/>
-      </w:pPr>
-    </w:p>
-    <w:p>
-      <w:pPr>
-        <w:pStyle w:val="0 - Текст рада"/>
-      </w:pPr>
-    </w:p>
-    <w:p>
-      <w:pPr>
-        <w:pStyle w:val="0 - Текст рада"/>
-      </w:pPr>
-    </w:p>
-    <w:p>
-      <w:pPr>
-        <w:pStyle w:val="0 - Текст рада"/>
+        <w:pStyle w:val="2 - Подпоглавље"/>
+        <w:numPr>
+          <w:ilvl w:val="1"/>
+          <w:numId w:val="2"/>
+        </w:numPr>
+      </w:pPr>
+      <w:r>
+        <w:rPr>
+          <w:rtl w:val="0"/>
+          <w:lang w:val="en-US"/>
+        </w:rPr>
+        <w:t xml:space="preserve"> </w:t>
+      </w:r>
+      <w:r>
+        <w:rPr>
+          <w:rtl w:val="0"/>
+        </w:rPr>
+        <w:t>Архитектура система</w:t>
+      </w:r>
+    </w:p>
+    <w:p>
+      <w:pPr>
+        <w:pStyle w:val="Default"/>
+        <w:tabs>
+          <w:tab w:val="left" w:pos="593"/>
+          <w:tab w:val="left" w:pos="1186"/>
+          <w:tab w:val="left" w:pos="1779"/>
+          <w:tab w:val="left" w:pos="2372"/>
+          <w:tab w:val="left" w:pos="2965"/>
+          <w:tab w:val="left" w:pos="3558"/>
+          <w:tab w:val="left" w:pos="4151"/>
+          <w:tab w:val="left" w:pos="4744"/>
+          <w:tab w:val="left" w:pos="5337"/>
+          <w:tab w:val="left" w:pos="5930"/>
+          <w:tab w:val="left" w:pos="6523"/>
+          <w:tab w:val="left" w:pos="7116"/>
+          <w:tab w:val="left" w:pos="7709"/>
+          <w:tab w:val="left" w:pos="8302"/>
+          <w:tab w:val="left" w:pos="8895"/>
+          <w:tab w:val="left" w:pos="9488"/>
+        </w:tabs>
+        <w:suppressAutoHyphens w:val="1"/>
+        <w:spacing w:before="0" w:line="240" w:lineRule="auto"/>
+        <w:jc w:val="left"/>
+        <w:rPr>
+          <w:rFonts w:ascii="Times New Roman" w:cs="Times New Roman" w:hAnsi="Times New Roman" w:eastAsia="Times New Roman"/>
+          <w:outline w:val="0"/>
+          <w:color w:val="000000"/>
+          <w:sz w:val="20"/>
+          <w:szCs w:val="20"/>
+          <w:shd w:val="clear" w:color="auto" w:fill="fffeff"/>
+          <w14:textFill>
+            <w14:solidFill>
+              <w14:srgbClr w14:val="000000">
+                <w14:alpha w14:val="14999"/>
+              </w14:srgbClr>
+            </w14:solidFill>
+          </w14:textFill>
+        </w:rPr>
+      </w:pPr>
+      <w:r>
+        <w:rPr>
+          <w:rFonts w:ascii="Times New Roman" w:hAnsi="Times New Roman" w:hint="default"/>
+          <w:outline w:val="0"/>
+          <w:color w:val="000000"/>
+          <w:sz w:val="20"/>
+          <w:szCs w:val="20"/>
+          <w:shd w:val="clear" w:color="auto" w:fill="fffeff"/>
+          <w:rtl w:val="0"/>
+          <w14:textFill>
+            <w14:solidFill>
+              <w14:srgbClr w14:val="000000">
+                <w14:alpha w14:val="14999"/>
+              </w14:srgbClr>
+            </w14:solidFill>
+          </w14:textFill>
+        </w:rPr>
+        <w:t xml:space="preserve">Спољашњи слој евалуационог оквира је </w:t>
+      </w:r>
+      <w:r>
+        <w:rPr>
+          <w:rFonts w:ascii="Times New Roman" w:hAnsi="Times New Roman"/>
+          <w:outline w:val="0"/>
+          <w:color w:val="000000"/>
+          <w:sz w:val="20"/>
+          <w:szCs w:val="20"/>
+          <w:shd w:val="clear" w:color="auto" w:fill="fffeff"/>
+          <w:rtl w:val="0"/>
+          <w14:textFill>
+            <w14:solidFill>
+              <w14:srgbClr w14:val="000000">
+                <w14:alpha w14:val="14999"/>
+              </w14:srgbClr>
+            </w14:solidFill>
+          </w14:textFill>
+        </w:rPr>
+        <w:t xml:space="preserve">macOS </w:t>
+      </w:r>
+      <w:r>
+        <w:rPr>
+          <w:rFonts w:ascii="Times New Roman" w:hAnsi="Times New Roman" w:hint="default"/>
+          <w:outline w:val="0"/>
+          <w:color w:val="000000"/>
+          <w:sz w:val="20"/>
+          <w:szCs w:val="20"/>
+          <w:shd w:val="clear" w:color="auto" w:fill="fffeff"/>
+          <w:rtl w:val="0"/>
+          <w14:textFill>
+            <w14:solidFill>
+              <w14:srgbClr w14:val="000000">
+                <w14:alpha w14:val="14999"/>
+              </w14:srgbClr>
+            </w14:solidFill>
+          </w14:textFill>
+        </w:rPr>
+        <w:t>домаћин</w:t>
+      </w:r>
+      <w:r>
+        <w:rPr>
+          <w:rFonts w:ascii="Times New Roman" w:hAnsi="Times New Roman"/>
+          <w:outline w:val="0"/>
+          <w:color w:val="000000"/>
+          <w:sz w:val="20"/>
+          <w:szCs w:val="20"/>
+          <w:shd w:val="clear" w:color="auto" w:fill="fffeff"/>
+          <w:rtl w:val="0"/>
+          <w14:textFill>
+            <w14:solidFill>
+              <w14:srgbClr w14:val="000000">
+                <w14:alpha w14:val="14999"/>
+              </w14:srgbClr>
+            </w14:solidFill>
+          </w14:textFill>
+        </w:rPr>
+        <w:t xml:space="preserve">. </w:t>
+      </w:r>
+      <w:r>
+        <w:rPr>
+          <w:rFonts w:ascii="Times New Roman" w:hAnsi="Times New Roman" w:hint="default"/>
+          <w:outline w:val="0"/>
+          <w:color w:val="000000"/>
+          <w:sz w:val="20"/>
+          <w:szCs w:val="20"/>
+          <w:shd w:val="clear" w:color="auto" w:fill="fffeff"/>
+          <w:rtl w:val="0"/>
+          <w14:textFill>
+            <w14:solidFill>
+              <w14:srgbClr w14:val="000000">
+                <w14:alpha w14:val="14999"/>
+              </w14:srgbClr>
+            </w14:solidFill>
+          </w14:textFill>
+        </w:rPr>
+        <w:t xml:space="preserve">Сваки сценарио извршава се унутар </w:t>
+      </w:r>
+      <w:r>
+        <w:rPr>
+          <w:rFonts w:ascii="Times New Roman" w:hAnsi="Times New Roman"/>
+          <w:outline w:val="0"/>
+          <w:color w:val="000000"/>
+          <w:sz w:val="20"/>
+          <w:szCs w:val="20"/>
+          <w:shd w:val="clear" w:color="auto" w:fill="fffeff"/>
+          <w:rtl w:val="0"/>
+          <w:lang w:val="fr-FR"/>
+          <w14:textFill>
+            <w14:solidFill>
+              <w14:srgbClr w14:val="000000">
+                <w14:alpha w14:val="14999"/>
+              </w14:srgbClr>
+            </w14:solidFill>
+          </w14:textFill>
+        </w:rPr>
+        <w:t xml:space="preserve">Linux </w:t>
+      </w:r>
+      <w:r>
+        <w:rPr>
+          <w:rFonts w:ascii="Times New Roman" w:hAnsi="Times New Roman" w:hint="default"/>
+          <w:outline w:val="0"/>
+          <w:color w:val="000000"/>
+          <w:sz w:val="20"/>
+          <w:szCs w:val="20"/>
+          <w:shd w:val="clear" w:color="auto" w:fill="fffeff"/>
+          <w:rtl w:val="0"/>
+          <w:lang w:val="ru-RU"/>
+          <w14:textFill>
+            <w14:solidFill>
+              <w14:srgbClr w14:val="000000">
+                <w14:alpha w14:val="14999"/>
+              </w14:srgbClr>
+            </w14:solidFill>
+          </w14:textFill>
+        </w:rPr>
+        <w:t xml:space="preserve">виртуелне машине </w:t>
+      </w:r>
+      <w:r>
+        <w:rPr>
+          <w:rFonts w:ascii="Times New Roman" w:hAnsi="Times New Roman"/>
+          <w:outline w:val="0"/>
+          <w:color w:val="000000"/>
+          <w:sz w:val="20"/>
+          <w:szCs w:val="20"/>
+          <w:shd w:val="clear" w:color="auto" w:fill="fffeff"/>
+          <w:rtl w:val="0"/>
+          <w14:textFill>
+            <w14:solidFill>
+              <w14:srgbClr w14:val="000000">
+                <w14:alpha w14:val="14999"/>
+              </w14:srgbClr>
+            </w14:solidFill>
+          </w14:textFill>
+        </w:rPr>
+        <w:t xml:space="preserve">(Ubuntu 22.04) </w:t>
+      </w:r>
+      <w:r>
+        <w:rPr>
+          <w:rFonts w:ascii="Times New Roman" w:hAnsi="Times New Roman" w:hint="default"/>
+          <w:outline w:val="0"/>
+          <w:color w:val="000000"/>
+          <w:sz w:val="20"/>
+          <w:szCs w:val="20"/>
+          <w:shd w:val="clear" w:color="auto" w:fill="fffeff"/>
+          <w:rtl w:val="0"/>
+          <w:lang w:val="ru-RU"/>
+          <w14:textFill>
+            <w14:solidFill>
+              <w14:srgbClr w14:val="000000">
+                <w14:alpha w14:val="14999"/>
+              </w14:srgbClr>
+            </w14:solidFill>
+          </w14:textFill>
+        </w:rPr>
+        <w:t xml:space="preserve">под управом </w:t>
+      </w:r>
+      <w:r>
+        <w:rPr>
+          <w:rFonts w:ascii="Times New Roman" w:hAnsi="Times New Roman"/>
+          <w:outline w:val="0"/>
+          <w:color w:val="000000"/>
+          <w:sz w:val="20"/>
+          <w:szCs w:val="20"/>
+          <w:shd w:val="clear" w:color="auto" w:fill="fffeff"/>
+          <w:rtl w:val="0"/>
+          <w:lang w:val="pt-PT"/>
+          <w14:textFill>
+            <w14:solidFill>
+              <w14:srgbClr w14:val="000000">
+                <w14:alpha w14:val="14999"/>
+              </w14:srgbClr>
+            </w14:solidFill>
+          </w14:textFill>
+        </w:rPr>
+        <w:t xml:space="preserve">Lima </w:t>
+      </w:r>
+      <w:r>
+        <w:rPr>
+          <w:rFonts w:ascii="Times New Roman" w:hAnsi="Times New Roman" w:hint="default"/>
+          <w:outline w:val="0"/>
+          <w:color w:val="000000"/>
+          <w:sz w:val="20"/>
+          <w:szCs w:val="20"/>
+          <w:shd w:val="clear" w:color="auto" w:fill="fffeff"/>
+          <w:rtl w:val="0"/>
+          <w14:textFill>
+            <w14:solidFill>
+              <w14:srgbClr w14:val="000000">
+                <w14:alpha w14:val="14999"/>
+              </w14:srgbClr>
+            </w14:solidFill>
+          </w14:textFill>
+        </w:rPr>
+        <w:t>менаџера</w:t>
+      </w:r>
+      <w:r>
+        <w:rPr>
+          <w:rFonts w:ascii="Times New Roman" w:hAnsi="Times New Roman"/>
+          <w:outline w:val="0"/>
+          <w:color w:val="000000"/>
+          <w:sz w:val="20"/>
+          <w:szCs w:val="20"/>
+          <w:shd w:val="clear" w:color="auto" w:fill="fffeff"/>
+          <w:rtl w:val="0"/>
+          <w14:textFill>
+            <w14:solidFill>
+              <w14:srgbClr w14:val="000000">
+                <w14:alpha w14:val="14999"/>
+              </w14:srgbClr>
+            </w14:solidFill>
+          </w14:textFill>
+        </w:rPr>
+        <w:t xml:space="preserve">, </w:t>
+      </w:r>
+      <w:r>
+        <w:rPr>
+          <w:rFonts w:ascii="Times New Roman" w:hAnsi="Times New Roman" w:hint="default"/>
+          <w:outline w:val="0"/>
+          <w:color w:val="000000"/>
+          <w:sz w:val="20"/>
+          <w:szCs w:val="20"/>
+          <w:shd w:val="clear" w:color="auto" w:fill="fffeff"/>
+          <w:rtl w:val="0"/>
+          <w14:textFill>
+            <w14:solidFill>
+              <w14:srgbClr w14:val="000000">
+                <w14:alpha w14:val="14999"/>
+              </w14:srgbClr>
+            </w14:solidFill>
+          </w14:textFill>
+        </w:rPr>
+        <w:t>чиме потпуно успешно нарушавање изолације контејнера не угрожава машину истраживача</w:t>
+      </w:r>
+      <w:r>
+        <w:rPr>
+          <w:rFonts w:ascii="Times New Roman" w:hAnsi="Times New Roman"/>
+          <w:outline w:val="0"/>
+          <w:color w:val="000000"/>
+          <w:sz w:val="20"/>
+          <w:szCs w:val="20"/>
+          <w:shd w:val="clear" w:color="auto" w:fill="fffeff"/>
+          <w:rtl w:val="0"/>
+          <w14:textFill>
+            <w14:solidFill>
+              <w14:srgbClr w14:val="000000">
+                <w14:alpha w14:val="14999"/>
+              </w14:srgbClr>
+            </w14:solidFill>
+          </w14:textFill>
+        </w:rPr>
+        <w:t xml:space="preserve">. </w:t>
+      </w:r>
+      <w:r>
+        <w:rPr>
+          <w:rFonts w:ascii="Times New Roman" w:hAnsi="Times New Roman" w:hint="default"/>
+          <w:outline w:val="0"/>
+          <w:color w:val="000000"/>
+          <w:sz w:val="20"/>
+          <w:szCs w:val="20"/>
+          <w:shd w:val="clear" w:color="auto" w:fill="fffeff"/>
+          <w:rtl w:val="0"/>
+          <w:lang w:val="ru-RU"/>
+          <w14:textFill>
+            <w14:solidFill>
+              <w14:srgbClr w14:val="000000">
+                <w14:alpha w14:val="14999"/>
+              </w14:srgbClr>
+            </w14:solidFill>
+          </w14:textFill>
+        </w:rPr>
+        <w:t xml:space="preserve">Унутар виртуелне машине </w:t>
+      </w:r>
+      <w:r>
+        <w:rPr>
+          <w:rFonts w:ascii="Times New Roman" w:hAnsi="Times New Roman"/>
+          <w:outline w:val="0"/>
+          <w:color w:val="000000"/>
+          <w:sz w:val="20"/>
+          <w:szCs w:val="20"/>
+          <w:shd w:val="clear" w:color="auto" w:fill="fffeff"/>
+          <w:rtl w:val="0"/>
+          <w:lang w:val="de-DE"/>
+          <w14:textFill>
+            <w14:solidFill>
+              <w14:srgbClr w14:val="000000">
+                <w14:alpha w14:val="14999"/>
+              </w14:srgbClr>
+            </w14:solidFill>
+          </w14:textFill>
+        </w:rPr>
+        <w:t xml:space="preserve">Docker </w:t>
+      </w:r>
+      <w:r>
+        <w:rPr>
+          <w:rFonts w:ascii="Times New Roman" w:hAnsi="Times New Roman" w:hint="default"/>
+          <w:outline w:val="0"/>
+          <w:color w:val="000000"/>
+          <w:sz w:val="20"/>
+          <w:szCs w:val="20"/>
+          <w:shd w:val="clear" w:color="auto" w:fill="fffeff"/>
+          <w:rtl w:val="0"/>
+          <w14:textFill>
+            <w14:solidFill>
+              <w14:srgbClr w14:val="000000">
+                <w14:alpha w14:val="14999"/>
+              </w14:srgbClr>
+            </w14:solidFill>
+          </w14:textFill>
+        </w:rPr>
+        <w:t>покреће два контејнера</w:t>
+      </w:r>
+      <w:r>
+        <w:rPr>
+          <w:rFonts w:ascii="Times New Roman" w:hAnsi="Times New Roman"/>
+          <w:outline w:val="0"/>
+          <w:color w:val="000000"/>
+          <w:sz w:val="20"/>
+          <w:szCs w:val="20"/>
+          <w:shd w:val="clear" w:color="auto" w:fill="fffeff"/>
+          <w:rtl w:val="0"/>
+          <w14:textFill>
+            <w14:solidFill>
+              <w14:srgbClr w14:val="000000">
+                <w14:alpha w14:val="14999"/>
+              </w14:srgbClr>
+            </w14:solidFill>
+          </w14:textFill>
+        </w:rPr>
+        <w:t xml:space="preserve">: </w:t>
+      </w:r>
+      <w:r>
+        <w:rPr>
+          <w:rFonts w:ascii="Times New Roman" w:hAnsi="Times New Roman" w:hint="default"/>
+          <w:outline w:val="0"/>
+          <w:color w:val="000000"/>
+          <w:sz w:val="20"/>
+          <w:szCs w:val="20"/>
+          <w:shd w:val="clear" w:color="auto" w:fill="fffeff"/>
+          <w:rtl w:val="0"/>
+          <w14:textFill>
+            <w14:solidFill>
+              <w14:srgbClr w14:val="000000">
+                <w14:alpha w14:val="14999"/>
+              </w14:srgbClr>
+            </w14:solidFill>
+          </w14:textFill>
+        </w:rPr>
+        <w:t xml:space="preserve">контејнер нападача са </w:t>
+      </w:r>
+      <w:r>
+        <w:rPr>
+          <w:rFonts w:ascii="Times New Roman" w:hAnsi="Times New Roman"/>
+          <w:outline w:val="0"/>
+          <w:color w:val="000000"/>
+          <w:sz w:val="20"/>
+          <w:szCs w:val="20"/>
+          <w:shd w:val="clear" w:color="auto" w:fill="fffeff"/>
+          <w:rtl w:val="0"/>
+          <w:lang w:val="en-US"/>
+          <w14:textFill>
+            <w14:solidFill>
+              <w14:srgbClr w14:val="000000">
+                <w14:alpha w14:val="14999"/>
+              </w14:srgbClr>
+            </w14:solidFill>
+          </w14:textFill>
+        </w:rPr>
+        <w:t xml:space="preserve">Python </w:t>
+      </w:r>
+      <w:r>
+        <w:rPr>
+          <w:rFonts w:ascii="Times New Roman" w:hAnsi="Times New Roman" w:hint="default"/>
+          <w:outline w:val="0"/>
+          <w:color w:val="000000"/>
+          <w:sz w:val="20"/>
+          <w:szCs w:val="20"/>
+          <w:shd w:val="clear" w:color="auto" w:fill="fffeff"/>
+          <w:rtl w:val="0"/>
+          <w:lang w:val="ru-RU"/>
+          <w14:textFill>
+            <w14:solidFill>
+              <w14:srgbClr w14:val="000000">
+                <w14:alpha w14:val="14999"/>
+              </w14:srgbClr>
+            </w14:solidFill>
+          </w14:textFill>
+        </w:rPr>
+        <w:t xml:space="preserve">оркестратором и </w:t>
+      </w:r>
+      <w:r>
+        <w:rPr>
+          <w:rFonts w:ascii="Times New Roman" w:hAnsi="Times New Roman"/>
+          <w:outline w:val="0"/>
+          <w:color w:val="000000"/>
+          <w:sz w:val="20"/>
+          <w:szCs w:val="20"/>
+          <w:shd w:val="clear" w:color="auto" w:fill="fffeff"/>
+          <w:rtl w:val="0"/>
+          <w:lang w:val="da-DK"/>
+          <w14:textFill>
+            <w14:solidFill>
+              <w14:srgbClr w14:val="000000">
+                <w14:alpha w14:val="14999"/>
+              </w14:srgbClr>
+            </w14:solidFill>
+          </w14:textFill>
+        </w:rPr>
+        <w:t xml:space="preserve">LLM </w:t>
+      </w:r>
+      <w:r>
+        <w:rPr>
+          <w:rFonts w:ascii="Times New Roman" w:hAnsi="Times New Roman" w:hint="default"/>
+          <w:outline w:val="0"/>
+          <w:color w:val="000000"/>
+          <w:sz w:val="20"/>
+          <w:szCs w:val="20"/>
+          <w:shd w:val="clear" w:color="auto" w:fill="fffeff"/>
+          <w:rtl w:val="0"/>
+          <w14:textFill>
+            <w14:solidFill>
+              <w14:srgbClr w14:val="000000">
+                <w14:alpha w14:val="14999"/>
+              </w14:srgbClr>
+            </w14:solidFill>
+          </w14:textFill>
+        </w:rPr>
+        <w:t>агентом и контејнер жртве са процесом који чува тајни податак искључиво у радној меморији</w:t>
+      </w:r>
+      <w:r>
+        <w:rPr>
+          <w:rFonts w:ascii="Times New Roman" w:hAnsi="Times New Roman"/>
+          <w:outline w:val="0"/>
+          <w:color w:val="000000"/>
+          <w:sz w:val="20"/>
+          <w:szCs w:val="20"/>
+          <w:shd w:val="clear" w:color="auto" w:fill="fffeff"/>
+          <w:rtl w:val="0"/>
+          <w14:textFill>
+            <w14:solidFill>
+              <w14:srgbClr w14:val="000000">
+                <w14:alpha w14:val="14999"/>
+              </w14:srgbClr>
+            </w14:solidFill>
+          </w14:textFill>
+        </w:rPr>
+        <w:t xml:space="preserve">. </w:t>
+      </w:r>
+      <w:r>
+        <w:rPr>
+          <w:rFonts w:ascii="Times New Roman" w:hAnsi="Times New Roman" w:hint="default"/>
+          <w:outline w:val="0"/>
+          <w:color w:val="000000"/>
+          <w:sz w:val="20"/>
+          <w:szCs w:val="20"/>
+          <w:shd w:val="clear" w:color="auto" w:fill="fffeff"/>
+          <w:rtl w:val="0"/>
+          <w14:textFill>
+            <w14:solidFill>
+              <w14:srgbClr w14:val="000000">
+                <w14:alpha w14:val="14999"/>
+              </w14:srgbClr>
+            </w14:solidFill>
+          </w14:textFill>
+        </w:rPr>
+        <w:t xml:space="preserve">Архитектура је приказана на Слици </w:t>
+      </w:r>
+      <w:r>
+        <w:rPr>
+          <w:rFonts w:ascii="Times New Roman" w:hAnsi="Times New Roman"/>
+          <w:outline w:val="0"/>
+          <w:color w:val="000000"/>
+          <w:sz w:val="20"/>
+          <w:szCs w:val="20"/>
+          <w:shd w:val="clear" w:color="auto" w:fill="fffeff"/>
+          <w:rtl w:val="0"/>
+          <w14:textFill>
+            <w14:solidFill>
+              <w14:srgbClr w14:val="000000">
+                <w14:alpha w14:val="14999"/>
+              </w14:srgbClr>
+            </w14:solidFill>
+          </w14:textFill>
+        </w:rPr>
+        <w:t>1.</w:t>
+      </w:r>
+    </w:p>
+    <w:p>
+      <w:pPr>
+        <w:pStyle w:val="0 - Текст рада"/>
+      </w:pPr>
+    </w:p>
+    <w:p>
+      <w:pPr>
+        <w:pStyle w:val="2 - Подпоглавље"/>
+        <w:numPr>
+          <w:ilvl w:val="1"/>
+          <w:numId w:val="2"/>
+        </w:numPr>
+      </w:pPr>
+      <w:r>
+        <w:rPr>
+          <w:rtl w:val="0"/>
+        </w:rPr>
+        <w:t xml:space="preserve"> </w:t>
+      </w:r>
+      <w:r>
+        <w:rPr>
+          <w:rtl w:val="0"/>
+        </w:rPr>
+        <w:t>Лабораторијски сценарији</w:t>
+      </w:r>
+    </w:p>
+    <w:p>
+      <w:pPr>
+        <w:pStyle w:val="Default"/>
+        <w:tabs>
+          <w:tab w:val="left" w:pos="593"/>
+          <w:tab w:val="left" w:pos="1186"/>
+          <w:tab w:val="left" w:pos="1779"/>
+          <w:tab w:val="left" w:pos="2372"/>
+          <w:tab w:val="left" w:pos="2965"/>
+          <w:tab w:val="left" w:pos="3558"/>
+          <w:tab w:val="left" w:pos="4151"/>
+          <w:tab w:val="left" w:pos="4744"/>
+          <w:tab w:val="left" w:pos="5337"/>
+          <w:tab w:val="left" w:pos="5930"/>
+          <w:tab w:val="left" w:pos="6523"/>
+          <w:tab w:val="left" w:pos="7116"/>
+          <w:tab w:val="left" w:pos="7709"/>
+          <w:tab w:val="left" w:pos="8302"/>
+          <w:tab w:val="left" w:pos="8895"/>
+          <w:tab w:val="left" w:pos="9488"/>
+        </w:tabs>
+        <w:suppressAutoHyphens w:val="1"/>
+        <w:spacing w:before="0" w:line="240" w:lineRule="auto"/>
+        <w:jc w:val="left"/>
+        <w:rPr>
+          <w:rFonts w:ascii="Times New Roman" w:cs="Times New Roman" w:hAnsi="Times New Roman" w:eastAsia="Times New Roman"/>
+          <w:outline w:val="0"/>
+          <w:color w:val="000000"/>
+          <w:sz w:val="20"/>
+          <w:szCs w:val="20"/>
+          <w:shd w:val="clear" w:color="auto" w:fill="fffeff"/>
+          <w14:textFill>
+            <w14:solidFill>
+              <w14:srgbClr w14:val="000000">
+                <w14:alpha w14:val="14999"/>
+              </w14:srgbClr>
+            </w14:solidFill>
+          </w14:textFill>
+        </w:rPr>
+      </w:pPr>
+      <w:r>
+        <w:rPr>
+          <w:rFonts w:ascii="Times New Roman" w:hAnsi="Times New Roman" w:hint="default"/>
+          <w:outline w:val="0"/>
+          <w:color w:val="000000"/>
+          <w:sz w:val="20"/>
+          <w:szCs w:val="20"/>
+          <w:shd w:val="clear" w:color="auto" w:fill="fffeff"/>
+          <w:rtl w:val="0"/>
+          <w:lang w:val="ru-RU"/>
+          <w14:textFill>
+            <w14:solidFill>
+              <w14:srgbClr w14:val="000000">
+                <w14:alpha w14:val="14999"/>
+              </w14:srgbClr>
+            </w14:solidFill>
+          </w14:textFill>
+        </w:rPr>
+        <w:t xml:space="preserve">Три лабораторијска сценарија покривају по једну категорију рањивости из Секције </w:t>
+      </w:r>
+      <w:r>
+        <w:rPr>
+          <w:rFonts w:ascii="Times New Roman" w:hAnsi="Times New Roman"/>
+          <w:outline w:val="0"/>
+          <w:color w:val="000000"/>
+          <w:sz w:val="20"/>
+          <w:szCs w:val="20"/>
+          <w:shd w:val="clear" w:color="auto" w:fill="fffeff"/>
+          <w:rtl w:val="0"/>
+          <w:lang w:val="pt-PT"/>
+          <w14:textFill>
+            <w14:solidFill>
+              <w14:srgbClr w14:val="000000">
+                <w14:alpha w14:val="14999"/>
+              </w14:srgbClr>
+            </w14:solidFill>
+          </w14:textFill>
+        </w:rPr>
+        <w:t xml:space="preserve">2.1, </w:t>
+      </w:r>
+      <w:r>
+        <w:rPr>
+          <w:rFonts w:ascii="Times New Roman" w:hAnsi="Times New Roman" w:hint="default"/>
+          <w:outline w:val="0"/>
+          <w:color w:val="000000"/>
+          <w:sz w:val="20"/>
+          <w:szCs w:val="20"/>
+          <w:shd w:val="clear" w:color="auto" w:fill="fffeff"/>
+          <w:rtl w:val="0"/>
+          <w14:textFill>
+            <w14:solidFill>
+              <w14:srgbClr w14:val="000000">
+                <w14:alpha w14:val="14999"/>
+              </w14:srgbClr>
+            </w14:solidFill>
+          </w14:textFill>
+        </w:rPr>
+        <w:t>поређана по растућој сложености</w:t>
+      </w:r>
+      <w:r>
+        <w:rPr>
+          <w:rFonts w:ascii="Times New Roman" w:hAnsi="Times New Roman"/>
+          <w:outline w:val="0"/>
+          <w:color w:val="000000"/>
+          <w:sz w:val="20"/>
+          <w:szCs w:val="20"/>
+          <w:shd w:val="clear" w:color="auto" w:fill="fffeff"/>
+          <w:rtl w:val="0"/>
+          <w:lang w:val="en-US"/>
+          <w14:textFill>
+            <w14:solidFill>
+              <w14:srgbClr w14:val="000000">
+                <w14:alpha w14:val="14999"/>
+              </w14:srgbClr>
+            </w14:solidFill>
+          </w14:textFill>
+        </w:rPr>
+        <w:t>:</w:t>
+      </w:r>
+    </w:p>
+    <w:p>
+      <w:pPr>
+        <w:pStyle w:val="Default"/>
+        <w:tabs>
+          <w:tab w:val="left" w:pos="593"/>
+          <w:tab w:val="left" w:pos="1186"/>
+          <w:tab w:val="left" w:pos="1779"/>
+          <w:tab w:val="left" w:pos="2372"/>
+          <w:tab w:val="left" w:pos="2965"/>
+          <w:tab w:val="left" w:pos="3558"/>
+          <w:tab w:val="left" w:pos="4151"/>
+          <w:tab w:val="left" w:pos="4744"/>
+          <w:tab w:val="left" w:pos="5337"/>
+          <w:tab w:val="left" w:pos="5930"/>
+          <w:tab w:val="left" w:pos="6523"/>
+          <w:tab w:val="left" w:pos="7116"/>
+          <w:tab w:val="left" w:pos="7709"/>
+          <w:tab w:val="left" w:pos="8302"/>
+          <w:tab w:val="left" w:pos="8895"/>
+          <w:tab w:val="left" w:pos="9488"/>
+        </w:tabs>
+        <w:suppressAutoHyphens w:val="1"/>
+        <w:spacing w:before="0" w:line="240" w:lineRule="auto"/>
+        <w:jc w:val="left"/>
+        <w:rPr>
+          <w:rFonts w:ascii="Times New Roman" w:cs="Times New Roman" w:hAnsi="Times New Roman" w:eastAsia="Times New Roman"/>
+          <w:outline w:val="0"/>
+          <w:color w:val="000000"/>
+          <w:sz w:val="20"/>
+          <w:szCs w:val="20"/>
+          <w:shd w:val="clear" w:color="auto" w:fill="fffeff"/>
+          <w14:textFill>
+            <w14:solidFill>
+              <w14:srgbClr w14:val="000000">
+                <w14:alpha w14:val="14999"/>
+              </w14:srgbClr>
+            </w14:solidFill>
+          </w14:textFill>
+        </w:rPr>
+      </w:pPr>
+    </w:p>
+    <w:p>
+      <w:pPr>
+        <w:pStyle w:val="Default"/>
+        <w:numPr>
+          <w:ilvl w:val="0"/>
+          <w:numId w:val="5"/>
+        </w:numPr>
+        <w:suppressAutoHyphens w:val="1"/>
+        <w:spacing w:before="0" w:line="240" w:lineRule="auto"/>
+        <w:jc w:val="left"/>
+        <w:rPr>
+          <w:rFonts w:ascii="Times New Roman" w:hAnsi="Times New Roman"/>
+          <w:outline w:val="0"/>
+          <w:color w:val="000000"/>
+          <w:sz w:val="20"/>
+          <w:szCs w:val="20"/>
+          <w:shd w:val="clear" w:color="auto" w:fill="fffeff"/>
+          <w14:textFill>
+            <w14:solidFill>
+              <w14:srgbClr w14:val="000000">
+                <w14:alpha w14:val="14999"/>
+              </w14:srgbClr>
+            </w14:solidFill>
+          </w14:textFill>
+        </w:rPr>
+      </w:pPr>
+      <w:r>
+        <w:rPr>
+          <w:rFonts w:ascii="Times New Roman" w:hAnsi="Times New Roman"/>
+          <w:i w:val="1"/>
+          <w:iCs w:val="1"/>
+          <w:outline w:val="0"/>
+          <w:color w:val="000000"/>
+          <w:sz w:val="20"/>
+          <w:szCs w:val="20"/>
+          <w:shd w:val="clear" w:color="auto" w:fill="fffeff"/>
+          <w:rtl w:val="0"/>
+          <w14:textFill>
+            <w14:solidFill>
+              <w14:srgbClr w14:val="000000">
+                <w14:alpha w14:val="14999"/>
+              </w14:srgbClr>
+            </w14:solidFill>
+          </w14:textFill>
+        </w:rPr>
+        <w:t>Lab-a</w:t>
+      </w:r>
+      <w:r>
+        <w:rPr>
+          <w:rFonts w:ascii="Times New Roman" w:hAnsi="Times New Roman"/>
+          <w:outline w:val="0"/>
+          <w:color w:val="000000"/>
+          <w:sz w:val="20"/>
+          <w:szCs w:val="20"/>
+          <w:shd w:val="clear" w:color="auto" w:fill="fffeff"/>
+          <w:rtl w:val="0"/>
+          <w14:textFill>
+            <w14:solidFill>
+              <w14:srgbClr w14:val="000000">
+                <w14:alpha w14:val="14999"/>
+              </w14:srgbClr>
+            </w14:solidFill>
+          </w14:textFill>
+        </w:rPr>
+        <w:t xml:space="preserve"> (</w:t>
+      </w:r>
+      <w:r>
+        <w:rPr>
+          <w:rFonts w:ascii="Times New Roman" w:hAnsi="Times New Roman" w:hint="default"/>
+          <w:outline w:val="0"/>
+          <w:color w:val="000000"/>
+          <w:sz w:val="20"/>
+          <w:szCs w:val="20"/>
+          <w:shd w:val="clear" w:color="auto" w:fill="fffeff"/>
+          <w:rtl w:val="0"/>
+          <w14:textFill>
+            <w14:solidFill>
+              <w14:srgbClr w14:val="000000">
+                <w14:alpha w14:val="14999"/>
+              </w14:srgbClr>
+            </w14:solidFill>
+          </w14:textFill>
+        </w:rPr>
+        <w:t>погрешна конфигурација</w:t>
+      </w:r>
+      <w:r>
+        <w:rPr>
+          <w:rFonts w:ascii="Times New Roman" w:hAnsi="Times New Roman"/>
+          <w:outline w:val="0"/>
+          <w:color w:val="000000"/>
+          <w:sz w:val="20"/>
+          <w:szCs w:val="20"/>
+          <w:shd w:val="clear" w:color="auto" w:fill="fffeff"/>
+          <w:rtl w:val="0"/>
+          <w14:textFill>
+            <w14:solidFill>
+              <w14:srgbClr w14:val="000000">
+                <w14:alpha w14:val="14999"/>
+              </w14:srgbClr>
+            </w14:solidFill>
+          </w14:textFill>
+        </w:rPr>
+        <w:t xml:space="preserve">): </w:t>
+      </w:r>
+      <w:r>
+        <w:rPr>
+          <w:rFonts w:ascii="Times New Roman" w:hAnsi="Times New Roman" w:hint="default"/>
+          <w:outline w:val="0"/>
+          <w:color w:val="000000"/>
+          <w:sz w:val="20"/>
+          <w:szCs w:val="20"/>
+          <w:shd w:val="clear" w:color="auto" w:fill="fffeff"/>
+          <w:rtl w:val="0"/>
+          <w14:textFill>
+            <w14:solidFill>
+              <w14:srgbClr w14:val="000000">
+                <w14:alpha w14:val="14999"/>
+              </w14:srgbClr>
+            </w14:solidFill>
+          </w14:textFill>
+        </w:rPr>
+        <w:t xml:space="preserve">контејнер нападача покреће се са </w:t>
+      </w:r>
+      <w:r>
+        <w:rPr>
+          <w:rFonts w:ascii="Times New Roman" w:hAnsi="Times New Roman"/>
+          <w:outline w:val="0"/>
+          <w:color w:val="937000"/>
+          <w:sz w:val="20"/>
+          <w:szCs w:val="20"/>
+          <w:shd w:val="clear" w:color="auto" w:fill="fffeff"/>
+          <w:rtl w:val="0"/>
+          <w:lang w:val="ru-RU"/>
+          <w14:textFill>
+            <w14:solidFill>
+              <w14:srgbClr w14:val="947100"/>
+            </w14:solidFill>
+          </w14:textFill>
+        </w:rPr>
+        <w:t>`</w:t>
+      </w:r>
+      <w:r>
+        <w:rPr>
+          <w:rFonts w:ascii="Times New Roman" w:hAnsi="Times New Roman"/>
+          <w:outline w:val="0"/>
+          <w:color w:val="000000"/>
+          <w:sz w:val="20"/>
+          <w:szCs w:val="20"/>
+          <w:shd w:val="clear" w:color="auto" w:fill="fffeff"/>
+          <w:rtl w:val="0"/>
+          <w:lang w:val="en-US"/>
+          <w14:textFill>
+            <w14:solidFill>
+              <w14:srgbClr w14:val="000000">
+                <w14:alpha w14:val="30000"/>
+              </w14:srgbClr>
+            </w14:solidFill>
+          </w14:textFill>
+        </w:rPr>
+        <w:t>--privileged</w:t>
+      </w:r>
+      <w:r>
+        <w:rPr>
+          <w:rFonts w:ascii="Times New Roman" w:hAnsi="Times New Roman"/>
+          <w:outline w:val="0"/>
+          <w:color w:val="937000"/>
+          <w:sz w:val="20"/>
+          <w:szCs w:val="20"/>
+          <w:shd w:val="clear" w:color="auto" w:fill="fffeff"/>
+          <w:rtl w:val="0"/>
+          <w:lang w:val="ru-RU"/>
+          <w14:textFill>
+            <w14:solidFill>
+              <w14:srgbClr w14:val="947100"/>
+            </w14:solidFill>
+          </w14:textFill>
+        </w:rPr>
+        <w:t>`</w:t>
+      </w:r>
+      <w:r>
+        <w:rPr>
+          <w:rFonts w:ascii="Times New Roman" w:hAnsi="Times New Roman"/>
+          <w:outline w:val="0"/>
+          <w:color w:val="000000"/>
+          <w:sz w:val="20"/>
+          <w:szCs w:val="20"/>
+          <w:shd w:val="clear" w:color="auto" w:fill="fffeff"/>
+          <w:rtl w:val="0"/>
+          <w14:textFill>
+            <w14:solidFill>
+              <w14:srgbClr w14:val="000000">
+                <w14:alpha w14:val="14999"/>
+              </w14:srgbClr>
+            </w14:solidFill>
+          </w14:textFill>
+        </w:rPr>
+        <w:t xml:space="preserve">. </w:t>
+      </w:r>
+      <w:r>
+        <w:rPr>
+          <w:rFonts w:ascii="Times New Roman" w:hAnsi="Times New Roman" w:hint="default"/>
+          <w:outline w:val="0"/>
+          <w:color w:val="000000"/>
+          <w:sz w:val="20"/>
+          <w:szCs w:val="20"/>
+          <w:shd w:val="clear" w:color="auto" w:fill="fffeff"/>
+          <w:rtl w:val="0"/>
+          <w14:textFill>
+            <w14:solidFill>
+              <w14:srgbClr w14:val="000000">
+                <w14:alpha w14:val="14999"/>
+              </w14:srgbClr>
+            </w14:solidFill>
+          </w14:textFill>
+        </w:rPr>
+        <w:t xml:space="preserve">Агент мора да препозна пермисивну конфигурацију и искористи </w:t>
+      </w:r>
+      <w:r>
+        <w:rPr>
+          <w:rFonts w:ascii="Times New Roman" w:hAnsi="Times New Roman" w:hint="default"/>
+          <w:outline w:val="0"/>
+          <w:color w:val="000000"/>
+          <w:sz w:val="20"/>
+          <w:szCs w:val="20"/>
+          <w:shd w:val="clear" w:color="auto" w:fill="fffeff"/>
+          <w:rtl w:val="0"/>
+          <w14:textFill>
+            <w14:solidFill>
+              <w14:srgbClr w14:val="000000">
+                <w14:alpha w14:val="14999"/>
+              </w14:srgbClr>
+            </w14:solidFill>
+          </w14:textFill>
+        </w:rPr>
+        <w:t>ову рањивост</w:t>
+      </w:r>
+      <w:r>
+        <w:rPr>
+          <w:rFonts w:ascii="Times New Roman" w:hAnsi="Times New Roman"/>
+          <w:outline w:val="0"/>
+          <w:color w:val="000000"/>
+          <w:sz w:val="20"/>
+          <w:szCs w:val="20"/>
+          <w:shd w:val="clear" w:color="auto" w:fill="fffeff"/>
+          <w:rtl w:val="0"/>
+          <w14:textFill>
+            <w14:solidFill>
+              <w14:srgbClr w14:val="000000">
+                <w14:alpha w14:val="14999"/>
+              </w14:srgbClr>
+            </w14:solidFill>
+          </w14:textFill>
+        </w:rPr>
+        <w:t>.</w:t>
+      </w:r>
+    </w:p>
+    <w:p>
+      <w:pPr>
+        <w:pStyle w:val="Default"/>
+        <w:numPr>
+          <w:ilvl w:val="0"/>
+          <w:numId w:val="5"/>
+        </w:numPr>
+        <w:suppressAutoHyphens w:val="1"/>
+        <w:spacing w:before="0" w:line="240" w:lineRule="auto"/>
+        <w:jc w:val="left"/>
+        <w:rPr>
+          <w:rFonts w:ascii="Times New Roman" w:hAnsi="Times New Roman"/>
+          <w:outline w:val="0"/>
+          <w:color w:val="000000"/>
+          <w:sz w:val="20"/>
+          <w:szCs w:val="20"/>
+          <w:shd w:val="clear" w:color="auto" w:fill="fffeff"/>
+          <w14:textFill>
+            <w14:solidFill>
+              <w14:srgbClr w14:val="000000">
+                <w14:alpha w14:val="14999"/>
+              </w14:srgbClr>
+            </w14:solidFill>
+          </w14:textFill>
+        </w:rPr>
+      </w:pPr>
+      <w:r>
+        <w:rPr>
+          <w:rFonts w:ascii="Times New Roman" w:hAnsi="Times New Roman"/>
+          <w:i w:val="1"/>
+          <w:iCs w:val="1"/>
+          <w:outline w:val="0"/>
+          <w:color w:val="000000"/>
+          <w:sz w:val="20"/>
+          <w:szCs w:val="20"/>
+          <w:shd w:val="clear" w:color="auto" w:fill="fffeff"/>
+          <w:rtl w:val="0"/>
+          <w14:textFill>
+            <w14:solidFill>
+              <w14:srgbClr w14:val="000000">
+                <w14:alpha w14:val="14999"/>
+              </w14:srgbClr>
+            </w14:solidFill>
+          </w14:textFill>
+        </w:rPr>
+        <w:t>Lab-b</w:t>
+      </w:r>
+      <w:r>
+        <w:rPr>
+          <w:rFonts w:ascii="Times New Roman" w:hAnsi="Times New Roman"/>
+          <w:outline w:val="0"/>
+          <w:color w:val="000000"/>
+          <w:sz w:val="20"/>
+          <w:szCs w:val="20"/>
+          <w:shd w:val="clear" w:color="auto" w:fill="fffeff"/>
+          <w:rtl w:val="0"/>
+          <w:lang w:val="en-US"/>
+          <w14:textFill>
+            <w14:solidFill>
+              <w14:srgbClr w14:val="000000">
+                <w14:alpha w14:val="14999"/>
+              </w14:srgbClr>
+            </w14:solidFill>
+          </w14:textFill>
+        </w:rPr>
+        <w:t xml:space="preserve"> (CVE-2024-21626): </w:t>
+      </w:r>
+      <w:r>
+        <w:rPr>
+          <w:rFonts w:ascii="Times New Roman" w:hAnsi="Times New Roman" w:hint="default"/>
+          <w:outline w:val="0"/>
+          <w:color w:val="000000"/>
+          <w:sz w:val="20"/>
+          <w:szCs w:val="20"/>
+          <w:shd w:val="clear" w:color="auto" w:fill="fffeff"/>
+          <w:rtl w:val="0"/>
+          <w14:textFill>
+            <w14:solidFill>
+              <w14:srgbClr w14:val="000000">
+                <w14:alpha w14:val="14999"/>
+              </w14:srgbClr>
+            </w14:solidFill>
+          </w14:textFill>
+        </w:rPr>
+        <w:t xml:space="preserve">инсталиране су рањиве верзије </w:t>
+      </w:r>
+      <w:r>
+        <w:rPr>
+          <w:rFonts w:ascii="Times New Roman" w:hAnsi="Times New Roman"/>
+          <w:outline w:val="0"/>
+          <w:color w:val="000000"/>
+          <w:sz w:val="20"/>
+          <w:szCs w:val="20"/>
+          <w:shd w:val="clear" w:color="auto" w:fill="fffeff"/>
+          <w:rtl w:val="0"/>
+          <w14:textFill>
+            <w14:solidFill>
+              <w14:srgbClr w14:val="000000">
+                <w14:alpha w14:val="14999"/>
+              </w14:srgbClr>
+            </w14:solidFill>
+          </w14:textFill>
+        </w:rPr>
+        <w:t xml:space="preserve">runc 1.1.11 </w:t>
+      </w:r>
+      <w:r>
+        <w:rPr>
+          <w:rFonts w:ascii="Times New Roman" w:hAnsi="Times New Roman" w:hint="default"/>
+          <w:outline w:val="0"/>
+          <w:color w:val="000000"/>
+          <w:sz w:val="20"/>
+          <w:szCs w:val="20"/>
+          <w:shd w:val="clear" w:color="auto" w:fill="fffeff"/>
+          <w:rtl w:val="0"/>
+          <w14:textFill>
+            <w14:solidFill>
+              <w14:srgbClr w14:val="000000">
+                <w14:alpha w14:val="14999"/>
+              </w14:srgbClr>
+            </w14:solidFill>
+          </w14:textFill>
+        </w:rPr>
+        <w:t xml:space="preserve">и </w:t>
+      </w:r>
+      <w:r>
+        <w:rPr>
+          <w:rFonts w:ascii="Times New Roman" w:hAnsi="Times New Roman"/>
+          <w:outline w:val="0"/>
+          <w:color w:val="000000"/>
+          <w:sz w:val="20"/>
+          <w:szCs w:val="20"/>
+          <w:shd w:val="clear" w:color="auto" w:fill="fffeff"/>
+          <w:rtl w:val="0"/>
+          <w:lang w:val="en-US"/>
+          <w14:textFill>
+            <w14:solidFill>
+              <w14:srgbClr w14:val="000000">
+                <w14:alpha w14:val="14999"/>
+              </w14:srgbClr>
+            </w14:solidFill>
+          </w14:textFill>
+        </w:rPr>
+        <w:t xml:space="preserve">containerd 1.7.12. </w:t>
+      </w:r>
+      <w:r>
+        <w:rPr>
+          <w:rFonts w:ascii="Times New Roman" w:hAnsi="Times New Roman" w:hint="default"/>
+          <w:outline w:val="0"/>
+          <w:color w:val="000000"/>
+          <w:sz w:val="20"/>
+          <w:szCs w:val="20"/>
+          <w:shd w:val="clear" w:color="auto" w:fill="fffeff"/>
+          <w:rtl w:val="0"/>
+          <w14:textFill>
+            <w14:solidFill>
+              <w14:srgbClr w14:val="000000">
+                <w14:alpha w14:val="14999"/>
+              </w14:srgbClr>
+            </w14:solidFill>
+          </w14:textFill>
+        </w:rPr>
+        <w:t>Агент мора да детектује аномалан радни директоријум и прати процурели дескриптор датотеке до система датотека домаћина</w:t>
+      </w:r>
+      <w:r>
+        <w:rPr>
+          <w:rFonts w:ascii="Times New Roman" w:hAnsi="Times New Roman"/>
+          <w:outline w:val="0"/>
+          <w:color w:val="000000"/>
+          <w:sz w:val="20"/>
+          <w:szCs w:val="20"/>
+          <w:shd w:val="clear" w:color="auto" w:fill="fffeff"/>
+          <w:rtl w:val="0"/>
+          <w14:textFill>
+            <w14:solidFill>
+              <w14:srgbClr w14:val="000000">
+                <w14:alpha w14:val="14999"/>
+              </w14:srgbClr>
+            </w14:solidFill>
+          </w14:textFill>
+        </w:rPr>
+        <w:t>.</w:t>
+      </w:r>
+    </w:p>
+    <w:p>
+      <w:pPr>
+        <w:pStyle w:val="Default"/>
+        <w:numPr>
+          <w:ilvl w:val="0"/>
+          <w:numId w:val="5"/>
+        </w:numPr>
+        <w:suppressAutoHyphens w:val="1"/>
+        <w:spacing w:before="0" w:line="240" w:lineRule="auto"/>
+        <w:jc w:val="left"/>
+        <w:rPr>
+          <w:rFonts w:ascii="Times New Roman" w:hAnsi="Times New Roman"/>
+          <w:outline w:val="0"/>
+          <w:color w:val="000000"/>
+          <w:sz w:val="20"/>
+          <w:szCs w:val="20"/>
+          <w:shd w:val="clear" w:color="auto" w:fill="fffeff"/>
+          <w14:textFill>
+            <w14:solidFill>
+              <w14:srgbClr w14:val="000000">
+                <w14:alpha w14:val="14999"/>
+              </w14:srgbClr>
+            </w14:solidFill>
+          </w14:textFill>
+        </w:rPr>
+      </w:pPr>
+      <w:r>
+        <w:rPr>
+          <w:rFonts w:ascii="Times New Roman" w:hAnsi="Times New Roman"/>
+          <w:i w:val="1"/>
+          <w:iCs w:val="1"/>
+          <w:outline w:val="0"/>
+          <w:color w:val="000000"/>
+          <w:sz w:val="20"/>
+          <w:szCs w:val="20"/>
+          <w:shd w:val="clear" w:color="auto" w:fill="fffeff"/>
+          <w:rtl w:val="0"/>
+          <w14:textFill>
+            <w14:solidFill>
+              <w14:srgbClr w14:val="000000">
+                <w14:alpha w14:val="14999"/>
+              </w14:srgbClr>
+            </w14:solidFill>
+          </w14:textFill>
+        </w:rPr>
+        <w:t>Lab-c</w:t>
+      </w:r>
+      <w:r>
+        <w:rPr>
+          <w:rFonts w:ascii="Times New Roman" w:hAnsi="Times New Roman"/>
+          <w:i w:val="1"/>
+          <w:iCs w:val="1"/>
+          <w:outline w:val="0"/>
+          <w:color w:val="937000"/>
+          <w:sz w:val="20"/>
+          <w:szCs w:val="20"/>
+          <w:shd w:val="clear" w:color="auto" w:fill="fffeff"/>
+          <w:rtl w:val="0"/>
+          <w:lang w:val="en-US"/>
+          <w14:textFill>
+            <w14:solidFill>
+              <w14:srgbClr w14:val="947100"/>
+            </w14:solidFill>
+          </w14:textFill>
+        </w:rPr>
+        <w:t xml:space="preserve"> </w:t>
+      </w:r>
+      <w:r>
+        <w:rPr>
+          <w:rFonts w:ascii="Times New Roman" w:hAnsi="Times New Roman"/>
+          <w:outline w:val="0"/>
+          <w:color w:val="000000"/>
+          <w:sz w:val="20"/>
+          <w:szCs w:val="20"/>
+          <w:shd w:val="clear" w:color="auto" w:fill="fffeff"/>
+          <w:rtl w:val="0"/>
+          <w14:textFill>
+            <w14:solidFill>
+              <w14:srgbClr w14:val="000000">
+                <w14:alpha w14:val="14999"/>
+              </w14:srgbClr>
+            </w14:solidFill>
+          </w14:textFill>
+        </w:rPr>
+        <w:t xml:space="preserve">(CVE-2022-0847): </w:t>
+      </w:r>
+      <w:r>
+        <w:rPr>
+          <w:rFonts w:ascii="Times New Roman" w:hAnsi="Times New Roman" w:hint="default"/>
+          <w:outline w:val="0"/>
+          <w:color w:val="000000"/>
+          <w:sz w:val="20"/>
+          <w:szCs w:val="20"/>
+          <w:shd w:val="clear" w:color="auto" w:fill="fffeff"/>
+          <w:rtl w:val="0"/>
+          <w14:textFill>
+            <w14:solidFill>
+              <w14:srgbClr w14:val="000000">
+                <w14:alpha w14:val="14999"/>
+              </w14:srgbClr>
+            </w14:solidFill>
+          </w14:textFill>
+        </w:rPr>
+        <w:t xml:space="preserve">изграђено је рањиво </w:t>
+      </w:r>
+      <w:r>
+        <w:rPr>
+          <w:rFonts w:ascii="Times New Roman" w:hAnsi="Times New Roman"/>
+          <w:outline w:val="0"/>
+          <w:color w:val="000000"/>
+          <w:sz w:val="20"/>
+          <w:szCs w:val="20"/>
+          <w:shd w:val="clear" w:color="auto" w:fill="fffeff"/>
+          <w:rtl w:val="0"/>
+          <w:lang w:val="fr-FR"/>
+          <w14:textFill>
+            <w14:solidFill>
+              <w14:srgbClr w14:val="000000">
+                <w14:alpha w14:val="14999"/>
+              </w14:srgbClr>
+            </w14:solidFill>
+          </w14:textFill>
+        </w:rPr>
+        <w:t xml:space="preserve">Linux 5.15.24 </w:t>
+      </w:r>
+      <w:r>
+        <w:rPr>
+          <w:rFonts w:ascii="Times New Roman" w:hAnsi="Times New Roman" w:hint="default"/>
+          <w:outline w:val="0"/>
+          <w:color w:val="000000"/>
+          <w:sz w:val="20"/>
+          <w:szCs w:val="20"/>
+          <w:shd w:val="clear" w:color="auto" w:fill="fffeff"/>
+          <w:rtl w:val="0"/>
+          <w14:textFill>
+            <w14:solidFill>
+              <w14:srgbClr w14:val="000000">
+                <w14:alpha w14:val="14999"/>
+              </w14:srgbClr>
+            </w14:solidFill>
+          </w14:textFill>
+        </w:rPr>
+        <w:t>језгро из изворног кода</w:t>
+      </w:r>
+      <w:r>
+        <w:rPr>
+          <w:rFonts w:ascii="Times New Roman" w:hAnsi="Times New Roman"/>
+          <w:outline w:val="0"/>
+          <w:color w:val="000000"/>
+          <w:sz w:val="20"/>
+          <w:szCs w:val="20"/>
+          <w:shd w:val="clear" w:color="auto" w:fill="fffeff"/>
+          <w:rtl w:val="0"/>
+          <w14:textFill>
+            <w14:solidFill>
+              <w14:srgbClr w14:val="000000">
+                <w14:alpha w14:val="14999"/>
+              </w14:srgbClr>
+            </w14:solidFill>
+          </w14:textFill>
+        </w:rPr>
+        <w:t xml:space="preserve">. </w:t>
+      </w:r>
+      <w:r>
+        <w:rPr>
+          <w:rFonts w:ascii="Times New Roman" w:hAnsi="Times New Roman" w:hint="default"/>
+          <w:outline w:val="0"/>
+          <w:color w:val="000000"/>
+          <w:sz w:val="20"/>
+          <w:szCs w:val="20"/>
+          <w:shd w:val="clear" w:color="auto" w:fill="fffeff"/>
+          <w:rtl w:val="0"/>
+          <w14:textFill>
+            <w14:solidFill>
+              <w14:srgbClr w14:val="000000">
+                <w14:alpha w14:val="14999"/>
+              </w14:srgbClr>
+            </w14:solidFill>
+          </w14:textFill>
+        </w:rPr>
+        <w:t>Агент мора да идентификује рањиву верзију</w:t>
+      </w:r>
+      <w:r>
+        <w:rPr>
+          <w:rFonts w:ascii="Times New Roman" w:hAnsi="Times New Roman"/>
+          <w:outline w:val="0"/>
+          <w:color w:val="000000"/>
+          <w:sz w:val="20"/>
+          <w:szCs w:val="20"/>
+          <w:shd w:val="clear" w:color="auto" w:fill="fffeff"/>
+          <w:rtl w:val="0"/>
+          <w14:textFill>
+            <w14:solidFill>
+              <w14:srgbClr w14:val="000000">
+                <w14:alpha w14:val="14999"/>
+              </w14:srgbClr>
+            </w14:solidFill>
+          </w14:textFill>
+        </w:rPr>
+        <w:t xml:space="preserve">, </w:t>
+      </w:r>
+      <w:r>
+        <w:rPr>
+          <w:rFonts w:ascii="Times New Roman" w:hAnsi="Times New Roman" w:hint="default"/>
+          <w:outline w:val="0"/>
+          <w:color w:val="000000"/>
+          <w:sz w:val="20"/>
+          <w:szCs w:val="20"/>
+          <w:shd w:val="clear" w:color="auto" w:fill="fffeff"/>
+          <w:rtl w:val="0"/>
+          <w14:textFill>
+            <w14:solidFill>
+              <w14:srgbClr w14:val="000000">
+                <w14:alpha w14:val="14999"/>
+              </w14:srgbClr>
+            </w14:solidFill>
+          </w14:textFill>
+        </w:rPr>
+        <w:t xml:space="preserve">примени </w:t>
+      </w:r>
+      <w:r>
+        <w:rPr>
+          <w:rFonts w:ascii="Times New Roman" w:hAnsi="Times New Roman"/>
+          <w:outline w:val="0"/>
+          <w:color w:val="000000"/>
+          <w:sz w:val="20"/>
+          <w:szCs w:val="20"/>
+          <w:shd w:val="clear" w:color="auto" w:fill="fffeff"/>
+          <w:rtl w:val="0"/>
+          <w:lang w:val="en-US"/>
+          <w14:textFill>
+            <w14:solidFill>
+              <w14:srgbClr w14:val="000000">
+                <w14:alpha w14:val="14999"/>
+              </w14:srgbClr>
+            </w14:solidFill>
+          </w14:textFill>
+        </w:rPr>
+        <w:t xml:space="preserve">DirtyPipe </w:t>
+      </w:r>
+      <w:r>
+        <w:rPr>
+          <w:rFonts w:ascii="Times New Roman" w:hAnsi="Times New Roman" w:hint="default"/>
+          <w:outline w:val="0"/>
+          <w:color w:val="000000"/>
+          <w:sz w:val="20"/>
+          <w:szCs w:val="20"/>
+          <w:shd w:val="clear" w:color="auto" w:fill="fffeff"/>
+          <w:rtl w:val="0"/>
+          <w14:textFill>
+            <w14:solidFill>
+              <w14:srgbClr w14:val="000000">
+                <w14:alpha w14:val="14999"/>
+              </w14:srgbClr>
+            </w14:solidFill>
+          </w14:textFill>
+        </w:rPr>
+        <w:t xml:space="preserve">за преписивање </w:t>
+      </w:r>
+      <w:r>
+        <w:rPr>
+          <w:rFonts w:ascii="Times New Roman" w:hAnsi="Times New Roman"/>
+          <w:outline w:val="0"/>
+          <w:color w:val="000000"/>
+          <w:sz w:val="20"/>
+          <w:szCs w:val="20"/>
+          <w:shd w:val="clear" w:color="auto" w:fill="fffeff"/>
+          <w:rtl w:val="0"/>
+          <w14:textFill>
+            <w14:solidFill>
+              <w14:srgbClr w14:val="000000">
+                <w14:alpha w14:val="14999"/>
+              </w14:srgbClr>
+            </w14:solidFill>
+          </w14:textFill>
+        </w:rPr>
+        <w:t>runc-</w:t>
+      </w:r>
+      <w:r>
+        <w:rPr>
+          <w:rFonts w:ascii="Times New Roman" w:hAnsi="Times New Roman" w:hint="default"/>
+          <w:outline w:val="0"/>
+          <w:color w:val="000000"/>
+          <w:sz w:val="20"/>
+          <w:szCs w:val="20"/>
+          <w:shd w:val="clear" w:color="auto" w:fill="fffeff"/>
+          <w:rtl w:val="0"/>
+          <w:lang w:val="ru-RU"/>
+          <w14:textFill>
+            <w14:solidFill>
+              <w14:srgbClr w14:val="000000">
+                <w14:alpha w14:val="14999"/>
+              </w14:srgbClr>
+            </w14:solidFill>
+          </w14:textFill>
+        </w:rPr>
+        <w:t>а у кешу страница и изазове извршавање на домаћину покретањем новог контејнера</w:t>
+      </w:r>
+      <w:r>
+        <w:rPr>
+          <w:rFonts w:ascii="Times New Roman" w:hAnsi="Times New Roman"/>
+          <w:outline w:val="0"/>
+          <w:color w:val="000000"/>
+          <w:sz w:val="20"/>
+          <w:szCs w:val="20"/>
+          <w:shd w:val="clear" w:color="auto" w:fill="fffeff"/>
+          <w:rtl w:val="0"/>
+          <w14:textFill>
+            <w14:solidFill>
+              <w14:srgbClr w14:val="000000">
+                <w14:alpha w14:val="14999"/>
+              </w14:srgbClr>
+            </w14:solidFill>
+          </w14:textFill>
+        </w:rPr>
+        <w:t>.</w:t>
+      </w:r>
+    </w:p>
+    <w:p>
+      <w:pPr>
+        <w:pStyle w:val="0 - Текст рада"/>
+      </w:pPr>
+    </w:p>
+    <w:p>
+      <w:pPr>
+        <w:pStyle w:val="2 - Подпоглавље"/>
+        <w:numPr>
+          <w:ilvl w:val="1"/>
+          <w:numId w:val="2"/>
+        </w:numPr>
+      </w:pPr>
+      <w:r>
+        <w:rPr>
+          <w:rtl w:val="0"/>
+        </w:rPr>
+        <w:t xml:space="preserve"> </w:t>
+      </w:r>
+      <w:r>
+        <w:rPr>
+          <w:rtl w:val="0"/>
+        </w:rPr>
+        <w:t>Процесни ток агента и верификација</w:t>
+      </w:r>
+    </w:p>
+    <w:p>
+      <w:pPr>
+        <w:pStyle w:val="Default"/>
+        <w:tabs>
+          <w:tab w:val="left" w:pos="593"/>
+          <w:tab w:val="left" w:pos="1186"/>
+          <w:tab w:val="left" w:pos="1779"/>
+          <w:tab w:val="left" w:pos="2372"/>
+          <w:tab w:val="left" w:pos="2965"/>
+          <w:tab w:val="left" w:pos="3558"/>
+          <w:tab w:val="left" w:pos="4151"/>
+          <w:tab w:val="left" w:pos="4744"/>
+          <w:tab w:val="left" w:pos="5337"/>
+          <w:tab w:val="left" w:pos="5930"/>
+          <w:tab w:val="left" w:pos="6523"/>
+          <w:tab w:val="left" w:pos="7116"/>
+          <w:tab w:val="left" w:pos="7709"/>
+          <w:tab w:val="left" w:pos="8302"/>
+          <w:tab w:val="left" w:pos="8895"/>
+          <w:tab w:val="left" w:pos="9488"/>
+        </w:tabs>
+        <w:suppressAutoHyphens w:val="1"/>
+        <w:spacing w:before="0" w:line="240" w:lineRule="auto"/>
+        <w:jc w:val="left"/>
+        <w:rPr>
+          <w:rFonts w:ascii="Times New Roman" w:cs="Times New Roman" w:hAnsi="Times New Roman" w:eastAsia="Times New Roman"/>
+          <w:outline w:val="0"/>
+          <w:color w:val="000000"/>
+          <w:sz w:val="20"/>
+          <w:szCs w:val="20"/>
+          <w:shd w:val="clear" w:color="auto" w:fill="fffeff"/>
+          <w14:textFill>
+            <w14:solidFill>
+              <w14:srgbClr w14:val="000000">
+                <w14:alpha w14:val="14999"/>
+              </w14:srgbClr>
+            </w14:solidFill>
+          </w14:textFill>
+        </w:rPr>
+      </w:pPr>
+      <w:r>
+        <w:rPr>
+          <w:rFonts w:ascii="Times New Roman" w:hAnsi="Times New Roman" w:hint="default"/>
+          <w:outline w:val="0"/>
+          <w:color w:val="000000"/>
+          <w:sz w:val="20"/>
+          <w:szCs w:val="20"/>
+          <w:shd w:val="clear" w:color="auto" w:fill="fffeff"/>
+          <w:rtl w:val="0"/>
+          <w14:textFill>
+            <w14:solidFill>
+              <w14:srgbClr w14:val="000000">
+                <w14:alpha w14:val="14999"/>
+              </w14:srgbClr>
+            </w14:solidFill>
+          </w14:textFill>
+        </w:rPr>
+        <w:t>Свака епизода пролази кроз четири фазе</w:t>
+      </w:r>
+      <w:r>
+        <w:rPr>
+          <w:rFonts w:ascii="Times New Roman" w:hAnsi="Times New Roman"/>
+          <w:outline w:val="0"/>
+          <w:color w:val="000000"/>
+          <w:sz w:val="20"/>
+          <w:szCs w:val="20"/>
+          <w:shd w:val="clear" w:color="auto" w:fill="fffeff"/>
+          <w:rtl w:val="0"/>
+          <w14:textFill>
+            <w14:solidFill>
+              <w14:srgbClr w14:val="000000">
+                <w14:alpha w14:val="14999"/>
+              </w14:srgbClr>
+            </w14:solidFill>
+          </w14:textFill>
+        </w:rPr>
+        <w:t xml:space="preserve">: </w:t>
+      </w:r>
+      <w:r>
+        <w:rPr>
+          <w:rFonts w:ascii="Times New Roman" w:hAnsi="Times New Roman" w:hint="default"/>
+          <w:outline w:val="0"/>
+          <w:color w:val="000000"/>
+          <w:sz w:val="20"/>
+          <w:szCs w:val="20"/>
+          <w:shd w:val="clear" w:color="auto" w:fill="fffeff"/>
+          <w:rtl w:val="0"/>
+          <w14:textFill>
+            <w14:solidFill>
+              <w14:srgbClr w14:val="000000">
+                <w14:alpha w14:val="14999"/>
+              </w14:srgbClr>
+            </w14:solidFill>
+          </w14:textFill>
+        </w:rPr>
+        <w:t xml:space="preserve">извиђање </w:t>
+      </w:r>
+      <w:r>
+        <w:rPr>
+          <w:rFonts w:ascii="Times New Roman" w:hAnsi="Times New Roman"/>
+          <w:outline w:val="0"/>
+          <w:color w:val="000000"/>
+          <w:sz w:val="20"/>
+          <w:szCs w:val="20"/>
+          <w:shd w:val="clear" w:color="auto" w:fill="fffeff"/>
+          <w:rtl w:val="0"/>
+          <w14:textFill>
+            <w14:solidFill>
+              <w14:srgbClr w14:val="000000">
+                <w14:alpha w14:val="14999"/>
+              </w14:srgbClr>
+            </w14:solidFill>
+          </w14:textFill>
+        </w:rPr>
+        <w:t xml:space="preserve">(14 </w:t>
+      </w:r>
+      <w:r>
+        <w:rPr>
+          <w:rFonts w:ascii="Times New Roman" w:hAnsi="Times New Roman" w:hint="default"/>
+          <w:outline w:val="0"/>
+          <w:color w:val="000000"/>
+          <w:sz w:val="20"/>
+          <w:szCs w:val="20"/>
+          <w:shd w:val="clear" w:color="auto" w:fill="fffeff"/>
+          <w:rtl w:val="0"/>
+          <w14:textFill>
+            <w14:solidFill>
+              <w14:srgbClr w14:val="000000">
+                <w14:alpha w14:val="14999"/>
+              </w14:srgbClr>
+            </w14:solidFill>
+          </w14:textFill>
+        </w:rPr>
+        <w:t xml:space="preserve">детерминистичких шел провера без </w:t>
+      </w:r>
+      <w:r>
+        <w:rPr>
+          <w:rFonts w:ascii="Times New Roman" w:hAnsi="Times New Roman"/>
+          <w:outline w:val="0"/>
+          <w:color w:val="000000"/>
+          <w:sz w:val="20"/>
+          <w:szCs w:val="20"/>
+          <w:shd w:val="clear" w:color="auto" w:fill="fffeff"/>
+          <w:rtl w:val="0"/>
+          <w:lang w:val="da-DK"/>
+          <w14:textFill>
+            <w14:solidFill>
+              <w14:srgbClr w14:val="000000">
+                <w14:alpha w14:val="14999"/>
+              </w14:srgbClr>
+            </w14:solidFill>
+          </w14:textFill>
+        </w:rPr>
+        <w:t>LLM-</w:t>
+      </w:r>
+      <w:r>
+        <w:rPr>
+          <w:rFonts w:ascii="Times New Roman" w:hAnsi="Times New Roman" w:hint="default"/>
+          <w:outline w:val="0"/>
+          <w:color w:val="000000"/>
+          <w:sz w:val="20"/>
+          <w:szCs w:val="20"/>
+          <w:shd w:val="clear" w:color="auto" w:fill="fffeff"/>
+          <w:rtl w:val="0"/>
+          <w14:textFill>
+            <w14:solidFill>
+              <w14:srgbClr w14:val="000000">
+                <w14:alpha w14:val="14999"/>
+              </w14:srgbClr>
+            </w14:solidFill>
+          </w14:textFill>
+        </w:rPr>
+        <w:t>а</w:t>
+      </w:r>
+      <w:r>
+        <w:rPr>
+          <w:rFonts w:ascii="Times New Roman" w:hAnsi="Times New Roman"/>
+          <w:outline w:val="0"/>
+          <w:color w:val="000000"/>
+          <w:sz w:val="20"/>
+          <w:szCs w:val="20"/>
+          <w:shd w:val="clear" w:color="auto" w:fill="fffeff"/>
+          <w:rtl w:val="0"/>
+          <w14:textFill>
+            <w14:solidFill>
+              <w14:srgbClr w14:val="000000">
+                <w14:alpha w14:val="14999"/>
+              </w14:srgbClr>
+            </w14:solidFill>
+          </w14:textFill>
+        </w:rPr>
+        <w:t xml:space="preserve">), </w:t>
+      </w:r>
+      <w:r>
+        <w:rPr>
+          <w:rFonts w:ascii="Times New Roman" w:hAnsi="Times New Roman" w:hint="default"/>
+          <w:outline w:val="0"/>
+          <w:color w:val="000000"/>
+          <w:sz w:val="20"/>
+          <w:szCs w:val="20"/>
+          <w:shd w:val="clear" w:color="auto" w:fill="fffeff"/>
+          <w:rtl w:val="0"/>
+          <w14:textFill>
+            <w14:solidFill>
+              <w14:srgbClr w14:val="000000">
+                <w14:alpha w14:val="14999"/>
+              </w14:srgbClr>
+            </w14:solidFill>
+          </w14:textFill>
+        </w:rPr>
+        <w:t xml:space="preserve">евалуација </w:t>
+      </w:r>
+      <w:r>
+        <w:rPr>
+          <w:rFonts w:ascii="Times New Roman" w:hAnsi="Times New Roman"/>
+          <w:outline w:val="0"/>
+          <w:color w:val="000000"/>
+          <w:sz w:val="20"/>
+          <w:szCs w:val="20"/>
+          <w:shd w:val="clear" w:color="auto" w:fill="fffeff"/>
+          <w:rtl w:val="0"/>
+          <w:lang w:val="da-DK"/>
+          <w14:textFill>
+            <w14:solidFill>
+              <w14:srgbClr w14:val="000000">
+                <w14:alpha w14:val="14999"/>
+              </w14:srgbClr>
+            </w14:solidFill>
+          </w14:textFill>
+        </w:rPr>
+        <w:t xml:space="preserve">(LLM </w:t>
+      </w:r>
+      <w:r>
+        <w:rPr>
+          <w:rFonts w:ascii="Times New Roman" w:hAnsi="Times New Roman" w:hint="default"/>
+          <w:outline w:val="0"/>
+          <w:color w:val="000000"/>
+          <w:sz w:val="20"/>
+          <w:szCs w:val="20"/>
+          <w:shd w:val="clear" w:color="auto" w:fill="fffeff"/>
+          <w:rtl w:val="0"/>
+          <w14:textFill>
+            <w14:solidFill>
+              <w14:srgbClr w14:val="000000">
+                <w14:alpha w14:val="14999"/>
+              </w14:srgbClr>
+            </w14:solidFill>
+          </w14:textFill>
+        </w:rPr>
+        <w:t>анализира резултате извиђања и производи структуриран план напада</w:t>
+      </w:r>
+      <w:r>
+        <w:rPr>
+          <w:rFonts w:ascii="Times New Roman" w:hAnsi="Times New Roman"/>
+          <w:outline w:val="0"/>
+          <w:color w:val="000000"/>
+          <w:sz w:val="20"/>
+          <w:szCs w:val="20"/>
+          <w:shd w:val="clear" w:color="auto" w:fill="fffeff"/>
+          <w:rtl w:val="0"/>
+          <w14:textFill>
+            <w14:solidFill>
+              <w14:srgbClr w14:val="000000">
+                <w14:alpha w14:val="14999"/>
+              </w14:srgbClr>
+            </w14:solidFill>
+          </w14:textFill>
+        </w:rPr>
+        <w:t xml:space="preserve">), </w:t>
+      </w:r>
+      <w:r>
+        <w:rPr>
+          <w:rFonts w:ascii="Times New Roman" w:hAnsi="Times New Roman" w:hint="default"/>
+          <w:outline w:val="0"/>
+          <w:color w:val="000000"/>
+          <w:sz w:val="20"/>
+          <w:szCs w:val="20"/>
+          <w:shd w:val="clear" w:color="auto" w:fill="fffeff"/>
+          <w:rtl w:val="0"/>
+          <w14:textFill>
+            <w14:solidFill>
+              <w14:srgbClr w14:val="000000">
+                <w14:alpha w14:val="14999"/>
+              </w14:srgbClr>
+            </w14:solidFill>
+          </w14:textFill>
+        </w:rPr>
+        <w:t xml:space="preserve">експлоатација </w:t>
+      </w:r>
+      <w:r>
+        <w:rPr>
+          <w:rFonts w:ascii="Times New Roman" w:hAnsi="Times New Roman"/>
+          <w:outline w:val="0"/>
+          <w:color w:val="000000"/>
+          <w:sz w:val="20"/>
+          <w:szCs w:val="20"/>
+          <w:shd w:val="clear" w:color="auto" w:fill="fffeff"/>
+          <w:rtl w:val="0"/>
+          <w:lang w:val="en-US"/>
+          <w14:textFill>
+            <w14:solidFill>
+              <w14:srgbClr w14:val="000000">
+                <w14:alpha w14:val="14999"/>
+              </w14:srgbClr>
+            </w14:solidFill>
+          </w14:textFill>
+        </w:rPr>
+        <w:t xml:space="preserve">(ReAct </w:t>
+      </w:r>
+      <w:r>
+        <w:rPr>
+          <w:rFonts w:ascii="Times New Roman" w:hAnsi="Times New Roman" w:hint="default"/>
+          <w:outline w:val="0"/>
+          <w:color w:val="000000"/>
+          <w:sz w:val="20"/>
+          <w:szCs w:val="20"/>
+          <w:shd w:val="clear" w:color="auto" w:fill="fffeff"/>
+          <w:rtl w:val="0"/>
+          <w14:textFill>
+            <w14:solidFill>
+              <w14:srgbClr w14:val="000000">
+                <w14:alpha w14:val="14999"/>
+              </w14:srgbClr>
+            </w14:solidFill>
+          </w14:textFill>
+        </w:rPr>
+        <w:t>петља са алатима</w:t>
+      </w:r>
+      <w:r>
+        <w:rPr>
+          <w:rFonts w:ascii="Times New Roman" w:hAnsi="Times New Roman"/>
+          <w:outline w:val="0"/>
+          <w:color w:val="000000"/>
+          <w:sz w:val="20"/>
+          <w:szCs w:val="20"/>
+          <w:shd w:val="clear" w:color="auto" w:fill="fffeff"/>
+          <w:rtl w:val="0"/>
+          <w14:textFill>
+            <w14:solidFill>
+              <w14:srgbClr w14:val="000000">
+                <w14:alpha w14:val="14999"/>
+              </w14:srgbClr>
+            </w14:solidFill>
+          </w14:textFill>
+        </w:rPr>
+        <w:t xml:space="preserve">) </w:t>
+      </w:r>
+      <w:r>
+        <w:rPr>
+          <w:rFonts w:ascii="Times New Roman" w:hAnsi="Times New Roman" w:hint="default"/>
+          <w:outline w:val="0"/>
+          <w:color w:val="000000"/>
+          <w:sz w:val="20"/>
+          <w:szCs w:val="20"/>
+          <w:shd w:val="clear" w:color="auto" w:fill="fffeff"/>
+          <w:rtl w:val="0"/>
+          <w:lang w:val="ru-RU"/>
+          <w14:textFill>
+            <w14:solidFill>
+              <w14:srgbClr w14:val="000000">
+                <w14:alpha w14:val="14999"/>
+              </w14:srgbClr>
+            </w14:solidFill>
+          </w14:textFill>
+        </w:rPr>
+        <w:t xml:space="preserve">и поновно планирање </w:t>
+      </w:r>
+      <w:r>
+        <w:rPr>
+          <w:rFonts w:ascii="Times New Roman" w:hAnsi="Times New Roman"/>
+          <w:outline w:val="0"/>
+          <w:color w:val="000000"/>
+          <w:sz w:val="20"/>
+          <w:szCs w:val="20"/>
+          <w:shd w:val="clear" w:color="auto" w:fill="fffeff"/>
+          <w:rtl w:val="0"/>
+          <w14:textFill>
+            <w14:solidFill>
+              <w14:srgbClr w14:val="000000">
+                <w14:alpha w14:val="14999"/>
+              </w14:srgbClr>
+            </w14:solidFill>
+          </w14:textFill>
+        </w:rPr>
+        <w:t>(</w:t>
+      </w:r>
+      <w:r>
+        <w:rPr>
+          <w:rFonts w:ascii="Times New Roman" w:hAnsi="Times New Roman" w:hint="default"/>
+          <w:outline w:val="0"/>
+          <w:color w:val="000000"/>
+          <w:sz w:val="20"/>
+          <w:szCs w:val="20"/>
+          <w:shd w:val="clear" w:color="auto" w:fill="fffeff"/>
+          <w:rtl w:val="0"/>
+          <w14:textFill>
+            <w14:solidFill>
+              <w14:srgbClr w14:val="000000">
+                <w14:alpha w14:val="14999"/>
+              </w14:srgbClr>
+            </w14:solidFill>
+          </w14:textFill>
+        </w:rPr>
+        <w:t xml:space="preserve">до </w:t>
+      </w:r>
+      <w:r>
+        <w:rPr>
+          <w:rFonts w:ascii="Times New Roman" w:hAnsi="Times New Roman"/>
+          <w:outline w:val="0"/>
+          <w:color w:val="000000"/>
+          <w:sz w:val="20"/>
+          <w:szCs w:val="20"/>
+          <w:shd w:val="clear" w:color="auto" w:fill="fffeff"/>
+          <w:rtl w:val="0"/>
+          <w14:textFill>
+            <w14:solidFill>
+              <w14:srgbClr w14:val="000000">
+                <w14:alpha w14:val="14999"/>
+              </w14:srgbClr>
+            </w14:solidFill>
+          </w14:textFill>
+        </w:rPr>
+        <w:t xml:space="preserve">3 </w:t>
+      </w:r>
+      <w:r>
+        <w:rPr>
+          <w:rFonts w:ascii="Times New Roman" w:hAnsi="Times New Roman" w:hint="default"/>
+          <w:outline w:val="0"/>
+          <w:color w:val="000000"/>
+          <w:sz w:val="20"/>
+          <w:szCs w:val="20"/>
+          <w:shd w:val="clear" w:color="auto" w:fill="fffeff"/>
+          <w:rtl w:val="0"/>
+          <w14:textFill>
+            <w14:solidFill>
+              <w14:srgbClr w14:val="000000">
+                <w14:alpha w14:val="14999"/>
+              </w14:srgbClr>
+            </w14:solidFill>
+          </w14:textFill>
+        </w:rPr>
+        <w:t>додатна покушаја са сажетком неуспеха претходног</w:t>
+      </w:r>
+      <w:r>
+        <w:rPr>
+          <w:rFonts w:ascii="Times New Roman" w:hAnsi="Times New Roman"/>
+          <w:outline w:val="0"/>
+          <w:color w:val="000000"/>
+          <w:sz w:val="20"/>
+          <w:szCs w:val="20"/>
+          <w:shd w:val="clear" w:color="auto" w:fill="fffeff"/>
+          <w:rtl w:val="0"/>
+          <w14:textFill>
+            <w14:solidFill>
+              <w14:srgbClr w14:val="000000">
+                <w14:alpha w14:val="14999"/>
+              </w14:srgbClr>
+            </w14:solidFill>
+          </w14:textFill>
+        </w:rPr>
+        <w:t>).</w:t>
+      </w:r>
+    </w:p>
+    <w:p>
+      <w:pPr>
+        <w:pStyle w:val="Default"/>
+        <w:tabs>
+          <w:tab w:val="left" w:pos="593"/>
+          <w:tab w:val="left" w:pos="1186"/>
+          <w:tab w:val="left" w:pos="1779"/>
+          <w:tab w:val="left" w:pos="2372"/>
+          <w:tab w:val="left" w:pos="2965"/>
+          <w:tab w:val="left" w:pos="3558"/>
+          <w:tab w:val="left" w:pos="4151"/>
+          <w:tab w:val="left" w:pos="4744"/>
+          <w:tab w:val="left" w:pos="5337"/>
+          <w:tab w:val="left" w:pos="5930"/>
+          <w:tab w:val="left" w:pos="6523"/>
+          <w:tab w:val="left" w:pos="7116"/>
+          <w:tab w:val="left" w:pos="7709"/>
+          <w:tab w:val="left" w:pos="8302"/>
+          <w:tab w:val="left" w:pos="8895"/>
+          <w:tab w:val="left" w:pos="9488"/>
+        </w:tabs>
+        <w:suppressAutoHyphens w:val="1"/>
+        <w:spacing w:before="0" w:line="240" w:lineRule="auto"/>
+        <w:jc w:val="left"/>
+        <w:rPr>
+          <w:rFonts w:ascii="Times New Roman" w:cs="Times New Roman" w:hAnsi="Times New Roman" w:eastAsia="Times New Roman"/>
+          <w:outline w:val="0"/>
+          <w:color w:val="000000"/>
+          <w:sz w:val="20"/>
+          <w:szCs w:val="20"/>
+          <w:shd w:val="clear" w:color="auto" w:fill="fffeff"/>
+          <w14:textFill>
+            <w14:solidFill>
+              <w14:srgbClr w14:val="000000">
+                <w14:alpha w14:val="14999"/>
+              </w14:srgbClr>
+            </w14:solidFill>
+          </w14:textFill>
+        </w:rPr>
+      </w:pPr>
+    </w:p>
+    <w:p>
+      <w:pPr>
+        <w:pStyle w:val="Default"/>
+        <w:tabs>
+          <w:tab w:val="left" w:pos="593"/>
+          <w:tab w:val="left" w:pos="1186"/>
+          <w:tab w:val="left" w:pos="1779"/>
+          <w:tab w:val="left" w:pos="2372"/>
+          <w:tab w:val="left" w:pos="2965"/>
+          <w:tab w:val="left" w:pos="3558"/>
+          <w:tab w:val="left" w:pos="4151"/>
+          <w:tab w:val="left" w:pos="4744"/>
+          <w:tab w:val="left" w:pos="5337"/>
+          <w:tab w:val="left" w:pos="5930"/>
+          <w:tab w:val="left" w:pos="6523"/>
+          <w:tab w:val="left" w:pos="7116"/>
+          <w:tab w:val="left" w:pos="7709"/>
+          <w:tab w:val="left" w:pos="8302"/>
+          <w:tab w:val="left" w:pos="8895"/>
+          <w:tab w:val="left" w:pos="9488"/>
+        </w:tabs>
+        <w:suppressAutoHyphens w:val="1"/>
+        <w:spacing w:before="0" w:line="240" w:lineRule="auto"/>
+        <w:jc w:val="left"/>
+        <w:rPr>
+          <w:rFonts w:ascii="Times New Roman" w:cs="Times New Roman" w:hAnsi="Times New Roman" w:eastAsia="Times New Roman"/>
+          <w:outline w:val="0"/>
+          <w:color w:val="000000"/>
+          <w:sz w:val="20"/>
+          <w:szCs w:val="20"/>
+          <w:shd w:val="clear" w:color="auto" w:fill="fffeff"/>
+          <w14:textFill>
+            <w14:solidFill>
+              <w14:srgbClr w14:val="000000">
+                <w14:alpha w14:val="14999"/>
+              </w14:srgbClr>
+            </w14:solidFill>
+          </w14:textFill>
+        </w:rPr>
+      </w:pPr>
+      <w:r>
+        <w:rPr>
+          <w:rFonts w:ascii="Times New Roman" w:hAnsi="Times New Roman" w:hint="default"/>
+          <w:outline w:val="0"/>
+          <w:color w:val="000000"/>
+          <w:sz w:val="20"/>
+          <w:szCs w:val="20"/>
+          <w:shd w:val="clear" w:color="auto" w:fill="fffeff"/>
+          <w:rtl w:val="0"/>
+          <w14:textFill>
+            <w14:solidFill>
+              <w14:srgbClr w14:val="000000">
+                <w14:alpha w14:val="14999"/>
+              </w14:srgbClr>
+            </w14:solidFill>
+          </w14:textFill>
+        </w:rPr>
+        <w:t>Оракл верификује два услова независно</w:t>
+      </w:r>
+      <w:r>
+        <w:rPr>
+          <w:rFonts w:ascii="Times New Roman" w:hAnsi="Times New Roman"/>
+          <w:outline w:val="0"/>
+          <w:color w:val="000000"/>
+          <w:sz w:val="20"/>
+          <w:szCs w:val="20"/>
+          <w:shd w:val="clear" w:color="auto" w:fill="fffeff"/>
+          <w:rtl w:val="0"/>
+          <w14:textFill>
+            <w14:solidFill>
+              <w14:srgbClr w14:val="000000">
+                <w14:alpha w14:val="14999"/>
+              </w14:srgbClr>
+            </w14:solidFill>
+          </w14:textFill>
+        </w:rPr>
+        <w:t xml:space="preserve">: </w:t>
+      </w:r>
+      <w:r>
+        <w:rPr>
+          <w:rFonts w:ascii="Times New Roman" w:hAnsi="Times New Roman" w:hint="default"/>
+          <w:outline w:val="0"/>
+          <w:color w:val="000000"/>
+          <w:sz w:val="20"/>
+          <w:szCs w:val="20"/>
+          <w:shd w:val="clear" w:color="auto" w:fill="fffeff"/>
+          <w:rtl w:val="0"/>
+          <w14:textFill>
+            <w14:solidFill>
+              <w14:srgbClr w14:val="000000">
+                <w14:alpha w14:val="14999"/>
+              </w14:srgbClr>
+            </w14:solidFill>
+          </w14:textFill>
+        </w:rPr>
+        <w:t>да ли је агент стигао до домаћина виртуелне машине и да ли је издвојени тајни податак тачан</w:t>
+      </w:r>
+      <w:r>
+        <w:rPr>
+          <w:rFonts w:ascii="Times New Roman" w:hAnsi="Times New Roman"/>
+          <w:outline w:val="0"/>
+          <w:color w:val="000000"/>
+          <w:sz w:val="20"/>
+          <w:szCs w:val="20"/>
+          <w:shd w:val="clear" w:color="auto" w:fill="fffeff"/>
+          <w:rtl w:val="0"/>
+          <w14:textFill>
+            <w14:solidFill>
+              <w14:srgbClr w14:val="000000">
+                <w14:alpha w14:val="14999"/>
+              </w14:srgbClr>
+            </w14:solidFill>
+          </w14:textFill>
+        </w:rPr>
+        <w:t xml:space="preserve">. </w:t>
+      </w:r>
+      <w:r>
+        <w:rPr>
+          <w:rFonts w:ascii="Times New Roman" w:hAnsi="Times New Roman" w:hint="default"/>
+          <w:outline w:val="0"/>
+          <w:color w:val="000000"/>
+          <w:sz w:val="20"/>
+          <w:szCs w:val="20"/>
+          <w:shd w:val="clear" w:color="auto" w:fill="fffeff"/>
+          <w:rtl w:val="0"/>
+          <w14:textFill>
+            <w14:solidFill>
+              <w14:srgbClr w14:val="000000">
+                <w14:alpha w14:val="14999"/>
+              </w14:srgbClr>
+            </w14:solidFill>
+          </w14:textFill>
+        </w:rPr>
+        <w:t>Епизода је успешна само ако обе провере прођу</w:t>
+      </w:r>
+      <w:r>
+        <w:rPr>
+          <w:rFonts w:ascii="Times New Roman" w:hAnsi="Times New Roman"/>
+          <w:outline w:val="0"/>
+          <w:color w:val="000000"/>
+          <w:sz w:val="20"/>
+          <w:szCs w:val="20"/>
+          <w:shd w:val="clear" w:color="auto" w:fill="fffeff"/>
+          <w:rtl w:val="0"/>
+          <w14:textFill>
+            <w14:solidFill>
+              <w14:srgbClr w14:val="000000">
+                <w14:alpha w14:val="14999"/>
+              </w14:srgbClr>
+            </w14:solidFill>
+          </w14:textFill>
+        </w:rPr>
+        <w:t>.</w:t>
+      </w:r>
+    </w:p>
+    <w:p>
+      <w:pPr>
+        <w:pStyle w:val="Default"/>
+        <w:tabs>
+          <w:tab w:val="left" w:pos="593"/>
+          <w:tab w:val="left" w:pos="1186"/>
+          <w:tab w:val="left" w:pos="1779"/>
+          <w:tab w:val="left" w:pos="2372"/>
+          <w:tab w:val="left" w:pos="2965"/>
+          <w:tab w:val="left" w:pos="3558"/>
+          <w:tab w:val="left" w:pos="4151"/>
+          <w:tab w:val="left" w:pos="4744"/>
+          <w:tab w:val="left" w:pos="5337"/>
+          <w:tab w:val="left" w:pos="5930"/>
+          <w:tab w:val="left" w:pos="6523"/>
+          <w:tab w:val="left" w:pos="7116"/>
+          <w:tab w:val="left" w:pos="7709"/>
+          <w:tab w:val="left" w:pos="8302"/>
+          <w:tab w:val="left" w:pos="8895"/>
+          <w:tab w:val="left" w:pos="9488"/>
+        </w:tabs>
+        <w:suppressAutoHyphens w:val="1"/>
+        <w:spacing w:before="0" w:line="240" w:lineRule="auto"/>
+        <w:jc w:val="left"/>
+        <w:rPr>
+          <w:rFonts w:ascii="Times New Roman" w:cs="Times New Roman" w:hAnsi="Times New Roman" w:eastAsia="Times New Roman"/>
+          <w:outline w:val="0"/>
+          <w:color w:val="000000"/>
+          <w:sz w:val="20"/>
+          <w:szCs w:val="20"/>
+          <w:shd w:val="clear" w:color="auto" w:fill="fffeff"/>
+          <w14:textFill>
+            <w14:solidFill>
+              <w14:srgbClr w14:val="000000">
+                <w14:alpha w14:val="14999"/>
+              </w14:srgbClr>
+            </w14:solidFill>
+          </w14:textFill>
+        </w:rPr>
+      </w:pPr>
+    </w:p>
+    <w:p>
+      <w:pPr>
+        <w:pStyle w:val="2 - Подпоглавље"/>
+        <w:numPr>
+          <w:ilvl w:val="1"/>
+          <w:numId w:val="2"/>
+        </w:numPr>
+      </w:pPr>
+      <w:r>
+        <w:rPr>
+          <w:rtl w:val="0"/>
+          <w:lang w:val="ru-RU"/>
+        </w:rPr>
+        <w:t>Евалуирани модели и буџет</w:t>
+      </w:r>
+    </w:p>
+    <w:p>
+      <w:pPr>
+        <w:pStyle w:val="Default"/>
+        <w:tabs>
+          <w:tab w:val="left" w:pos="593"/>
+          <w:tab w:val="left" w:pos="1186"/>
+          <w:tab w:val="left" w:pos="1779"/>
+          <w:tab w:val="left" w:pos="2372"/>
+          <w:tab w:val="left" w:pos="2965"/>
+          <w:tab w:val="left" w:pos="3558"/>
+          <w:tab w:val="left" w:pos="4151"/>
+          <w:tab w:val="left" w:pos="4744"/>
+          <w:tab w:val="left" w:pos="5337"/>
+          <w:tab w:val="left" w:pos="5930"/>
+          <w:tab w:val="left" w:pos="6523"/>
+          <w:tab w:val="left" w:pos="7116"/>
+          <w:tab w:val="left" w:pos="7709"/>
+          <w:tab w:val="left" w:pos="8302"/>
+          <w:tab w:val="left" w:pos="8895"/>
+          <w:tab w:val="left" w:pos="9488"/>
+        </w:tabs>
+        <w:suppressAutoHyphens w:val="1"/>
+        <w:spacing w:before="0" w:line="240" w:lineRule="auto"/>
+        <w:jc w:val="left"/>
+        <w:rPr>
+          <w:rFonts w:ascii="Times New Roman" w:cs="Times New Roman" w:hAnsi="Times New Roman" w:eastAsia="Times New Roman"/>
+          <w:outline w:val="0"/>
+          <w:color w:val="000000"/>
+          <w:sz w:val="20"/>
+          <w:szCs w:val="20"/>
+          <w:shd w:val="clear" w:color="auto" w:fill="fffeff"/>
+          <w14:textFill>
+            <w14:solidFill>
+              <w14:srgbClr w14:val="000000">
+                <w14:alpha w14:val="14999"/>
+              </w14:srgbClr>
+            </w14:solidFill>
+          </w14:textFill>
+        </w:rPr>
+      </w:pPr>
+      <w:r>
+        <w:rPr>
+          <w:rFonts w:ascii="Times New Roman" w:hAnsi="Times New Roman" w:hint="default"/>
+          <w:outline w:val="0"/>
+          <w:color w:val="000000"/>
+          <w:sz w:val="20"/>
+          <w:szCs w:val="20"/>
+          <w:shd w:val="clear" w:color="auto" w:fill="fffeff"/>
+          <w:rtl w:val="0"/>
+          <w:lang w:val="ru-RU"/>
+          <w14:textFill>
+            <w14:solidFill>
+              <w14:srgbClr w14:val="000000">
+                <w14:alpha w14:val="14999"/>
+              </w14:srgbClr>
+            </w14:solidFill>
+          </w14:textFill>
+        </w:rPr>
+        <w:t xml:space="preserve">Евалуирана су три модела из породице </w:t>
+      </w:r>
+      <w:r>
+        <w:rPr>
+          <w:rFonts w:ascii="Times New Roman" w:hAnsi="Times New Roman"/>
+          <w:outline w:val="0"/>
+          <w:color w:val="000000"/>
+          <w:sz w:val="20"/>
+          <w:szCs w:val="20"/>
+          <w:shd w:val="clear" w:color="auto" w:fill="fffeff"/>
+          <w:rtl w:val="0"/>
+          <w14:textFill>
+            <w14:solidFill>
+              <w14:srgbClr w14:val="000000">
+                <w14:alpha w14:val="14999"/>
+              </w14:srgbClr>
+            </w14:solidFill>
+          </w14:textFill>
+        </w:rPr>
+        <w:t>Claude</w:t>
+      </w:r>
+      <w:r>
+        <w:rPr>
+          <w:rFonts w:ascii="Times New Roman" w:hAnsi="Times New Roman"/>
+          <w:outline w:val="0"/>
+          <w:color w:val="000000"/>
+          <w:sz w:val="20"/>
+          <w:szCs w:val="20"/>
+          <w:shd w:val="clear" w:color="auto" w:fill="fffeff"/>
+          <w:rtl w:val="0"/>
+          <w:lang w:val="en-US"/>
+          <w14:textFill>
+            <w14:solidFill>
+              <w14:srgbClr w14:val="000000">
+                <w14:alpha w14:val="14999"/>
+              </w14:srgbClr>
+            </w14:solidFill>
+          </w14:textFill>
+        </w:rPr>
+        <w:t xml:space="preserve"> [10]</w:t>
+      </w:r>
+      <w:r>
+        <w:rPr>
+          <w:rFonts w:ascii="Times New Roman" w:hAnsi="Times New Roman"/>
+          <w:outline w:val="0"/>
+          <w:color w:val="000000"/>
+          <w:sz w:val="20"/>
+          <w:szCs w:val="20"/>
+          <w:shd w:val="clear" w:color="auto" w:fill="fffeff"/>
+          <w:rtl w:val="0"/>
+          <w14:textFill>
+            <w14:solidFill>
+              <w14:srgbClr w14:val="000000">
+                <w14:alpha w14:val="14999"/>
+              </w14:srgbClr>
+            </w14:solidFill>
+          </w14:textFill>
+        </w:rPr>
+        <w:t xml:space="preserve">: claude-haiku-4-5 (5 </w:t>
+      </w:r>
+      <w:r>
+        <w:rPr>
+          <w:rFonts w:ascii="Times New Roman" w:hAnsi="Times New Roman" w:hint="default"/>
+          <w:outline w:val="0"/>
+          <w:color w:val="000000"/>
+          <w:sz w:val="20"/>
+          <w:szCs w:val="20"/>
+          <w:shd w:val="clear" w:color="auto" w:fill="fffeff"/>
+          <w:rtl w:val="0"/>
+          <w14:textFill>
+            <w14:solidFill>
+              <w14:srgbClr w14:val="000000">
+                <w14:alpha w14:val="14999"/>
+              </w14:srgbClr>
+            </w14:solidFill>
+          </w14:textFill>
+        </w:rPr>
+        <w:t>епизода по ћелији</w:t>
+      </w:r>
+      <w:r>
+        <w:rPr>
+          <w:rFonts w:ascii="Times New Roman" w:hAnsi="Times New Roman"/>
+          <w:outline w:val="0"/>
+          <w:color w:val="000000"/>
+          <w:sz w:val="20"/>
+          <w:szCs w:val="20"/>
+          <w:shd w:val="clear" w:color="auto" w:fill="fffeff"/>
+          <w:rtl w:val="0"/>
+          <w:lang w:val="en-US"/>
+          <w14:textFill>
+            <w14:solidFill>
+              <w14:srgbClr w14:val="000000">
+                <w14:alpha w14:val="14999"/>
+              </w14:srgbClr>
+            </w14:solidFill>
+          </w14:textFill>
+        </w:rPr>
+        <w:t xml:space="preserve">), claude-sonnet-4-6 (5 </w:t>
+      </w:r>
+      <w:r>
+        <w:rPr>
+          <w:rFonts w:ascii="Times New Roman" w:hAnsi="Times New Roman" w:hint="default"/>
+          <w:outline w:val="0"/>
+          <w:color w:val="000000"/>
+          <w:sz w:val="20"/>
+          <w:szCs w:val="20"/>
+          <w:shd w:val="clear" w:color="auto" w:fill="fffeff"/>
+          <w:rtl w:val="0"/>
+          <w14:textFill>
+            <w14:solidFill>
+              <w14:srgbClr w14:val="000000">
+                <w14:alpha w14:val="14999"/>
+              </w14:srgbClr>
+            </w14:solidFill>
+          </w14:textFill>
+        </w:rPr>
+        <w:t>епизода</w:t>
+      </w:r>
+      <w:r>
+        <w:rPr>
+          <w:rFonts w:ascii="Times New Roman" w:hAnsi="Times New Roman"/>
+          <w:outline w:val="0"/>
+          <w:color w:val="000000"/>
+          <w:sz w:val="20"/>
+          <w:szCs w:val="20"/>
+          <w:shd w:val="clear" w:color="auto" w:fill="fffeff"/>
+          <w:rtl w:val="0"/>
+          <w14:textFill>
+            <w14:solidFill>
+              <w14:srgbClr w14:val="000000">
+                <w14:alpha w14:val="14999"/>
+              </w14:srgbClr>
+            </w14:solidFill>
+          </w14:textFill>
+        </w:rPr>
+        <w:t xml:space="preserve">) </w:t>
+      </w:r>
+      <w:r>
+        <w:rPr>
+          <w:rFonts w:ascii="Times New Roman" w:hAnsi="Times New Roman" w:hint="default"/>
+          <w:outline w:val="0"/>
+          <w:color w:val="000000"/>
+          <w:sz w:val="20"/>
+          <w:szCs w:val="20"/>
+          <w:shd w:val="clear" w:color="auto" w:fill="fffeff"/>
+          <w:rtl w:val="0"/>
+          <w14:textFill>
+            <w14:solidFill>
+              <w14:srgbClr w14:val="000000">
+                <w14:alpha w14:val="14999"/>
+              </w14:srgbClr>
+            </w14:solidFill>
+          </w14:textFill>
+        </w:rPr>
+        <w:t xml:space="preserve">и </w:t>
+      </w:r>
+      <w:r>
+        <w:rPr>
+          <w:rFonts w:ascii="Times New Roman" w:hAnsi="Times New Roman"/>
+          <w:outline w:val="0"/>
+          <w:color w:val="000000"/>
+          <w:sz w:val="20"/>
+          <w:szCs w:val="20"/>
+          <w:shd w:val="clear" w:color="auto" w:fill="fffeff"/>
+          <w:rtl w:val="0"/>
+          <w14:textFill>
+            <w14:solidFill>
+              <w14:srgbClr w14:val="000000">
+                <w14:alpha w14:val="14999"/>
+              </w14:srgbClr>
+            </w14:solidFill>
+          </w14:textFill>
+        </w:rPr>
+        <w:t xml:space="preserve">claude-opus-4-8 (3 </w:t>
+      </w:r>
+      <w:r>
+        <w:rPr>
+          <w:rFonts w:ascii="Times New Roman" w:hAnsi="Times New Roman" w:hint="default"/>
+          <w:outline w:val="0"/>
+          <w:color w:val="000000"/>
+          <w:sz w:val="20"/>
+          <w:szCs w:val="20"/>
+          <w:shd w:val="clear" w:color="auto" w:fill="fffeff"/>
+          <w:rtl w:val="0"/>
+          <w14:textFill>
+            <w14:solidFill>
+              <w14:srgbClr w14:val="000000">
+                <w14:alpha w14:val="14999"/>
+              </w14:srgbClr>
+            </w14:solidFill>
+          </w14:textFill>
+        </w:rPr>
+        <w:t>епизоде</w:t>
+      </w:r>
+      <w:r>
+        <w:rPr>
+          <w:rFonts w:ascii="Times New Roman" w:hAnsi="Times New Roman"/>
+          <w:outline w:val="0"/>
+          <w:color w:val="000000"/>
+          <w:sz w:val="20"/>
+          <w:szCs w:val="20"/>
+          <w:shd w:val="clear" w:color="auto" w:fill="fffeff"/>
+          <w:rtl w:val="0"/>
+          <w14:textFill>
+            <w14:solidFill>
+              <w14:srgbClr w14:val="000000">
+                <w14:alpha w14:val="14999"/>
+              </w14:srgbClr>
+            </w14:solidFill>
+          </w14:textFill>
+        </w:rPr>
+        <w:t xml:space="preserve">, </w:t>
+      </w:r>
+      <w:r>
+        <w:rPr>
+          <w:rFonts w:ascii="Times New Roman" w:hAnsi="Times New Roman" w:hint="default"/>
+          <w:outline w:val="0"/>
+          <w:color w:val="000000"/>
+          <w:sz w:val="20"/>
+          <w:szCs w:val="20"/>
+          <w:shd w:val="clear" w:color="auto" w:fill="fffeff"/>
+          <w:rtl w:val="0"/>
+          <w:lang w:val="ru-RU"/>
+          <w14:textFill>
+            <w14:solidFill>
+              <w14:srgbClr w14:val="000000">
+                <w14:alpha w14:val="14999"/>
+              </w14:srgbClr>
+            </w14:solidFill>
+          </w14:textFill>
+        </w:rPr>
+        <w:t>смањено због трошкова</w:t>
+      </w:r>
+      <w:r>
+        <w:rPr>
+          <w:rFonts w:ascii="Times New Roman" w:hAnsi="Times New Roman"/>
+          <w:outline w:val="0"/>
+          <w:color w:val="000000"/>
+          <w:sz w:val="20"/>
+          <w:szCs w:val="20"/>
+          <w:shd w:val="clear" w:color="auto" w:fill="fffeff"/>
+          <w:rtl w:val="0"/>
+          <w14:textFill>
+            <w14:solidFill>
+              <w14:srgbClr w14:val="000000">
+                <w14:alpha w14:val="14999"/>
+              </w14:srgbClr>
+            </w14:solidFill>
+          </w14:textFill>
+        </w:rPr>
+        <w:t xml:space="preserve">). </w:t>
+      </w:r>
+      <w:r>
+        <w:rPr>
+          <w:rFonts w:ascii="Times New Roman" w:hAnsi="Times New Roman" w:hint="default"/>
+          <w:outline w:val="0"/>
+          <w:color w:val="000000"/>
+          <w:sz w:val="20"/>
+          <w:szCs w:val="20"/>
+          <w:shd w:val="clear" w:color="auto" w:fill="fffeff"/>
+          <w:rtl w:val="0"/>
+          <w14:textFill>
+            <w14:solidFill>
+              <w14:srgbClr w14:val="000000">
+                <w14:alpha w14:val="14999"/>
+              </w14:srgbClr>
+            </w14:solidFill>
+          </w14:textFill>
+        </w:rPr>
+        <w:t>Ефективни прагови буџета разликују се по моделу услед разлика у цени по токену</w:t>
+      </w:r>
+      <w:r>
+        <w:rPr>
+          <w:rFonts w:ascii="Times New Roman" w:hAnsi="Times New Roman"/>
+          <w:outline w:val="0"/>
+          <w:color w:val="000000"/>
+          <w:sz w:val="20"/>
+          <w:szCs w:val="20"/>
+          <w:shd w:val="clear" w:color="auto" w:fill="fffeff"/>
+          <w:rtl w:val="0"/>
+          <w14:textFill>
+            <w14:solidFill>
+              <w14:srgbClr w14:val="000000">
+                <w14:alpha w14:val="14999"/>
+              </w14:srgbClr>
+            </w14:solidFill>
+          </w14:textFill>
+        </w:rPr>
+        <w:t xml:space="preserve">: </w:t>
+      </w:r>
+      <w:r>
+        <w:rPr>
+          <w:rFonts w:ascii="Times New Roman" w:hAnsi="Times New Roman" w:hint="default"/>
+          <w:outline w:val="0"/>
+          <w:color w:val="000000"/>
+          <w:sz w:val="20"/>
+          <w:szCs w:val="20"/>
+          <w:shd w:val="clear" w:color="auto" w:fill="fffeff"/>
+          <w:rtl w:val="0"/>
+          <w14:textFill>
+            <w14:solidFill>
+              <w14:srgbClr w14:val="000000">
+                <w14:alpha w14:val="14999"/>
+              </w14:srgbClr>
+            </w14:solidFill>
+          </w14:textFill>
+        </w:rPr>
+        <w:t xml:space="preserve">приближно </w:t>
+      </w:r>
+      <w:r>
+        <w:rPr>
+          <w:rFonts w:ascii="Times New Roman" w:hAnsi="Times New Roman"/>
+          <w:outline w:val="0"/>
+          <w:color w:val="000000"/>
+          <w:sz w:val="20"/>
+          <w:szCs w:val="20"/>
+          <w:shd w:val="clear" w:color="auto" w:fill="fffeff"/>
+          <w:rtl w:val="0"/>
+          <w14:textFill>
+            <w14:solidFill>
+              <w14:srgbClr w14:val="000000">
+                <w14:alpha w14:val="14999"/>
+              </w14:srgbClr>
+            </w14:solidFill>
+          </w14:textFill>
+        </w:rPr>
+        <w:t xml:space="preserve">2 USD </w:t>
+      </w:r>
+      <w:r>
+        <w:rPr>
+          <w:rFonts w:ascii="Times New Roman" w:hAnsi="Times New Roman" w:hint="default"/>
+          <w:outline w:val="0"/>
+          <w:color w:val="000000"/>
+          <w:sz w:val="20"/>
+          <w:szCs w:val="20"/>
+          <w:shd w:val="clear" w:color="auto" w:fill="fffeff"/>
+          <w:rtl w:val="0"/>
+          <w14:textFill>
+            <w14:solidFill>
+              <w14:srgbClr w14:val="000000">
+                <w14:alpha w14:val="14999"/>
+              </w14:srgbClr>
+            </w14:solidFill>
+          </w14:textFill>
+        </w:rPr>
+        <w:t xml:space="preserve">по епизоди за </w:t>
+      </w:r>
+      <w:r>
+        <w:rPr>
+          <w:rFonts w:ascii="Times New Roman" w:hAnsi="Times New Roman"/>
+          <w:outline w:val="0"/>
+          <w:color w:val="000000"/>
+          <w:sz w:val="20"/>
+          <w:szCs w:val="20"/>
+          <w:shd w:val="clear" w:color="auto" w:fill="fffeff"/>
+          <w:rtl w:val="0"/>
+          <w14:textFill>
+            <w14:solidFill>
+              <w14:srgbClr w14:val="000000">
+                <w14:alpha w14:val="14999"/>
+              </w14:srgbClr>
+            </w14:solidFill>
+          </w14:textFill>
+        </w:rPr>
+        <w:t xml:space="preserve">Haiku </w:t>
+      </w:r>
+      <w:r>
+        <w:rPr>
+          <w:rFonts w:ascii="Times New Roman" w:hAnsi="Times New Roman" w:hint="default"/>
+          <w:outline w:val="0"/>
+          <w:color w:val="000000"/>
+          <w:sz w:val="20"/>
+          <w:szCs w:val="20"/>
+          <w:shd w:val="clear" w:color="auto" w:fill="fffeff"/>
+          <w:rtl w:val="0"/>
+          <w14:textFill>
+            <w14:solidFill>
+              <w14:srgbClr w14:val="000000">
+                <w14:alpha w14:val="14999"/>
+              </w14:srgbClr>
+            </w14:solidFill>
+          </w14:textFill>
+        </w:rPr>
+        <w:t xml:space="preserve">и </w:t>
+      </w:r>
+      <w:r>
+        <w:rPr>
+          <w:rFonts w:ascii="Times New Roman" w:hAnsi="Times New Roman"/>
+          <w:outline w:val="0"/>
+          <w:color w:val="000000"/>
+          <w:sz w:val="20"/>
+          <w:szCs w:val="20"/>
+          <w:shd w:val="clear" w:color="auto" w:fill="fffeff"/>
+          <w:rtl w:val="0"/>
+          <w:lang w:val="de-DE"/>
+          <w14:textFill>
+            <w14:solidFill>
+              <w14:srgbClr w14:val="000000">
+                <w14:alpha w14:val="14999"/>
+              </w14:srgbClr>
+            </w14:solidFill>
+          </w14:textFill>
+        </w:rPr>
+        <w:t xml:space="preserve">Sonnet </w:t>
+      </w:r>
+      <w:r>
+        <w:rPr>
+          <w:rFonts w:ascii="Times New Roman" w:hAnsi="Times New Roman" w:hint="default"/>
+          <w:outline w:val="0"/>
+          <w:color w:val="000000"/>
+          <w:sz w:val="20"/>
+          <w:szCs w:val="20"/>
+          <w:shd w:val="clear" w:color="auto" w:fill="fffeff"/>
+          <w:rtl w:val="0"/>
+          <w14:textFill>
+            <w14:solidFill>
+              <w14:srgbClr w14:val="000000">
+                <w14:alpha w14:val="14999"/>
+              </w14:srgbClr>
+            </w14:solidFill>
+          </w14:textFill>
+        </w:rPr>
+        <w:t xml:space="preserve">и приближно </w:t>
+      </w:r>
+      <w:r>
+        <w:rPr>
+          <w:rFonts w:ascii="Times New Roman" w:hAnsi="Times New Roman"/>
+          <w:outline w:val="0"/>
+          <w:color w:val="000000"/>
+          <w:sz w:val="20"/>
+          <w:szCs w:val="20"/>
+          <w:shd w:val="clear" w:color="auto" w:fill="fffeff"/>
+          <w:rtl w:val="0"/>
+          <w14:textFill>
+            <w14:solidFill>
+              <w14:srgbClr w14:val="000000">
+                <w14:alpha w14:val="14999"/>
+              </w14:srgbClr>
+            </w14:solidFill>
+          </w14:textFill>
+        </w:rPr>
+        <w:t xml:space="preserve">4 USD </w:t>
+      </w:r>
+      <w:r>
+        <w:rPr>
+          <w:rFonts w:ascii="Times New Roman" w:hAnsi="Times New Roman" w:hint="default"/>
+          <w:outline w:val="0"/>
+          <w:color w:val="000000"/>
+          <w:sz w:val="20"/>
+          <w:szCs w:val="20"/>
+          <w:shd w:val="clear" w:color="auto" w:fill="fffeff"/>
+          <w:rtl w:val="0"/>
+          <w14:textFill>
+            <w14:solidFill>
+              <w14:srgbClr w14:val="000000">
+                <w14:alpha w14:val="14999"/>
+              </w14:srgbClr>
+            </w14:solidFill>
+          </w14:textFill>
+        </w:rPr>
+        <w:t xml:space="preserve">за </w:t>
+      </w:r>
+      <w:r>
+        <w:rPr>
+          <w:rFonts w:ascii="Times New Roman" w:hAnsi="Times New Roman"/>
+          <w:outline w:val="0"/>
+          <w:color w:val="000000"/>
+          <w:sz w:val="20"/>
+          <w:szCs w:val="20"/>
+          <w:shd w:val="clear" w:color="auto" w:fill="fffeff"/>
+          <w:rtl w:val="0"/>
+          <w:lang w:val="pt-PT"/>
+          <w14:textFill>
+            <w14:solidFill>
+              <w14:srgbClr w14:val="000000">
+                <w14:alpha w14:val="14999"/>
+              </w14:srgbClr>
+            </w14:solidFill>
+          </w14:textFill>
+        </w:rPr>
+        <w:t>Opus.</w:t>
+      </w:r>
+    </w:p>
+    <w:p>
+      <w:pPr>
+        <w:pStyle w:val="1 - Поглавље"/>
+        <w:numPr>
+          <w:ilvl w:val="0"/>
+          <w:numId w:val="2"/>
+        </w:numPr>
+      </w:pPr>
+      <w:r>
+        <w:rPr>
+          <w:rtl w:val="0"/>
+        </w:rPr>
+        <w:t xml:space="preserve"> РЕЗУЛТАТИ</w:t>
+      </w:r>
+    </w:p>
+    <w:p>
+      <w:pPr>
+        <w:pStyle w:val="Default"/>
+        <w:tabs>
+          <w:tab w:val="left" w:pos="593"/>
+          <w:tab w:val="left" w:pos="1186"/>
+          <w:tab w:val="left" w:pos="1779"/>
+          <w:tab w:val="left" w:pos="2372"/>
+          <w:tab w:val="left" w:pos="2965"/>
+          <w:tab w:val="left" w:pos="3558"/>
+          <w:tab w:val="left" w:pos="4151"/>
+          <w:tab w:val="left" w:pos="4744"/>
+          <w:tab w:val="left" w:pos="5337"/>
+          <w:tab w:val="left" w:pos="5930"/>
+          <w:tab w:val="left" w:pos="6523"/>
+          <w:tab w:val="left" w:pos="7116"/>
+          <w:tab w:val="left" w:pos="7709"/>
+          <w:tab w:val="left" w:pos="8302"/>
+          <w:tab w:val="left" w:pos="8895"/>
+          <w:tab w:val="left" w:pos="9488"/>
+        </w:tabs>
+        <w:suppressAutoHyphens w:val="1"/>
+        <w:spacing w:before="0" w:line="240" w:lineRule="auto"/>
+        <w:jc w:val="left"/>
+        <w:rPr>
+          <w:rFonts w:ascii="Times New Roman" w:cs="Times New Roman" w:hAnsi="Times New Roman" w:eastAsia="Times New Roman"/>
+          <w:outline w:val="0"/>
+          <w:color w:val="000000"/>
+          <w:sz w:val="20"/>
+          <w:szCs w:val="20"/>
+          <w:shd w:val="clear" w:color="auto" w:fill="fffeff"/>
+          <w14:textFill>
+            <w14:solidFill>
+              <w14:srgbClr w14:val="000000">
+                <w14:alpha w14:val="14999"/>
+              </w14:srgbClr>
+            </w14:solidFill>
+          </w14:textFill>
+        </w:rPr>
       </w:pPr>
     </w:p>
     <w:p>
@@ -3588,10 +6617,240 @@
     </w:p>
     <w:p>
       <w:pPr>
+        <w:pStyle w:val="0 - Текст рада"/>
+      </w:pPr>
+    </w:p>
+    <w:p>
+      <w:pPr>
+        <w:pStyle w:val="0 - Текст рада"/>
+      </w:pPr>
+    </w:p>
+    <w:p>
+      <w:pPr>
+        <w:pStyle w:val="0 - Текст рада"/>
+      </w:pPr>
+    </w:p>
+    <w:p>
+      <w:pPr>
+        <w:pStyle w:val="0 - Текст рада"/>
+      </w:pPr>
+    </w:p>
+    <w:p>
+      <w:pPr>
+        <w:pStyle w:val="0 - Текст рада"/>
+      </w:pPr>
+    </w:p>
+    <w:p>
+      <w:pPr>
+        <w:pStyle w:val="0 - Текст рада"/>
+      </w:pPr>
+    </w:p>
+    <w:p>
+      <w:pPr>
+        <w:pStyle w:val="0 - Текст рада"/>
+      </w:pPr>
+    </w:p>
+    <w:p>
+      <w:pPr>
+        <w:pStyle w:val="0 - Текст рада"/>
+      </w:pPr>
+    </w:p>
+    <w:p>
+      <w:pPr>
+        <w:pStyle w:val="0 - Текст рада"/>
+      </w:pPr>
+    </w:p>
+    <w:p>
+      <w:pPr>
+        <w:pStyle w:val="0 - Текст рада"/>
+      </w:pPr>
+    </w:p>
+    <w:p>
+      <w:pPr>
+        <w:pStyle w:val="0 - Текст рада"/>
+      </w:pPr>
+    </w:p>
+    <w:p>
+      <w:pPr>
+        <w:pStyle w:val="0 - Текст рада"/>
+      </w:pPr>
+    </w:p>
+    <w:p>
+      <w:pPr>
+        <w:pStyle w:val="0 - Текст рада"/>
+      </w:pPr>
+    </w:p>
+    <w:p>
+      <w:pPr>
+        <w:pStyle w:val="0 - Текст рада"/>
+      </w:pPr>
+    </w:p>
+    <w:p>
+      <w:pPr>
+        <w:pStyle w:val="0 - Текст рада"/>
+      </w:pPr>
+    </w:p>
+    <w:p>
+      <w:pPr>
+        <w:pStyle w:val="0 - Текст рада"/>
+      </w:pPr>
+    </w:p>
+    <w:p>
+      <w:pPr>
+        <w:pStyle w:val="0 - Текст рада"/>
+      </w:pPr>
+    </w:p>
+    <w:p>
+      <w:pPr>
+        <w:pStyle w:val="0 - Текст рада"/>
+      </w:pPr>
+    </w:p>
+    <w:p>
+      <w:pPr>
+        <w:pStyle w:val="0 - Текст рада"/>
+      </w:pPr>
+    </w:p>
+    <w:p>
+      <w:pPr>
+        <w:pStyle w:val="0 - Текст рада"/>
+      </w:pPr>
+    </w:p>
+    <w:p>
+      <w:pPr>
+        <w:pStyle w:val="0 - Текст рада"/>
+      </w:pPr>
+    </w:p>
+    <w:p>
+      <w:pPr>
+        <w:pStyle w:val="0 - Текст рада"/>
+      </w:pPr>
+    </w:p>
+    <w:p>
+      <w:pPr>
+        <w:pStyle w:val="0 - Текст рада"/>
+      </w:pPr>
+    </w:p>
+    <w:p>
+      <w:pPr>
+        <w:pStyle w:val="0 - Текст рада"/>
+      </w:pPr>
+    </w:p>
+    <w:p>
+      <w:pPr>
+        <w:pStyle w:val="0 - Текст рада"/>
+      </w:pPr>
+    </w:p>
+    <w:p>
+      <w:pPr>
+        <w:pStyle w:val="0 - Текст рада"/>
+      </w:pPr>
+    </w:p>
+    <w:p>
+      <w:pPr>
+        <w:pStyle w:val="0 - Текст рада"/>
+      </w:pPr>
+    </w:p>
+    <w:p>
+      <w:pPr>
+        <w:pStyle w:val="0 - Текст рада"/>
+      </w:pPr>
+    </w:p>
+    <w:p>
+      <w:pPr>
+        <w:pStyle w:val="0 - Текст рада"/>
+      </w:pPr>
+    </w:p>
+    <w:p>
+      <w:pPr>
+        <w:pStyle w:val="0 - Текст рада"/>
+      </w:pPr>
+    </w:p>
+    <w:p>
+      <w:pPr>
+        <w:pStyle w:val="0 - Текст рада"/>
+      </w:pPr>
+    </w:p>
+    <w:p>
+      <w:pPr>
+        <w:pStyle w:val="0 - Текст рада"/>
+      </w:pPr>
+    </w:p>
+    <w:p>
+      <w:pPr>
+        <w:pStyle w:val="0 - Текст рада"/>
+      </w:pPr>
+    </w:p>
+    <w:p>
+      <w:pPr>
+        <w:pStyle w:val="0 - Текст рада"/>
+      </w:pPr>
+    </w:p>
+    <w:p>
+      <w:pPr>
+        <w:pStyle w:val="0 - Текст рада"/>
+      </w:pPr>
+    </w:p>
+    <w:p>
+      <w:pPr>
+        <w:pStyle w:val="0 - Текст рада"/>
+      </w:pPr>
+    </w:p>
+    <w:p>
+      <w:pPr>
+        <w:pStyle w:val="0 - Текст рада"/>
+      </w:pPr>
+    </w:p>
+    <w:p>
+      <w:pPr>
+        <w:pStyle w:val="0 - Текст рада"/>
+      </w:pPr>
+    </w:p>
+    <w:p>
+      <w:pPr>
+        <w:pStyle w:val="0 - Текст рада"/>
+      </w:pPr>
+    </w:p>
+    <w:p>
+      <w:pPr>
+        <w:pStyle w:val="0 - Текст рада"/>
+      </w:pPr>
+    </w:p>
+    <w:p>
+      <w:pPr>
+        <w:pStyle w:val="0 - Текст рада"/>
+      </w:pPr>
+    </w:p>
+    <w:p>
+      <w:pPr>
+        <w:pStyle w:val="0 - Текст рада"/>
+      </w:pPr>
+    </w:p>
+    <w:p>
+      <w:pPr>
+        <w:pStyle w:val="0 - Текст рада"/>
+      </w:pPr>
+    </w:p>
+    <w:p>
+      <w:pPr>
+        <w:pStyle w:val="0 - Текст рада"/>
+      </w:pPr>
+    </w:p>
+    <w:p>
+      <w:pPr>
+        <w:pStyle w:val="0 - Текст рада"/>
+      </w:pPr>
+    </w:p>
+    <w:p>
+      <w:pPr>
+        <w:pStyle w:val="0 - Текст рада"/>
+      </w:pPr>
+    </w:p>
+    <w:p>
+      <w:pPr>
         <w:pStyle w:val="1 - Поглавље"/>
         <w:numPr>
           <w:ilvl w:val="0"/>
-          <w:numId w:val="5"/>
+          <w:numId w:val="6"/>
         </w:numPr>
         <w:bidi w:val="0"/>
         <w:ind w:right="0"/>
@@ -4131,6 +7390,175 @@
           <w:rtl w:val="0"/>
         </w:rPr>
         <w:t>, 2023.</w:t>
+      </w:r>
+    </w:p>
+    <w:p>
+      <w:pPr>
+        <w:pStyle w:val="Литература"/>
+      </w:pPr>
+      <w:r>
+        <w:rPr>
+          <w:rtl w:val="0"/>
+          <w:lang w:val="en-US"/>
+        </w:rPr>
+        <w:t>[10]</w:t>
+      </w:r>
+      <w:r>
+        <w:rPr>
+          <w:outline w:val="0"/>
+          <w:color w:val="000000"/>
+          <w:rtl w:val="0"/>
+          <w:lang w:val="en-US"/>
+          <w14:textFill>
+            <w14:solidFill>
+              <w14:srgbClr w14:val="000000">
+                <w14:alpha w14:val="14999"/>
+              </w14:srgbClr>
+            </w14:solidFill>
+          </w14:textFill>
+        </w:rPr>
+        <w:t xml:space="preserve"> Anthropic, </w:t>
+      </w:r>
+      <w:r>
+        <w:rPr>
+          <w:outline w:val="0"/>
+          <w:color w:val="000000"/>
+          <w:rtl w:val="0"/>
+          <w14:textFill>
+            <w14:solidFill>
+              <w14:srgbClr w14:val="000000">
+                <w14:alpha w14:val="14999"/>
+              </w14:srgbClr>
+            </w14:solidFill>
+          </w14:textFill>
+        </w:rPr>
+        <w:t>„</w:t>
+      </w:r>
+      <w:r>
+        <w:rPr>
+          <w:outline w:val="0"/>
+          <w:color w:val="000000"/>
+          <w:rtl w:val="0"/>
+          <w:lang w:val="en-US"/>
+          <w14:textFill>
+            <w14:solidFill>
+              <w14:srgbClr w14:val="000000">
+                <w14:alpha w14:val="14999"/>
+              </w14:srgbClr>
+            </w14:solidFill>
+          </w14:textFill>
+        </w:rPr>
+        <w:t xml:space="preserve">Claude Models," 2025. </w:t>
+      </w:r>
+      <w:r>
+        <w:rPr>
+          <w:outline w:val="0"/>
+          <w:color w:val="937000"/>
+          <w:rtl w:val="0"/>
+          <w:lang w:val="pt-PT"/>
+          <w14:textFill>
+            <w14:solidFill>
+              <w14:srgbClr w14:val="947100"/>
+            </w14:solidFill>
+          </w14:textFill>
+        </w:rPr>
+        <w:t>[</w:t>
+      </w:r>
+      <w:r>
+        <w:rPr>
+          <w:outline w:val="0"/>
+          <w:color w:val="d12e1b"/>
+          <w:rtl w:val="0"/>
+          <w:lang w:val="de-DE"/>
+          <w14:textFill>
+            <w14:solidFill>
+              <w14:srgbClr w14:val="D12F1B"/>
+            </w14:solidFill>
+          </w14:textFill>
+        </w:rPr>
+        <w:t>Online</w:t>
+      </w:r>
+      <w:r>
+        <w:rPr>
+          <w:outline w:val="0"/>
+          <w:color w:val="937000"/>
+          <w:rtl w:val="0"/>
+          <w:lang w:val="pt-PT"/>
+          <w14:textFill>
+            <w14:solidFill>
+              <w14:srgbClr w14:val="947100"/>
+            </w14:solidFill>
+          </w14:textFill>
+        </w:rPr>
+        <w:t>]</w:t>
+      </w:r>
+      <w:r>
+        <w:rPr>
+          <w:outline w:val="0"/>
+          <w:color w:val="000000"/>
+          <w:rtl w:val="0"/>
+          <w14:textFill>
+            <w14:solidFill>
+              <w14:srgbClr w14:val="000000">
+                <w14:alpha w14:val="14999"/>
+              </w14:srgbClr>
+            </w14:solidFill>
+          </w14:textFill>
+        </w:rPr>
+        <w:t xml:space="preserve">. </w:t>
+      </w:r>
+      <w:r>
+        <w:rPr>
+          <w:outline w:val="0"/>
+          <w:color w:val="000000"/>
+          <w:rtl w:val="0"/>
+          <w:lang w:val="en-US"/>
+          <w14:textFill>
+            <w14:solidFill>
+              <w14:srgbClr w14:val="000000">
+                <w14:alpha w14:val="14999"/>
+              </w14:srgbClr>
+            </w14:solidFill>
+          </w14:textFill>
+        </w:rPr>
+        <w:t xml:space="preserve">  </w:t>
+      </w:r>
+      <w:r>
+        <w:rPr>
+          <w:outline w:val="0"/>
+          <w:color w:val="000000"/>
+          <w:rtl w:val="0"/>
+          <w14:textFill>
+            <w14:solidFill>
+              <w14:srgbClr w14:val="000000">
+                <w14:alpha w14:val="14999"/>
+              </w14:srgbClr>
+            </w14:solidFill>
+          </w14:textFill>
+        </w:rPr>
+        <w:t>п</w:t>
+      </w:r>
+      <w:r>
+        <w:rPr>
+          <w:outline w:val="0"/>
+          <w:color w:val="000000"/>
+          <w:rtl w:val="0"/>
+          <w14:textFill>
+            <w14:solidFill>
+              <w14:srgbClr w14:val="000000">
+                <w14:alpha w14:val="14999"/>
+              </w14:srgbClr>
+            </w14:solidFill>
+          </w14:textFill>
+        </w:rPr>
+        <w:t xml:space="preserve">: </w:t>
+      </w:r>
+      <w:r>
+        <w:rPr>
+          <w:rtl w:val="0"/>
+          <w:lang w:val="en-US"/>
+        </w:rPr>
+        <w:t>https://docs.anthropic.com/en/docs/about-claude/models</w:t>
       </w:r>
     </w:p>
     <w:p>
@@ -4175,7 +7603,7 @@
           <w:shd w:val="clear" w:color="auto" w:fill="ced7e7"/>
         </w:tblPrEx>
         <w:trPr>
-          <w:trHeight w:val="1452" w:hRule="atLeast"/>
+          <w:trHeight w:val="2392" w:hRule="atLeast"/>
         </w:trPr>
         <w:tc>
           <w:tcPr>
@@ -4620,6 +8048,43 @@
                 <w:shd w:val="nil" w:color="auto" w:fill="auto"/>
                 <w:rtl w:val="0"/>
               </w:rPr>
+              <w:t xml:space="preserve"> и завршава их </w:t>
+            </w:r>
+            <w:r>
+              <w:rPr>
+                <w:shd w:val="nil" w:color="auto" w:fill="auto"/>
+                <w:rtl w:val="0"/>
+              </w:rPr>
+              <w:t>2026</w:t>
+            </w:r>
+            <w:r>
+              <w:rPr>
+                <w:shd w:val="nil" w:color="auto" w:fill="auto"/>
+                <w:rtl w:val="0"/>
+              </w:rPr>
+              <w:t>.</w:t>
+            </w:r>
+            <w:r>
+              <w:rPr>
+                <w:shd w:val="nil" w:color="auto" w:fill="auto"/>
+                <w:rtl w:val="0"/>
+              </w:rPr>
+              <w:t xml:space="preserve"> г</w:t>
+            </w:r>
+            <w:r>
+              <w:rPr>
+                <w:shd w:val="nil" w:color="auto" w:fill="auto"/>
+                <w:rtl w:val="0"/>
+                <w:lang w:val="en-US"/>
+              </w:rPr>
+              <w:t>одине</w:t>
+            </w:r>
+            <w:r>
+              <w:rPr>
+                <w:shd w:val="nil" w:color="auto" w:fill="auto"/>
+                <w:rtl w:val="0"/>
+                <w:lang w:val="en-US"/>
+              </w:rPr>
               <w:t>.</w:t>
             </w:r>
           </w:p>
@@ -5257,6 +8722,423 @@
     <w:abstractNumId w:val="2"/>
   </w:num>
   <w:num w:numId="5">
+    <w:abstractNumId w:val="2"/>
+    <w:lvlOverride w:ilvl="0">
+      <w:lvl w:ilvl="0">
+        <w:start w:val="1"/>
+        <w:numFmt w:val="bullet"/>
+        <w:suff w:val="tab"/>
+        <w:lvlText w:val="•"/>
+        <w:lvlJc w:val="left"/>
+        <w:pPr>
+          <w:tabs>
+            <w:tab w:val="left" w:pos="593"/>
+            <w:tab w:val="left" w:pos="1186"/>
+            <w:tab w:val="left" w:pos="1779"/>
+            <w:tab w:val="left" w:pos="2372"/>
+            <w:tab w:val="left" w:pos="2965"/>
+            <w:tab w:val="left" w:pos="3558"/>
+            <w:tab w:val="left" w:pos="4151"/>
+            <w:tab w:val="left" w:pos="4744"/>
+            <w:tab w:val="left" w:pos="5337"/>
+            <w:tab w:val="left" w:pos="5930"/>
+            <w:tab w:val="left" w:pos="6523"/>
+            <w:tab w:val="left" w:pos="7116"/>
+            <w:tab w:val="left" w:pos="7709"/>
+            <w:tab w:val="left" w:pos="8302"/>
+            <w:tab w:val="left" w:pos="8895"/>
+            <w:tab w:val="left" w:pos="9488"/>
+          </w:tabs>
+          <w:ind w:left="158" w:hanging="158"/>
+        </w:pPr>
+        <w:rPr>
+          <w:rFonts w:hAnsi="Arial Unicode MS"/>
+          <w:caps w:val="0"/>
+          <w:smallCaps w:val="0"/>
+          <w:strike w:val="0"/>
+          <w:dstrike w:val="0"/>
+          <w:outline w:val="0"/>
+          <w:emboss w:val="0"/>
+          <w:imprint w:val="0"/>
+          <w:spacing w:val="0"/>
+          <w:w w:val="100"/>
+          <w:kern w:val="0"/>
+          <w:position w:val="0"/>
+          <w:highlight w:val="none"/>
+          <w:vertAlign w:val="baseline"/>
+        </w:rPr>
+      </w:lvl>
+    </w:lvlOverride>
+    <w:lvlOverride w:ilvl="1">
+      <w:lvl w:ilvl="1">
+        <w:start w:val="1"/>
+        <w:numFmt w:val="bullet"/>
+        <w:suff w:val="tab"/>
+        <w:lvlText w:val="•"/>
+        <w:lvlJc w:val="left"/>
+        <w:pPr>
+          <w:tabs>
+            <w:tab w:val="left" w:pos="593"/>
+            <w:tab w:val="left" w:pos="1186"/>
+            <w:tab w:val="left" w:pos="1779"/>
+            <w:tab w:val="left" w:pos="2372"/>
+            <w:tab w:val="left" w:pos="2965"/>
+            <w:tab w:val="left" w:pos="3558"/>
+            <w:tab w:val="left" w:pos="4151"/>
+            <w:tab w:val="left" w:pos="4744"/>
+            <w:tab w:val="left" w:pos="5337"/>
+            <w:tab w:val="left" w:pos="5930"/>
+            <w:tab w:val="left" w:pos="6523"/>
+            <w:tab w:val="left" w:pos="7116"/>
+            <w:tab w:val="left" w:pos="7709"/>
+            <w:tab w:val="left" w:pos="8302"/>
+            <w:tab w:val="left" w:pos="8895"/>
+            <w:tab w:val="left" w:pos="9488"/>
+          </w:tabs>
+          <w:ind w:left="758" w:hanging="158"/>
+        </w:pPr>
+        <w:rPr>
+          <w:rFonts w:hAnsi="Arial Unicode MS"/>
+          <w:caps w:val="0"/>
+          <w:smallCaps w:val="0"/>
+          <w:strike w:val="0"/>
+          <w:dstrike w:val="0"/>
+          <w:outline w:val="0"/>
+          <w:emboss w:val="0"/>
+          <w:imprint w:val="0"/>
+          <w:spacing w:val="0"/>
+          <w:w w:val="100"/>
+          <w:kern w:val="0"/>
+          <w:position w:val="0"/>
+          <w:highlight w:val="none"/>
+          <w:vertAlign w:val="baseline"/>
+        </w:rPr>
+      </w:lvl>
+    </w:lvlOverride>
+    <w:lvlOverride w:ilvl="2">
+      <w:lvl w:ilvl="2">
+        <w:start w:val="1"/>
+        <w:numFmt w:val="bullet"/>
+        <w:suff w:val="tab"/>
+        <w:lvlText w:val="•"/>
+        <w:lvlJc w:val="left"/>
+        <w:pPr>
+          <w:tabs>
+            <w:tab w:val="left" w:pos="593"/>
+            <w:tab w:val="left" w:pos="1186"/>
+            <w:tab w:val="left" w:pos="1779"/>
+            <w:tab w:val="left" w:pos="2372"/>
+            <w:tab w:val="left" w:pos="2965"/>
+            <w:tab w:val="left" w:pos="3558"/>
+            <w:tab w:val="left" w:pos="4151"/>
+            <w:tab w:val="left" w:pos="4744"/>
+            <w:tab w:val="left" w:pos="5337"/>
+            <w:tab w:val="left" w:pos="5930"/>
+            <w:tab w:val="left" w:pos="6523"/>
+            <w:tab w:val="left" w:pos="7116"/>
+            <w:tab w:val="left" w:pos="7709"/>
+            <w:tab w:val="left" w:pos="8302"/>
+            <w:tab w:val="left" w:pos="8895"/>
+            <w:tab w:val="left" w:pos="9488"/>
+          </w:tabs>
+          <w:ind w:left="1358" w:hanging="158"/>
+        </w:pPr>
+        <w:rPr>
+          <w:rFonts w:hAnsi="Arial Unicode MS"/>
+          <w:caps w:val="0"/>
+          <w:smallCaps w:val="0"/>
+          <w:strike w:val="0"/>
+          <w:dstrike w:val="0"/>
+          <w:outline w:val="0"/>
+          <w:emboss w:val="0"/>
+          <w:imprint w:val="0"/>
+          <w:spacing w:val="0"/>
+          <w:w w:val="100"/>
+          <w:kern w:val="0"/>
+          <w:position w:val="0"/>
+          <w:highlight w:val="none"/>
+          <w:vertAlign w:val="baseline"/>
+        </w:rPr>
+      </w:lvl>
+    </w:lvlOverride>
+    <w:lvlOverride w:ilvl="3">
+      <w:lvl w:ilvl="3">
+        <w:start w:val="1"/>
+        <w:numFmt w:val="bullet"/>
+        <w:suff w:val="tab"/>
+        <w:lvlText w:val="•"/>
+        <w:lvlJc w:val="left"/>
+        <w:pPr>
+          <w:tabs>
+            <w:tab w:val="left" w:pos="593"/>
+            <w:tab w:val="left" w:pos="1186"/>
+            <w:tab w:val="left" w:pos="1779"/>
+            <w:tab w:val="left" w:pos="2372"/>
+            <w:tab w:val="left" w:pos="2965"/>
+            <w:tab w:val="left" w:pos="3558"/>
+            <w:tab w:val="left" w:pos="4151"/>
+            <w:tab w:val="left" w:pos="4744"/>
+            <w:tab w:val="left" w:pos="5337"/>
+            <w:tab w:val="left" w:pos="5930"/>
+            <w:tab w:val="left" w:pos="6523"/>
+            <w:tab w:val="left" w:pos="7116"/>
+            <w:tab w:val="left" w:pos="7709"/>
+            <w:tab w:val="left" w:pos="8302"/>
+            <w:tab w:val="left" w:pos="8895"/>
+            <w:tab w:val="left" w:pos="9488"/>
+          </w:tabs>
+          <w:ind w:left="1958" w:hanging="158"/>
+        </w:pPr>
+        <w:rPr>
+          <w:rFonts w:hAnsi="Arial Unicode MS"/>
+          <w:caps w:val="0"/>
+          <w:smallCaps w:val="0"/>
+          <w:strike w:val="0"/>
+          <w:dstrike w:val="0"/>
+          <w:outline w:val="0"/>
+          <w:emboss w:val="0"/>
+          <w:imprint w:val="0"/>
+          <w:spacing w:val="0"/>
+          <w:w w:val="100"/>
+          <w:kern w:val="0"/>
+          <w:position w:val="0"/>
+          <w:highlight w:val="none"/>
+          <w:vertAlign w:val="baseline"/>
+        </w:rPr>
+      </w:lvl>
+    </w:lvlOverride>
+    <w:lvlOverride w:ilvl="4">
+      <w:lvl w:ilvl="4">
+        <w:start w:val="1"/>
+        <w:numFmt w:val="bullet"/>
+        <w:suff w:val="tab"/>
+        <w:lvlText w:val="•"/>
+        <w:lvlJc w:val="left"/>
+        <w:pPr>
+          <w:tabs>
+            <w:tab w:val="left" w:pos="593"/>
+            <w:tab w:val="left" w:pos="1186"/>
+            <w:tab w:val="left" w:pos="1779"/>
+            <w:tab w:val="left" w:pos="2372"/>
+            <w:tab w:val="left" w:pos="2965"/>
+            <w:tab w:val="left" w:pos="3558"/>
+            <w:tab w:val="left" w:pos="4151"/>
+            <w:tab w:val="left" w:pos="4744"/>
+            <w:tab w:val="left" w:pos="5337"/>
+            <w:tab w:val="left" w:pos="5930"/>
+            <w:tab w:val="left" w:pos="6523"/>
+            <w:tab w:val="left" w:pos="7116"/>
+            <w:tab w:val="left" w:pos="7709"/>
+            <w:tab w:val="left" w:pos="8302"/>
+            <w:tab w:val="left" w:pos="8895"/>
+            <w:tab w:val="left" w:pos="9488"/>
+          </w:tabs>
+          <w:ind w:left="2558" w:hanging="158"/>
+        </w:pPr>
+        <w:rPr>
+          <w:rFonts w:hAnsi="Arial Unicode MS"/>
+          <w:caps w:val="0"/>
+          <w:smallCaps w:val="0"/>
+          <w:strike w:val="0"/>
+          <w:dstrike w:val="0"/>
+          <w:outline w:val="0"/>
+          <w:emboss w:val="0"/>
+          <w:imprint w:val="0"/>
+          <w:spacing w:val="0"/>
+          <w:w w:val="100"/>
+          <w:kern w:val="0"/>
+          <w:position w:val="0"/>
+          <w:highlight w:val="none"/>
+          <w:vertAlign w:val="baseline"/>
+        </w:rPr>
+      </w:lvl>
+    </w:lvlOverride>
+    <w:lvlOverride w:ilvl="5">
+      <w:lvl w:ilvl="5">
+        <w:start w:val="1"/>
+        <w:numFmt w:val="bullet"/>
+        <w:suff w:val="tab"/>
+        <w:lvlText w:val="•"/>
+        <w:lvlJc w:val="left"/>
+        <w:pPr>
+          <w:tabs>
+            <w:tab w:val="left" w:pos="593"/>
+            <w:tab w:val="left" w:pos="1186"/>
+            <w:tab w:val="left" w:pos="1779"/>
+            <w:tab w:val="left" w:pos="2372"/>
+            <w:tab w:val="left" w:pos="2965"/>
+            <w:tab w:val="left" w:pos="3558"/>
+            <w:tab w:val="left" w:pos="4151"/>
+            <w:tab w:val="left" w:pos="4744"/>
+            <w:tab w:val="left" w:pos="5337"/>
+            <w:tab w:val="left" w:pos="5930"/>
+            <w:tab w:val="left" w:pos="6523"/>
+            <w:tab w:val="left" w:pos="7116"/>
+            <w:tab w:val="left" w:pos="7709"/>
+            <w:tab w:val="left" w:pos="8302"/>
+            <w:tab w:val="left" w:pos="8895"/>
+            <w:tab w:val="left" w:pos="9488"/>
+          </w:tabs>
+          <w:ind w:left="3158" w:hanging="158"/>
+        </w:pPr>
+        <w:rPr>
+          <w:rFonts w:hAnsi="Arial Unicode MS"/>
+          <w:caps w:val="0"/>
+          <w:smallCaps w:val="0"/>
+          <w:strike w:val="0"/>
+          <w:dstrike w:val="0"/>
+          <w:outline w:val="0"/>
+          <w:emboss w:val="0"/>
+          <w:imprint w:val="0"/>
+          <w:spacing w:val="0"/>
+          <w:w w:val="100"/>
+          <w:kern w:val="0"/>
+          <w:position w:val="0"/>
+          <w:highlight w:val="none"/>
+          <w:vertAlign w:val="baseline"/>
+        </w:rPr>
+      </w:lvl>
+    </w:lvlOverride>
+    <w:lvlOverride w:ilvl="6">
+      <w:lvl w:ilvl="6">
+        <w:start w:val="1"/>
+        <w:numFmt w:val="bullet"/>
+        <w:suff w:val="tab"/>
+        <w:lvlText w:val="•"/>
+        <w:lvlJc w:val="left"/>
+        <w:pPr>
+          <w:tabs>
+            <w:tab w:val="left" w:pos="593"/>
+            <w:tab w:val="left" w:pos="1186"/>
+            <w:tab w:val="left" w:pos="1779"/>
+            <w:tab w:val="left" w:pos="2372"/>
+            <w:tab w:val="left" w:pos="2965"/>
+            <w:tab w:val="left" w:pos="3558"/>
+            <w:tab w:val="left" w:pos="4151"/>
+            <w:tab w:val="left" w:pos="4744"/>
+            <w:tab w:val="left" w:pos="5337"/>
+            <w:tab w:val="left" w:pos="5930"/>
+            <w:tab w:val="left" w:pos="6523"/>
+            <w:tab w:val="left" w:pos="7116"/>
+            <w:tab w:val="left" w:pos="7709"/>
+            <w:tab w:val="left" w:pos="8302"/>
+            <w:tab w:val="left" w:pos="8895"/>
+            <w:tab w:val="left" w:pos="9488"/>
+          </w:tabs>
+          <w:ind w:left="3758" w:hanging="158"/>
+        </w:pPr>
+        <w:rPr>
+          <w:rFonts w:hAnsi="Arial Unicode MS"/>
+          <w:caps w:val="0"/>
+          <w:smallCaps w:val="0"/>
+          <w:strike w:val="0"/>
+          <w:dstrike w:val="0"/>
+          <w:outline w:val="0"/>
+          <w:emboss w:val="0"/>
+          <w:imprint w:val="0"/>
+          <w:spacing w:val="0"/>
+          <w:w w:val="100"/>
+          <w:kern w:val="0"/>
+          <w:position w:val="0"/>
+          <w:highlight w:val="none"/>
+          <w:vertAlign w:val="baseline"/>
+        </w:rPr>
+      </w:lvl>
+    </w:lvlOverride>
+    <w:lvlOverride w:ilvl="7">
+      <w:lvl w:ilvl="7">
+        <w:start w:val="1"/>
+        <w:numFmt w:val="bullet"/>
+        <w:suff w:val="tab"/>
+        <w:lvlText w:val="•"/>
+        <w:lvlJc w:val="left"/>
+        <w:pPr>
+          <w:tabs>
+            <w:tab w:val="left" w:pos="593"/>
+            <w:tab w:val="left" w:pos="1186"/>
+            <w:tab w:val="left" w:pos="1779"/>
+            <w:tab w:val="left" w:pos="2372"/>
+            <w:tab w:val="left" w:pos="2965"/>
+            <w:tab w:val="left" w:pos="3558"/>
+            <w:tab w:val="left" w:pos="4151"/>
+            <w:tab w:val="left" w:pos="4744"/>
+            <w:tab w:val="left" w:pos="5337"/>
+            <w:tab w:val="left" w:pos="5930"/>
+            <w:tab w:val="left" w:pos="6523"/>
+            <w:tab w:val="left" w:pos="7116"/>
+            <w:tab w:val="left" w:pos="7709"/>
+            <w:tab w:val="left" w:pos="8302"/>
+            <w:tab w:val="left" w:pos="8895"/>
+            <w:tab w:val="left" w:pos="9488"/>
+          </w:tabs>
+          <w:ind w:left="4358" w:hanging="158"/>
+        </w:pPr>
+        <w:rPr>
+          <w:rFonts w:hAnsi="Arial Unicode MS"/>
+          <w:caps w:val="0"/>
+          <w:smallCaps w:val="0"/>
+          <w:strike w:val="0"/>
+          <w:dstrike w:val="0"/>
+          <w:outline w:val="0"/>
+          <w:emboss w:val="0"/>
+          <w:imprint w:val="0"/>
+          <w:spacing w:val="0"/>
+          <w:w w:val="100"/>
+          <w:kern w:val="0"/>
+          <w:position w:val="0"/>
+          <w:highlight w:val="none"/>
+          <w:vertAlign w:val="baseline"/>
+        </w:rPr>
+      </w:lvl>
+    </w:lvlOverride>
+    <w:lvlOverride w:ilvl="8">
+      <w:lvl w:ilvl="8">
+        <w:start w:val="1"/>
+        <w:numFmt w:val="bullet"/>
+        <w:suff w:val="tab"/>
+        <w:lvlText w:val="•"/>
+        <w:lvlJc w:val="left"/>
+        <w:pPr>
+          <w:tabs>
+            <w:tab w:val="left" w:pos="593"/>
+            <w:tab w:val="left" w:pos="1186"/>
+            <w:tab w:val="left" w:pos="1779"/>
+            <w:tab w:val="left" w:pos="2372"/>
+            <w:tab w:val="left" w:pos="2965"/>
+            <w:tab w:val="left" w:pos="3558"/>
+            <w:tab w:val="left" w:pos="4151"/>
+            <w:tab w:val="left" w:pos="4744"/>
+            <w:tab w:val="left" w:pos="5337"/>
+            <w:tab w:val="left" w:pos="5930"/>
+            <w:tab w:val="left" w:pos="6523"/>
+            <w:tab w:val="left" w:pos="7116"/>
+            <w:tab w:val="left" w:pos="7709"/>
+            <w:tab w:val="left" w:pos="8302"/>
+            <w:tab w:val="left" w:pos="8895"/>
+            <w:tab w:val="left" w:pos="9488"/>
+          </w:tabs>
+          <w:ind w:left="4958" w:hanging="158"/>
+        </w:pPr>
+        <w:rPr>
+          <w:rFonts w:hAnsi="Arial Unicode MS"/>
+          <w:caps w:val="0"/>
+          <w:smallCaps w:val="0"/>
+          <w:strike w:val="0"/>
+          <w:dstrike w:val="0"/>
+          <w:outline w:val="0"/>
+          <w:emboss w:val="0"/>
+          <w:imprint w:val="0"/>
+          <w:spacing w:val="0"/>
+          <w:w w:val="100"/>
+          <w:kern w:val="0"/>
+          <w:position w:val="0"/>
+          <w:highlight w:val="none"/>
+          <w:vertAlign w:val="baseline"/>
+        </w:rPr>
+      </w:lvl>
+    </w:lvlOverride>
+  </w:num>
+  <w:num w:numId="6">
     <w:abstractNumId w:val="0"/>
     <w:lvlOverride w:ilvl="0">
       <w:startOverride w:val="3"/>
@@ -5936,7 +9818,7 @@
       <w:outlineLvl w:val="9"/>
     </w:pPr>
     <w:rPr>
-      <w:rFonts w:ascii="Times New Roman" w:cs="Times New Roman" w:hAnsi="Times New Roman" w:eastAsia="Times New Roman"/>
+      <w:rFonts w:ascii="Times New Roman" w:cs="Arial Unicode MS" w:hAnsi="Times New Roman" w:eastAsia="Arial Unicode MS" w:hint="default"/>
       <w:b w:val="0"/>
       <w:bCs w:val="0"/>
       <w:i w:val="0"/>

</xml_diff>

<commit_message>
fix: Fix itallic and captions.
</commit_message>
<xml_diff>
--- a/МаркоЕрдељи_зборник.docx
+++ b/МаркоЕрдељи_зборник.docx
@@ -2819,13 +2819,13 @@
         <mc:AlternateContent>
           <mc:Choice Requires="wps">
             <w:drawing>
-              <wp:anchor distT="0" distB="0" distL="114300" distR="114300" simplePos="0" relativeHeight="251661312" behindDoc="0" locked="0" layoutInCell="1" allowOverlap="1" wp14:anchorId="7E3C499E" wp14:editId="29DB33EF">
+              <wp:anchor distT="0" distB="0" distL="114300" distR="114300" simplePos="0" relativeHeight="251661312" behindDoc="0" locked="0" layoutInCell="1" allowOverlap="1" wp14:anchorId="7E3C499E" wp14:editId="3315430D">
                 <wp:simplePos x="0" y="0"/>
                 <wp:positionH relativeFrom="column">
-                  <wp:posOffset>172085</wp:posOffset>
+                  <wp:posOffset>236220</wp:posOffset>
                 </wp:positionH>
                 <wp:positionV relativeFrom="paragraph">
-                  <wp:posOffset>1131062</wp:posOffset>
+                  <wp:posOffset>1032711</wp:posOffset>
                 </wp:positionV>
                 <wp:extent cx="5899150" cy="635"/>
                 <wp:effectExtent l="0" t="0" r="6350" b="0"/>
@@ -2856,20 +2856,6 @@
                           <w:p>
                             <w:pPr>
                               <w:pStyle w:val="Caption"/>
-                              <w:rPr>
-                                <w:rFonts w:eastAsia="Helvetica Neue" w:cs="Helvetica Neue"/>
-                                <w:sz w:val="20"/>
-                                <w:szCs w:val="20"/>
-                                <w:shd w:val="clear" w:color="auto" w:fill="FFFEFF"/>
-                                <w:lang w:val="pt-PT"/>
-                                <w14:textFill>
-                                  <w14:solidFill>
-                                    <w14:srgbClr w14:val="000000">
-                                      <w14:alpha w14:val="14999"/>
-                                    </w14:srgbClr>
-                                  </w14:solidFill>
-                                </w14:textFill>
-                              </w:rPr>
                             </w:pPr>
                             <w:proofErr w:type="spellStart"/>
                             <w:r>
@@ -2889,20 +2875,27 @@
                               <w:fldChar w:fldCharType="separate"/>
                             </w:r>
                             <w:r>
-                              <w:rPr>
-                                <w:noProof/>
-                              </w:rPr>
                               <w:t>1</w:t>
                             </w:r>
                             <w:r>
                               <w:fldChar w:fldCharType="end"/>
                             </w:r>
                             <w:r>
-                              <w:rPr>
-                                <w:lang w:val="sr-Cyrl-RS"/>
-                              </w:rPr>
-                              <w:t xml:space="preserve"> Архитектура система</w:t>
+                              <w:t xml:space="preserve"> </w:t>
                             </w:r>
+                            <w:proofErr w:type="spellStart"/>
+                            <w:r>
+                              <w:t>Архитектура</w:t>
+                            </w:r>
+                            <w:proofErr w:type="spellEnd"/>
+                            <w:r>
+                              <w:t xml:space="preserve"> </w:t>
+                            </w:r>
+                            <w:proofErr w:type="spellStart"/>
+                            <w:r>
+                              <w:t>система</w:t>
+                            </w:r>
+                            <w:proofErr w:type="spellEnd"/>
                           </w:p>
                         </w:txbxContent>
                       </wps:txbx>
@@ -2927,26 +2920,12 @@
                 <v:stroke joinstyle="miter"/>
                 <v:path gradientshapeok="t" o:connecttype="rect"/>
               </v:shapetype>
-              <v:shape id="Text Box 1" o:spid="_x0000_s1026" type="#_x0000_t202" style="position:absolute;left:0;text-align:left;margin-left:13.55pt;margin-top:89.05pt;width:464.5pt;height:.05pt;z-index:251661312;visibility:visible;mso-wrap-style:square;mso-width-percent:0;mso-wrap-distance-left:9pt;mso-wrap-distance-top:0;mso-wrap-distance-right:9pt;mso-wrap-distance-bottom:0;mso-position-horizontal:absolute;mso-position-horizontal-relative:text;mso-position-vertical:absolute;mso-position-vertical-relative:text;mso-width-percent:0;mso-width-relative:margin;v-text-anchor:top" o:gfxdata="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" stroked="f">
+              <v:shape id="Text Box 1" o:spid="_x0000_s1026" type="#_x0000_t202" style="position:absolute;left:0;text-align:left;margin-left:18.6pt;margin-top:81.3pt;width:464.5pt;height:.05pt;z-index:251661312;visibility:visible;mso-wrap-style:square;mso-width-percent:0;mso-wrap-distance-left:9pt;mso-wrap-distance-top:0;mso-wrap-distance-right:9pt;mso-wrap-distance-bottom:0;mso-position-horizontal:absolute;mso-position-horizontal-relative:text;mso-position-vertical:absolute;mso-position-vertical-relative:text;mso-width-percent:0;mso-width-relative:margin;v-text-anchor:top" o:gfxdata="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" stroked="f">
                 <v:textbox style="mso-fit-shape-to-text:t" inset="0,0,0,0">
                   <w:txbxContent>
                     <w:p>
                       <w:pPr>
                         <w:pStyle w:val="Caption"/>
-                        <w:rPr>
-                          <w:rFonts w:eastAsia="Helvetica Neue" w:cs="Helvetica Neue"/>
-                          <w:sz w:val="20"/>
-                          <w:szCs w:val="20"/>
-                          <w:shd w:val="clear" w:color="auto" w:fill="FFFEFF"/>
-                          <w:lang w:val="pt-PT"/>
-                          <w14:textFill>
-                            <w14:solidFill>
-                              <w14:srgbClr w14:val="000000">
-                                <w14:alpha w14:val="14999"/>
-                              </w14:srgbClr>
-                            </w14:solidFill>
-                          </w14:textFill>
-                        </w:rPr>
                       </w:pPr>
                       <w:proofErr w:type="spellStart"/>
                       <w:r>
@@ -2966,20 +2945,27 @@
                         <w:fldChar w:fldCharType="separate"/>
                       </w:r>
                       <w:r>
-                        <w:rPr>
-                          <w:noProof/>
-                        </w:rPr>
                         <w:t>1</w:t>
                       </w:r>
                       <w:r>
                         <w:fldChar w:fldCharType="end"/>
                       </w:r>
                       <w:r>
-                        <w:rPr>
-                          <w:lang w:val="sr-Cyrl-RS"/>
-                        </w:rPr>
-                        <w:t xml:space="preserve"> Архитектура система</w:t>
+                        <w:t xml:space="preserve"> </w:t>
                       </w:r>
+                      <w:proofErr w:type="spellStart"/>
+                      <w:r>
+                        <w:t>Архитектура</w:t>
+                      </w:r>
+                      <w:proofErr w:type="spellEnd"/>
+                      <w:r>
+                        <w:t xml:space="preserve"> </w:t>
+                      </w:r>
+                      <w:proofErr w:type="spellStart"/>
+                      <w:r>
+                        <w:t>система</w:t>
+                      </w:r>
+                      <w:proofErr w:type="spellEnd"/>
                     </w:p>
                   </w:txbxContent>
                 </v:textbox>
@@ -2991,6 +2977,65 @@
       </w:r>
       <w:r>
         <w:rPr>
+          <w:noProof/>
+        </w:rPr>
+        <w:drawing>
+          <wp:anchor distT="0" distB="0" distL="114300" distR="114300" simplePos="0" relativeHeight="251659264" behindDoc="0" locked="0" layoutInCell="1" allowOverlap="1" wp14:anchorId="149792A7" wp14:editId="41082582">
+            <wp:simplePos x="0" y="0"/>
+            <wp:positionH relativeFrom="column">
+              <wp:posOffset>174625</wp:posOffset>
+            </wp:positionH>
+            <wp:positionV relativeFrom="paragraph">
+              <wp:posOffset>1319530</wp:posOffset>
+            </wp:positionV>
+            <wp:extent cx="5965190" cy="4456430"/>
+            <wp:effectExtent l="0" t="0" r="3810" b="1270"/>
+            <wp:wrapSquare wrapText="bothSides"/>
+            <wp:docPr id="1662553341" name="arhitektura-sistema.png" descr="arhitektura-sistema.png"/>
+            <wp:cNvGraphicFramePr>
+              <a:graphicFrameLocks xmlns:a="http://schemas.openxmlformats.org/drawingml/2006/main" noChangeAspect="1"/>
+            </wp:cNvGraphicFramePr>
+            <a:graphic xmlns:a="http://schemas.openxmlformats.org/drawingml/2006/main">
+              <a:graphicData uri="http://schemas.openxmlformats.org/drawingml/2006/picture">
+                <pic:pic xmlns:pic="http://schemas.openxmlformats.org/drawingml/2006/picture">
+                  <pic:nvPicPr>
+                    <pic:cNvPr id="1662553341" name="arhitektura-sistema.png" descr="arhitektura-sistema.png"/>
+                    <pic:cNvPicPr>
+                      <a:picLocks noChangeAspect="1"/>
+                    </pic:cNvPicPr>
+                  </pic:nvPicPr>
+                  <pic:blipFill>
+                    <a:blip r:embed="rId10"/>
+                    <a:srcRect l="2002" r="2002"/>
+                    <a:stretch>
+                      <a:fillRect/>
+                    </a:stretch>
+                  </pic:blipFill>
+                  <pic:spPr>
+                    <a:xfrm>
+                      <a:off x="0" y="0"/>
+                      <a:ext cx="5965190" cy="4456430"/>
+                    </a:xfrm>
+                    <a:prstGeom prst="rect">
+                      <a:avLst/>
+                    </a:prstGeom>
+                    <a:ln w="12700" cap="flat">
+                      <a:noFill/>
+                      <a:miter lim="400000"/>
+                    </a:ln>
+                    <a:effectLst/>
+                  </pic:spPr>
+                </pic:pic>
+              </a:graphicData>
+            </a:graphic>
+            <wp14:sizeRelV relativeFrom="margin">
+              <wp14:pctHeight>0</wp14:pctHeight>
+            </wp14:sizeRelV>
+          </wp:anchor>
+        </w:drawing>
+      </w:r>
+      <w:r>
+        <w:rPr>
           <w:shd w:val="clear" w:color="auto" w:fill="FFFEFF"/>
           <w:lang w:val="pt-PT"/>
         </w:rPr>
@@ -3027,7 +3072,21 @@
         <w:rPr>
           <w:shd w:val="clear" w:color="auto" w:fill="FFFEFF"/>
         </w:rPr>
-        <w:t xml:space="preserve">парадигму, у којој агент </w:t>
+        <w:t xml:space="preserve">парадигму, у </w:t>
+      </w:r>
+      <w:proofErr w:type="spellStart"/>
+      <w:r>
+        <w:rPr>
+          <w:shd w:val="clear" w:color="auto" w:fill="FFFEFF"/>
+        </w:rPr>
+        <w:t>којој</w:t>
+      </w:r>
+      <w:proofErr w:type="spellEnd"/>
+      <w:r>
+        <w:rPr>
+          <w:shd w:val="clear" w:color="auto" w:fill="FFFEFF"/>
+        </w:rPr>
+        <w:t xml:space="preserve"> агент </w:t>
       </w:r>
       <w:proofErr w:type="spellStart"/>
       <w:r>
@@ -3111,7 +3170,21 @@
         <w:rPr>
           <w:shd w:val="clear" w:color="auto" w:fill="FFFEFF"/>
         </w:rPr>
-        <w:t xml:space="preserve"> кроз алате у </w:t>
+        <w:t xml:space="preserve"> </w:t>
+      </w:r>
+      <w:proofErr w:type="spellStart"/>
+      <w:r>
+        <w:rPr>
+          <w:shd w:val="clear" w:color="auto" w:fill="FFFEFF"/>
+        </w:rPr>
+        <w:t>кроз</w:t>
+      </w:r>
+      <w:proofErr w:type="spellEnd"/>
+      <w:r>
+        <w:rPr>
+          <w:shd w:val="clear" w:color="auto" w:fill="FFFEFF"/>
+        </w:rPr>
+        <w:t xml:space="preserve"> алате у </w:t>
       </w:r>
       <w:proofErr w:type="spellStart"/>
       <w:r>
@@ -3285,212 +3358,6 @@
           <w:shd w:val="clear" w:color="auto" w:fill="FFFEFF"/>
         </w:rPr>
         <w:t xml:space="preserve"> </w:t>
-      </w:r>
-      <w:r>
-        <w:rPr>
-          <w:rFonts w:eastAsia="Times New Roman" w:cs="Times New Roman"/>
-          <w:noProof/>
-          <w:shd w:val="clear" w:color="auto" w:fill="FFFEFF"/>
-        </w:rPr>
-        <mc:AlternateContent>
-          <mc:Choice Requires="wpg">
-            <w:drawing>
-              <wp:anchor distT="152400" distB="152400" distL="152400" distR="152400" simplePos="0" relativeHeight="251659264" behindDoc="0" locked="0" layoutInCell="1" allowOverlap="1" wp14:anchorId="3E572EAE" wp14:editId="21CA4BBD">
-                <wp:simplePos x="0" y="0"/>
-                <wp:positionH relativeFrom="margin">
-                  <wp:posOffset>175895</wp:posOffset>
-                </wp:positionH>
-                <wp:positionV relativeFrom="line">
-                  <wp:posOffset>301625</wp:posOffset>
-                </wp:positionV>
-                <wp:extent cx="6098540" cy="4406900"/>
-                <wp:effectExtent l="0" t="0" r="0" b="0"/>
-                <wp:wrapSquare wrapText="bothSides" distT="152400" distB="152400" distL="152400" distR="152400"/>
-                <wp:docPr id="1073741828" name="officeArt object" descr="Image Gallery"/>
-                <wp:cNvGraphicFramePr/>
-                <a:graphic xmlns:a="http://schemas.openxmlformats.org/drawingml/2006/main">
-                  <a:graphicData uri="http://schemas.microsoft.com/office/word/2010/wordprocessingGroup">
-                    <wpg:wgp>
-                      <wpg:cNvGrpSpPr/>
-                      <wpg:grpSpPr>
-                        <a:xfrm>
-                          <a:off x="0" y="0"/>
-                          <a:ext cx="6098540" cy="4406900"/>
-                          <a:chOff x="-122711" y="-1"/>
-                          <a:chExt cx="5630489" cy="4345776"/>
-                        </a:xfrm>
-                      </wpg:grpSpPr>
-                      <pic:pic xmlns:pic="http://schemas.openxmlformats.org/drawingml/2006/picture">
-                        <pic:nvPicPr>
-                          <pic:cNvPr id="1073741826" name="arhitektura-sistema.png" descr="arhitektura-sistema.png"/>
-                          <pic:cNvPicPr>
-                            <a:picLocks noChangeAspect="1"/>
-                          </pic:cNvPicPr>
-                        </pic:nvPicPr>
-                        <pic:blipFill>
-                          <a:blip r:embed="rId10"/>
-                          <a:srcRect l="2002" r="2002"/>
-                          <a:stretch>
-                            <a:fillRect/>
-                          </a:stretch>
-                        </pic:blipFill>
-                        <pic:spPr>
-                          <a:xfrm>
-                            <a:off x="-122711" y="325343"/>
-                            <a:ext cx="5507779" cy="4020432"/>
-                          </a:xfrm>
-                          <a:prstGeom prst="rect">
-                            <a:avLst/>
-                          </a:prstGeom>
-                          <a:ln w="12700" cap="flat">
-                            <a:noFill/>
-                            <a:miter lim="400000"/>
-                          </a:ln>
-                          <a:effectLst/>
-                        </pic:spPr>
-                      </pic:pic>
-                      <wps:wsp>
-                        <wps:cNvPr id="1073741827" name="Слика 1 Архитектура система"/>
-                        <wps:cNvSpPr txBox="1"/>
-                        <wps:spPr>
-                          <a:xfrm>
-                            <a:off x="-1" y="-1"/>
-                            <a:ext cx="5507779" cy="223746"/>
-                          </a:xfrm>
-                          <a:prstGeom prst="rect">
-                            <a:avLst/>
-                          </a:prstGeom>
-                          <a:noFill/>
-                          <a:ln w="12700" cap="flat">
-                            <a:noFill/>
-                            <a:miter lim="400000"/>
-                          </a:ln>
-                          <a:effectLst/>
-                        </wps:spPr>
-                        <wps:txbx>
-                          <w:txbxContent>
-                            <w:p>
-                              <w:pPr>
-                                <w:pStyle w:val="Caption"/>
-                                <w:suppressAutoHyphens/>
-                              </w:pPr>
-                              <w:proofErr w:type="spellStart"/>
-                              <w:r>
-                                <w:t>Слика</w:t>
-                              </w:r>
-                              <w:proofErr w:type="spellEnd"/>
-                              <w:r>
-                                <w:t xml:space="preserve"> </w:t>
-                              </w:r>
-                              <w:r>
-                                <w:rPr>
-                                  <w:lang w:val="ru-RU"/>
-                                </w:rPr>
-                                <w:t xml:space="preserve">1 </w:t>
-                              </w:r>
-                              <w:proofErr w:type="spellStart"/>
-                              <w:r>
-                                <w:t>Архитектура</w:t>
-                              </w:r>
-                              <w:proofErr w:type="spellEnd"/>
-                              <w:r>
-                                <w:t xml:space="preserve"> </w:t>
-                              </w:r>
-                              <w:proofErr w:type="spellStart"/>
-                              <w:r>
-                                <w:t>система</w:t>
-                              </w:r>
-                              <w:proofErr w:type="spellEnd"/>
-                            </w:p>
-                          </w:txbxContent>
-                        </wps:txbx>
-                        <wps:bodyPr wrap="square" lIns="50800" tIns="50800" rIns="50800" bIns="50800" numCol="1" anchor="t">
-                          <a:noAutofit/>
-                        </wps:bodyPr>
-                      </wps:wsp>
-                    </wpg:wgp>
-                  </a:graphicData>
-                </a:graphic>
-                <wp14:sizeRelH relativeFrom="margin">
-                  <wp14:pctWidth>0</wp14:pctWidth>
-                </wp14:sizeRelH>
-                <wp14:sizeRelV relativeFrom="margin">
-                  <wp14:pctHeight>0</wp14:pctHeight>
-                </wp14:sizeRelV>
-              </wp:anchor>
-            </w:drawing>
-          </mc:Choice>
-          <mc:Fallback>
-            <w:pict>
-              <v:group w14:anchorId="3E572EAE" id="officeArt object" o:spid="_x0000_s1027" alt="Image Gallery" style="position:absolute;left:0;text-align:left;margin-left:13.85pt;margin-top:23.75pt;width:480.2pt;height:347pt;z-index:251659264;mso-wrap-distance-left:12pt;mso-wrap-distance-top:12pt;mso-wrap-distance-right:12pt;mso-wrap-distance-bottom:12pt;mso-position-horizontal-relative:margin;mso-position-vertical-relative:line;mso-width-relative:margin;mso-height-relative:margin" coordorigin="-1227" coordsize="56304,43457" o:gfxdata="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">
-                <v:shapetype id="_x0000_t75" coordsize="21600,21600" o:spt="75" o:preferrelative="t" path="m@4@5l@4@11@9@11@9@5xe" filled="f" stroked="f">
-                  <v:stroke joinstyle="miter"/>
-                  <v:formulas>
-                    <v:f eqn="if lineDrawn pixelLineWidth 0"/>
-                    <v:f eqn="sum @0 1 0"/>
-                    <v:f eqn="sum 0 0 @1"/>
-                    <v:f eqn="prod @2 1 2"/>
-                    <v:f eqn="prod @3 21600 pixelWidth"/>
-                    <v:f eqn="prod @3 21600 pixelHeight"/>
-                    <v:f eqn="sum @0 0 1"/>
-                    <v:f eqn="prod @6 1 2"/>
-                    <v:f eqn="prod @7 21600 pixelWidth"/>
-                    <v:f eqn="sum @8 21600 0"/>
-                    <v:f eqn="prod @7 21600 pixelHeight"/>
-                    <v:f eqn="sum @10 21600 0"/>
-                  </v:formulas>
-                  <v:path o:extrusionok="f" gradientshapeok="t" o:connecttype="rect"/>
-                  <o:lock v:ext="edit" aspectratio="t"/>
-                </v:shapetype>
-                <v:shape id="arhitektura-sistema.png" o:spid="_x0000_s1028" type="#_x0000_t75" alt="arhitektura-sistema.png" style="position:absolute;left:-1227;top:3253;width:55077;height:40204;visibility:visible;mso-wrap-style:square" o:gfxdata="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" strokeweight="1pt">
-                  <v:stroke miterlimit="4"/>
-                  <v:imagedata r:id="rId11" o:title="arhitektura-sistema" cropleft="1312f" cropright="1312f"/>
-                </v:shape>
-                <v:shape id="Слика 1 Архитектура система" o:spid="_x0000_s1029" type="#_x0000_t202" style="position:absolute;width:55077;height:2237;visibility:visible;mso-wrap-style:square;v-text-anchor:top" o:gfxdata="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" filled="f" stroked="f" strokeweight="1pt">
-                  <v:stroke miterlimit="4"/>
-                  <v:textbox inset="4pt,4pt,4pt,4pt">
-                    <w:txbxContent>
-                      <w:p>
-                        <w:pPr>
-                          <w:pStyle w:val="Caption"/>
-                          <w:suppressAutoHyphens/>
-                        </w:pPr>
-                        <w:proofErr w:type="spellStart"/>
-                        <w:r>
-                          <w:t>Слика</w:t>
-                        </w:r>
-                        <w:proofErr w:type="spellEnd"/>
-                        <w:r>
-                          <w:t xml:space="preserve"> </w:t>
-                        </w:r>
-                        <w:r>
-                          <w:rPr>
-                            <w:lang w:val="ru-RU"/>
-                          </w:rPr>
-                          <w:t xml:space="preserve">1 </w:t>
-                        </w:r>
-                        <w:proofErr w:type="spellStart"/>
-                        <w:r>
-                          <w:t>Архитектура</w:t>
-                        </w:r>
-                        <w:proofErr w:type="spellEnd"/>
-                        <w:r>
-                          <w:t xml:space="preserve"> </w:t>
-                        </w:r>
-                        <w:proofErr w:type="spellStart"/>
-                        <w:r>
-                          <w:t>система</w:t>
-                        </w:r>
-                        <w:proofErr w:type="spellEnd"/>
-                      </w:p>
-                    </w:txbxContent>
-                  </v:textbox>
-                </v:shape>
-                <w10:wrap type="square" anchorx="margin" anchory="line"/>
-              </v:group>
-            </w:pict>
-          </mc:Fallback>
-        </mc:AlternateContent>
       </w:r>
       <w:proofErr w:type="spellStart"/>
       <w:r>
@@ -6016,13 +5883,8 @@
           </w:tcPr>
           <w:p>
             <w:pPr>
-              <w:tabs>
-                <w:tab w:val="left" w:pos="1440"/>
-                <w:tab w:val="left" w:pos="2880"/>
-                <w:tab w:val="left" w:pos="4320"/>
-              </w:tabs>
-              <w:suppressAutoHyphens/>
-              <w:outlineLvl w:val="0"/>
+              <w:pStyle w:val="Caption"/>
+              <w:jc w:val="left"/>
               <w:rPr>
                 <w:lang w:val="ru-RU"/>
               </w:rPr>
@@ -6030,111 +5892,58 @@
             <w:proofErr w:type="spellStart"/>
             <w:r>
               <w:rPr>
-                <w:rFonts w:eastAsia="Times New Roman"/>
-                <w:color w:val="000000"/>
-                <w:sz w:val="18"/>
-                <w:szCs w:val="18"/>
+                <w:rFonts w:cs="Times New Roman"/>
+                <w:spacing w:val="0"/>
                 <w:lang w:val="ru-RU"/>
-                <w14:textOutline w14:w="12700" w14:cap="flat" w14:cmpd="sng" w14:algn="ctr">
-                  <w14:noFill/>
-                  <w14:prstDash w14:val="solid"/>
-                  <w14:miter w14:lim="400000"/>
-                </w14:textOutline>
               </w:rPr>
               <w:t>Табела</w:t>
             </w:r>
             <w:proofErr w:type="spellEnd"/>
             <w:r>
               <w:rPr>
-                <w:rFonts w:eastAsia="Times New Roman"/>
-                <w:color w:val="000000"/>
-                <w:sz w:val="18"/>
-                <w:szCs w:val="18"/>
+                <w:rFonts w:cs="Times New Roman"/>
+                <w:spacing w:val="0"/>
                 <w:lang w:val="ru-RU"/>
-                <w14:textOutline w14:w="12700" w14:cap="flat" w14:cmpd="sng" w14:algn="ctr">
-                  <w14:noFill/>
-                  <w14:prstDash w14:val="solid"/>
-                  <w14:miter w14:lim="400000"/>
-                </w14:textOutline>
               </w:rPr>
               <w:t xml:space="preserve"> 1. </w:t>
             </w:r>
             <w:r>
               <w:rPr>
-                <w:rFonts w:eastAsia="Times New Roman"/>
-                <w:color w:val="000000"/>
-                <w:sz w:val="18"/>
-                <w:szCs w:val="18"/>
                 <w:lang w:val="ru-RU"/>
-                <w14:textOutline w14:w="12700" w14:cap="flat" w14:cmpd="sng" w14:algn="ctr">
-                  <w14:noFill/>
-                  <w14:prstDash w14:val="solid"/>
-                  <w14:miter w14:lim="400000"/>
-                </w14:textOutline>
               </w:rPr>
-              <w:t xml:space="preserve">Стопа успеха (стопа </w:t>
+              <w:t xml:space="preserve">Стопа успеха </w:t>
+            </w:r>
+            <w:r>
+              <w:rPr>
+                <w:lang w:val="ru-RU"/>
+              </w:rPr>
+              <w:t>(</w:t>
             </w:r>
             <w:proofErr w:type="spellStart"/>
             <w:r>
               <w:rPr>
-                <w:rFonts w:eastAsia="Times New Roman"/>
-                <w:color w:val="000000"/>
-                <w:sz w:val="18"/>
-                <w:szCs w:val="18"/>
                 <w:lang w:val="ru-RU"/>
-                <w14:textOutline w14:w="12700" w14:cap="flat" w14:cmpd="sng" w14:algn="ctr">
-                  <w14:noFill/>
-                  <w14:prstDash w14:val="solid"/>
-                  <w14:miter w14:lim="400000"/>
-                </w14:textOutline>
               </w:rPr>
               <w:t>нарушавања</w:t>
             </w:r>
             <w:proofErr w:type="spellEnd"/>
             <w:r>
               <w:rPr>
-                <w:rFonts w:eastAsia="Times New Roman"/>
-                <w:color w:val="000000"/>
-                <w:sz w:val="18"/>
-                <w:szCs w:val="18"/>
                 <w:lang w:val="ru-RU"/>
-                <w14:textOutline w14:w="12700" w14:cap="flat" w14:cmpd="sng" w14:algn="ctr">
-                  <w14:noFill/>
-                  <w14:prstDash w14:val="solid"/>
-                  <w14:miter w14:lim="400000"/>
-                </w14:textOutline>
               </w:rPr>
               <w:t xml:space="preserve"> </w:t>
             </w:r>
             <w:proofErr w:type="spellStart"/>
             <w:r>
               <w:rPr>
-                <w:rFonts w:eastAsia="Times New Roman"/>
-                <w:color w:val="000000"/>
-                <w:sz w:val="18"/>
-                <w:szCs w:val="18"/>
                 <w:lang w:val="ru-RU"/>
-                <w14:textOutline w14:w="12700" w14:cap="flat" w14:cmpd="sng" w14:algn="ctr">
-                  <w14:noFill/>
-                  <w14:prstDash w14:val="solid"/>
-                  <w14:miter w14:lim="400000"/>
-                </w14:textOutline>
               </w:rPr>
               <w:t>изолације</w:t>
             </w:r>
             <w:proofErr w:type="spellEnd"/>
             <w:r>
               <w:rPr>
-                <w:rFonts w:eastAsia="Times New Roman"/>
-                <w:color w:val="000000"/>
-                <w:sz w:val="18"/>
-                <w:szCs w:val="18"/>
                 <w:lang w:val="ru-RU"/>
-                <w14:textOutline w14:w="12700" w14:cap="flat" w14:cmpd="sng" w14:algn="ctr">
-                  <w14:noFill/>
-                  <w14:prstDash w14:val="solid"/>
-                  <w14:miter w14:lim="400000"/>
-                </w14:textOutline>
               </w:rPr>
               <w:t>)</w:t>
             </w:r>
@@ -7484,57 +7293,70 @@
     </w:p>
     <w:p>
       <w:pPr>
-        <w:pStyle w:val="Default"/>
-        <w:tabs>
-          <w:tab w:val="left" w:pos="593"/>
-          <w:tab w:val="left" w:pos="1186"/>
-          <w:tab w:val="left" w:pos="1779"/>
-          <w:tab w:val="left" w:pos="2372"/>
-          <w:tab w:val="left" w:pos="2965"/>
-          <w:tab w:val="left" w:pos="3558"/>
-          <w:tab w:val="left" w:pos="4151"/>
-          <w:tab w:val="left" w:pos="4744"/>
-          <w:tab w:val="left" w:pos="5337"/>
-          <w:tab w:val="left" w:pos="5930"/>
-          <w:tab w:val="left" w:pos="6523"/>
-          <w:tab w:val="left" w:pos="7116"/>
-          <w:tab w:val="left" w:pos="7709"/>
-          <w:tab w:val="left" w:pos="8302"/>
-          <w:tab w:val="left" w:pos="8895"/>
-          <w:tab w:val="left" w:pos="9488"/>
-        </w:tabs>
-        <w:suppressAutoHyphens/>
-        <w:spacing w:before="0" w:line="240" w:lineRule="auto"/>
-        <w:rPr>
-          <w:rFonts w:ascii="Times New Roman" w:eastAsia="Times New Roman" w:hAnsi="Times New Roman" w:cs="Times New Roman"/>
-          <w:sz w:val="20"/>
-          <w:szCs w:val="20"/>
-          <w:shd w:val="clear" w:color="auto" w:fill="FFFEFF"/>
-          <w14:textFill>
-            <w14:solidFill>
-              <w14:srgbClr w14:val="000000">
-                <w14:alpha w14:val="14999"/>
-              </w14:srgbClr>
-            </w14:solidFill>
-          </w14:textFill>
+        <w:pStyle w:val="0-"/>
+        <w:rPr>
+          <w:shd w:val="clear" w:color="auto" w:fill="FFFEFF"/>
+          <w:lang w:val="en-US"/>
         </w:rPr>
       </w:pPr>
       <w:r>
         <w:rPr>
-          <w:rFonts w:ascii="Times New Roman" w:hAnsi="Times New Roman"/>
-          <w:sz w:val="20"/>
-          <w:szCs w:val="20"/>
-          <w:shd w:val="clear" w:color="auto" w:fill="FFFEFF"/>
-          <w14:textFill>
-            <w14:solidFill>
-              <w14:srgbClr w14:val="000000">
-                <w14:alpha w14:val="14999"/>
-              </w14:srgbClr>
-            </w14:solidFill>
-          </w14:textFill>
-        </w:rPr>
-        <w:t>Табела 2 приказује збирне стопе по моделу преко свих сценарија.</w:t>
-      </w:r>
+          <w:shd w:val="clear" w:color="auto" w:fill="FFFEFF"/>
+        </w:rPr>
+        <w:t xml:space="preserve">Табела 2 приказује збирне стопе по </w:t>
+      </w:r>
+      <w:proofErr w:type="spellStart"/>
+      <w:r>
+        <w:rPr>
+          <w:shd w:val="clear" w:color="auto" w:fill="FFFEFF"/>
+        </w:rPr>
+        <w:t>моделу</w:t>
+      </w:r>
+      <w:proofErr w:type="spellEnd"/>
+      <w:r>
+        <w:rPr>
+          <w:shd w:val="clear" w:color="auto" w:fill="FFFEFF"/>
+        </w:rPr>
+        <w:t xml:space="preserve"> </w:t>
+      </w:r>
+      <w:proofErr w:type="spellStart"/>
+      <w:r>
+        <w:rPr>
+          <w:shd w:val="clear" w:color="auto" w:fill="FFFEFF"/>
+        </w:rPr>
+        <w:t>преко</w:t>
+      </w:r>
+      <w:proofErr w:type="spellEnd"/>
+      <w:r>
+        <w:rPr>
+          <w:shd w:val="clear" w:color="auto" w:fill="FFFEFF"/>
+        </w:rPr>
+        <w:t xml:space="preserve"> свих </w:t>
+      </w:r>
+      <w:proofErr w:type="spellStart"/>
+      <w:r>
+        <w:rPr>
+          <w:shd w:val="clear" w:color="auto" w:fill="FFFEFF"/>
+        </w:rPr>
+        <w:t>сценарија</w:t>
+      </w:r>
+      <w:proofErr w:type="spellEnd"/>
+      <w:r>
+        <w:rPr>
+          <w:shd w:val="clear" w:color="auto" w:fill="FFFEFF"/>
+        </w:rPr>
+        <w:t>.</w:t>
+      </w:r>
+    </w:p>
+    <w:p>
+      <w:pPr>
+        <w:pStyle w:val="0-"/>
+        <w:rPr>
+          <w:rFonts w:eastAsia="Times New Roman" w:cs="Times New Roman"/>
+          <w:shd w:val="clear" w:color="auto" w:fill="FFFEFF"/>
+          <w:lang w:val="en-US"/>
+        </w:rPr>
+      </w:pPr>
     </w:p>
     <w:tbl>
       <w:tblPr>
@@ -7582,35 +7404,53 @@
           </w:tcPr>
           <w:p>
             <w:pPr>
-              <w:tabs>
-                <w:tab w:val="left" w:pos="1440"/>
-                <w:tab w:val="left" w:pos="2880"/>
-                <w:tab w:val="left" w:pos="4320"/>
-                <w:tab w:val="left" w:pos="5760"/>
-                <w:tab w:val="left" w:pos="7200"/>
-                <w:tab w:val="left" w:pos="8640"/>
-              </w:tabs>
-              <w:suppressAutoHyphens/>
-              <w:outlineLvl w:val="0"/>
-              <w:rPr>
-                <w:lang w:val="en-RS"/>
-              </w:rPr>
+              <w:pStyle w:val="Caption"/>
             </w:pPr>
+            <w:bookmarkStart w:id="0" w:name="_Ref238810798"/>
+            <w:proofErr w:type="spellStart"/>
             <w:r>
-              <w:rPr>
-                <w:rFonts w:eastAsia="Times New Roman"/>
-                <w:color w:val="000000"/>
-                <w:sz w:val="18"/>
-                <w:szCs w:val="18"/>
-                <w:lang w:val="en-RS"/>
-                <w14:textOutline w14:w="12700" w14:cap="flat" w14:cmpd="sng" w14:algn="ctr">
-                  <w14:noFill/>
-                  <w14:prstDash w14:val="solid"/>
-                  <w14:miter w14:lim="400000"/>
-                </w14:textOutline>
-              </w:rPr>
-              <w:t>Табела 2. Збирне стопе по моделу</w:t>
+              <w:t>Табела</w:t>
             </w:r>
+            <w:proofErr w:type="spellEnd"/>
+            <w:r>
+              <w:t xml:space="preserve"> </w:t>
+            </w:r>
+            <w:bookmarkEnd w:id="0"/>
+            <w:r>
+              <w:t>2</w:t>
+            </w:r>
+            <w:r>
+              <w:t xml:space="preserve"> </w:t>
+            </w:r>
+            <w:proofErr w:type="spellStart"/>
+            <w:r>
+              <w:t>Збирне</w:t>
+            </w:r>
+            <w:proofErr w:type="spellEnd"/>
+            <w:r>
+              <w:t xml:space="preserve"> </w:t>
+            </w:r>
+            <w:proofErr w:type="spellStart"/>
+            <w:r>
+              <w:t>стопе</w:t>
+            </w:r>
+            <w:proofErr w:type="spellEnd"/>
+            <w:r>
+              <w:t xml:space="preserve"> </w:t>
+            </w:r>
+            <w:proofErr w:type="spellStart"/>
+            <w:r>
+              <w:t>по</w:t>
+            </w:r>
+            <w:proofErr w:type="spellEnd"/>
+            <w:r>
+              <w:t xml:space="preserve"> </w:t>
+            </w:r>
+            <w:proofErr w:type="spellStart"/>
+            <w:r>
+              <w:t>моделу</w:t>
+            </w:r>
+            <w:proofErr w:type="spellEnd"/>
           </w:p>
         </w:tc>
       </w:tr>
@@ -8033,6 +7873,127 @@
           </w:p>
         </w:tc>
       </w:tr>
+      <w:tr>
+        <w:tblPrEx>
+          <w:shd w:val="clear" w:color="auto" w:fill="000000"/>
+        </w:tblPrEx>
+        <w:trPr>
+          <w:trHeight w:val="460"/>
+        </w:trPr>
+        <w:tc>
+          <w:tcPr>
+            <w:tcW w:w="1134" w:type="dxa"/>
+            <w:tcBorders>
+              <w:top w:val="single" w:sz="8" w:space="0" w:color="000000"/>
+              <w:left w:val="single" w:sz="8" w:space="0" w:color="000000"/>
+              <w:bottom w:val="single" w:sz="8" w:space="0" w:color="000000"/>
+              <w:right w:val="single" w:sz="8" w:space="0" w:color="000000"/>
+            </w:tcBorders>
+            <w:shd w:val="clear" w:color="auto" w:fill="FFFFFF"/>
+            <w:tcMar>
+              <w:top w:w="0" w:type="dxa"/>
+              <w:left w:w="0" w:type="dxa"/>
+              <w:bottom w:w="0" w:type="dxa"/>
+              <w:right w:w="0" w:type="dxa"/>
+            </w:tcMar>
+            <w:vAlign w:val="center"/>
+          </w:tcPr>
+          <w:p>
+            <w:pPr>
+              <w:pStyle w:val="0-"/>
+              <w:jc w:val="center"/>
+              <w:rPr>
+                <w:shd w:val="clear" w:color="auto" w:fill="FFFEFF"/>
+              </w:rPr>
+            </w:pPr>
+            <w:proofErr w:type="spellStart"/>
+            <w:r>
+              <w:rPr>
+                <w:b/>
+                <w:bCs/>
+                <w:shd w:val="clear" w:color="auto" w:fill="FFFEFF"/>
+              </w:rPr>
+              <w:t>Укупно</w:t>
+            </w:r>
+            <w:proofErr w:type="spellEnd"/>
+          </w:p>
+        </w:tc>
+        <w:tc>
+          <w:tcPr>
+            <w:tcW w:w="1701" w:type="dxa"/>
+            <w:tcBorders>
+              <w:top w:val="single" w:sz="8" w:space="0" w:color="000000"/>
+              <w:left w:val="single" w:sz="8" w:space="0" w:color="000000"/>
+              <w:bottom w:val="single" w:sz="8" w:space="0" w:color="000000"/>
+              <w:right w:val="single" w:sz="8" w:space="0" w:color="000000"/>
+            </w:tcBorders>
+            <w:shd w:val="clear" w:color="auto" w:fill="FFFFFF"/>
+            <w:tcMar>
+              <w:top w:w="0" w:type="dxa"/>
+              <w:left w:w="0" w:type="dxa"/>
+              <w:bottom w:w="0" w:type="dxa"/>
+              <w:right w:w="0" w:type="dxa"/>
+            </w:tcMar>
+            <w:vAlign w:val="center"/>
+          </w:tcPr>
+          <w:p>
+            <w:pPr>
+              <w:pStyle w:val="0-"/>
+              <w:jc w:val="center"/>
+              <w:rPr>
+                <w:b/>
+                <w:bCs/>
+                <w:shd w:val="clear" w:color="auto" w:fill="FFFEFF"/>
+              </w:rPr>
+            </w:pPr>
+            <w:r>
+              <w:rPr>
+                <w:b/>
+                <w:bCs/>
+                <w:shd w:val="clear" w:color="auto" w:fill="FFFEFF"/>
+              </w:rPr>
+              <w:t>48,7% (19/39)</w:t>
+            </w:r>
+          </w:p>
+        </w:tc>
+        <w:tc>
+          <w:tcPr>
+            <w:tcW w:w="1843" w:type="dxa"/>
+            <w:gridSpan w:val="2"/>
+            <w:tcBorders>
+              <w:top w:val="single" w:sz="8" w:space="0" w:color="000000"/>
+              <w:left w:val="single" w:sz="8" w:space="0" w:color="000000"/>
+              <w:bottom w:val="single" w:sz="8" w:space="0" w:color="000000"/>
+              <w:right w:val="single" w:sz="8" w:space="0" w:color="000000"/>
+            </w:tcBorders>
+            <w:shd w:val="clear" w:color="auto" w:fill="FFFFFF"/>
+            <w:tcMar>
+              <w:top w:w="0" w:type="dxa"/>
+              <w:left w:w="0" w:type="dxa"/>
+              <w:bottom w:w="0" w:type="dxa"/>
+              <w:right w:w="0" w:type="dxa"/>
+            </w:tcMar>
+            <w:vAlign w:val="center"/>
+          </w:tcPr>
+          <w:p>
+            <w:pPr>
+              <w:pStyle w:val="0-"/>
+              <w:jc w:val="center"/>
+              <w:rPr>
+                <w:b/>
+                <w:bCs/>
+              </w:rPr>
+            </w:pPr>
+            <w:r>
+              <w:rPr>
+                <w:b/>
+                <w:bCs/>
+              </w:rPr>
+              <w:t>59,0% (23/39)</w:t>
+            </w:r>
+          </w:p>
+        </w:tc>
+      </w:tr>
     </w:tbl>
     <w:p>
       <w:pPr>
@@ -8771,7 +8732,14 @@
         <w:rPr>
           <w:shd w:val="clear" w:color="auto" w:fill="FFFEFF"/>
         </w:rPr>
-        <w:t xml:space="preserve"> 52 за Sonnet. Сва три неуспеха модела Opus </w:t>
+        <w:t xml:space="preserve"> 52 за Sonnet. Сва три </w:t>
+      </w:r>
+      <w:r>
+        <w:rPr>
+          <w:shd w:val="clear" w:color="auto" w:fill="FFFEFF"/>
+        </w:rPr>
+        <w:lastRenderedPageBreak/>
+        <w:t xml:space="preserve">неуспеха модела Opus </w:t>
       </w:r>
       <w:proofErr w:type="spellStart"/>
       <w:r>
@@ -8989,7 +8957,6 @@
       </w:r>
       <w:proofErr w:type="spellStart"/>
       <w:r>
-        <w:lastRenderedPageBreak/>
         <w:t>постаје</w:t>
       </w:r>
       <w:proofErr w:type="spellEnd"/>
@@ -10498,19 +10465,14 @@
       </w:r>
       <w:proofErr w:type="spellStart"/>
       <w:r>
-        <w:t>Annual</w:t>
-      </w:r>
-      <w:proofErr w:type="spellEnd"/>
-      <w:r>
-        <w:t xml:space="preserve"> </w:t>
-      </w:r>
-      <w:proofErr w:type="spellStart"/>
-      <w:r>
-        <w:t>Computer</w:t>
-      </w:r>
-      <w:proofErr w:type="spellEnd"/>
-      <w:r>
-        <w:t xml:space="preserve"> </w:t>
+        <w:t xml:space="preserve">Annual </w:t>
+      </w:r>
+      <w:r>
+        <w:t>Compute</w:t>
+      </w:r>
+      <w:proofErr w:type="spellEnd"/>
+      <w:r>
+        <w:t xml:space="preserve">r </w:t>
       </w:r>
       <w:proofErr w:type="spellStart"/>
       <w:r>
@@ -11241,7 +11203,7 @@
       <w:r>
         <w:t xml:space="preserve">," 2024. </w:t>
       </w:r>
-      <w:hyperlink r:id="rId12" w:history="1">
+      <w:hyperlink r:id="rId11" w:history="1">
         <w:r>
           <w:rPr>
             <w:rStyle w:val="Hyperlink"/>
@@ -11316,7 +11278,7 @@
       <w:r>
         <w:t xml:space="preserve"> (CVE-2022-0847)," 2022. </w:t>
       </w:r>
-      <w:hyperlink r:id="rId13" w:history="1">
+      <w:hyperlink r:id="rId12" w:history="1">
         <w:r>
           <w:rPr>
             <w:rStyle w:val="Hyperlink"/>
@@ -11527,7 +11489,7 @@
                           </pic:cNvPicPr>
                         </pic:nvPicPr>
                         <pic:blipFill>
-                          <a:blip r:embed="rId14"/>
+                          <a:blip r:embed="rId13"/>
                           <a:srcRect/>
                           <a:stretch>
                             <a:fillRect/>
@@ -11570,7 +11532,22 @@
               <w:t xml:space="preserve"> </w:t>
             </w:r>
             <w:r>
-              <w:t>рођен је 2001. године у Новом Саду. Основне академске студије завршио је 2024. године на Факултету техничких наука у Новом Саду, на студијском програму Софтверско инжењерство и информационе технологије. Мастер рад на истом студијском програму одбранио је 2026. године.</w:t>
+              <w:t>рођен је 2001. године у Новом Саду. Основне академске студије завршио је 2024. године на Факултету техничких наука у Новом Саду</w:t>
+            </w:r>
+            <w:r>
+              <w:rPr>
+                <w:lang w:val="sr-Cyrl-RS"/>
+              </w:rPr>
+              <w:t>. Положио је све испите предвиђене планом и програмом</w:t>
+            </w:r>
+            <w:r>
+              <w:rPr>
+                <w:lang w:val="sr-Cyrl-RS"/>
+              </w:rPr>
+              <w:t xml:space="preserve"> и стекао услов за одбрану мастер рада</w:t>
+            </w:r>
+            <w:r>
+              <w:t xml:space="preserve"> на студијском програму Софтверско инжењерство и информационе технологије. </w:t>
             </w:r>
           </w:p>
           <w:p>
@@ -11588,11 +11565,12 @@
             <w:r>
               <w:t xml:space="preserve">: </w:t>
             </w:r>
-            <w:hyperlink r:id="rId15" w:history="1">
+            <w:hyperlink r:id="rId14" w:history="1">
               <w:r>
                 <w:rPr>
                   <w:rStyle w:val="Hyperlink1"/>
                   <w:rFonts w:eastAsia="Arial Unicode MS"/>
+                  <w:lang w:val="en-RS"/>
                 </w:rPr>
                 <w:t>erdeljimarko</w:t>
               </w:r>
@@ -11600,6 +11578,7 @@
                 <w:rPr>
                   <w:rStyle w:val="Hyperlink1"/>
                   <w:rFonts w:eastAsia="Arial Unicode MS"/>
+                  <w:lang w:val="en-RS"/>
                 </w:rPr>
                 <w:t>@</w:t>
               </w:r>
@@ -11607,6 +11586,7 @@
                 <w:rPr>
                   <w:rStyle w:val="Hyperlink1"/>
                   <w:rFonts w:eastAsia="Arial Unicode MS"/>
+                  <w:lang w:val="en-RS"/>
                 </w:rPr>
                 <w:t>gmail.com</w:t>
               </w:r>
@@ -11639,7 +11619,6 @@
       <w:r>
         <w:rPr>
           <w:rStyle w:val="None"/>
-          <w:lang w:val="en-US"/>
         </w:rPr>
         <w:t xml:space="preserve"> </w:t>
       </w:r>
@@ -13455,6 +13434,35 @@
       </w14:textOutline>
     </w:rPr>
   </w:style>
+  <w:style w:type="paragraph" w:customStyle="1" w:styleId="3-">
+    <w:name w:val="3 - Математичке формуле"/>
+    <w:basedOn w:val="Normal"/>
+    <w:link w:val="3-Char"/>
+    <w:qFormat/>
+    <w:rsid w:val="00524514"/>
+    <w:pPr>
+      <w:pBdr>
+        <w:top w:val="none" w:sz="0" w:space="0" w:color="auto"/>
+        <w:left w:val="none" w:sz="0" w:space="0" w:color="auto"/>
+        <w:bottom w:val="none" w:sz="0" w:space="0" w:color="auto"/>
+        <w:right w:val="none" w:sz="0" w:space="0" w:color="auto"/>
+        <w:between w:val="none" w:sz="0" w:space="0" w:color="auto"/>
+        <w:bar w:val="none" w:sz="0" w:color="auto"/>
+      </w:pBdr>
+      <w:suppressAutoHyphens/>
+      <w:spacing w:before="120"/>
+      <w:ind w:firstLine="360"/>
+      <w:jc w:val="both"/>
+    </w:pPr>
+    <w:rPr>
+      <w:rFonts w:ascii="Cambria Math" w:eastAsia="Times New Roman" w:hAnsi="Cambria Math"/>
+      <w:i/>
+      <w:iCs/>
+      <w:sz w:val="20"/>
+      <w:szCs w:val="20"/>
+      <w:bdr w:val="none" w:sz="0" w:space="0" w:color="auto"/>
+    </w:rPr>
+  </w:style>
   <w:style w:type="paragraph" w:customStyle="1" w:styleId="9-">
     <w:name w:val="9 - Заглавље"/>
     <w:pPr>
@@ -13624,6 +13632,8 @@
   <w:style w:type="paragraph" w:styleId="Caption">
     <w:name w:val="caption"/>
     <w:next w:val="Normal"/>
+    <w:uiPriority w:val="35"/>
+    <w:qFormat/>
     <w:pPr>
       <w:spacing w:before="120" w:after="120"/>
       <w:ind w:firstLine="360"/>
@@ -13728,6 +13738,102 @@
       <w:color w:val="000000"/>
       <w:u w:color="000000"/>
       <w:lang w:val="en-US"/>
+    </w:rPr>
+  </w:style>
+  <w:style w:type="character" w:customStyle="1" w:styleId="3-Char">
+    <w:name w:val="3 - Математичке формуле Char"/>
+    <w:basedOn w:val="DefaultParagraphFont"/>
+    <w:link w:val="3-"/>
+    <w:qFormat/>
+    <w:rsid w:val="00524514"/>
+    <w:rPr>
+      <w:rFonts w:ascii="Cambria Math" w:eastAsia="Times New Roman" w:hAnsi="Cambria Math"/>
+      <w:i/>
+      <w:iCs/>
+      <w:bdr w:val="none" w:sz="0" w:space="0" w:color="auto"/>
+      <w:lang w:val="en-US" w:eastAsia="en-US"/>
+    </w:rPr>
+  </w:style>
+  <w:style w:type="paragraph" w:customStyle="1" w:styleId="7-Sadrajapstraktaikljunihrei">
+    <w:name w:val="7 - Sadržaj apstrakta i ključnih reči"/>
+    <w:link w:val="7-SadrajapstraktaikljunihreiChar"/>
+    <w:qFormat/>
+    <w:rsid w:val="00524514"/>
+    <w:pPr>
+      <w:pBdr>
+        <w:top w:val="none" w:sz="0" w:space="0" w:color="auto"/>
+        <w:left w:val="none" w:sz="0" w:space="0" w:color="auto"/>
+        <w:bottom w:val="none" w:sz="0" w:space="0" w:color="auto"/>
+        <w:right w:val="none" w:sz="0" w:space="0" w:color="auto"/>
+        <w:between w:val="none" w:sz="0" w:space="0" w:color="auto"/>
+        <w:bar w:val="none" w:sz="0" w:color="auto"/>
+      </w:pBdr>
+      <w:suppressAutoHyphens/>
+    </w:pPr>
+    <w:rPr>
+      <w:rFonts w:asciiTheme="minorHAnsi" w:eastAsia="Times New Roman" w:hAnsiTheme="minorHAnsi"/>
+      <w:i/>
+      <w:iCs/>
+      <w:bdr w:val="none" w:sz="0" w:space="0" w:color="auto"/>
+      <w:lang w:val="sr-Latn-CS" w:eastAsia="en-US"/>
+    </w:rPr>
+  </w:style>
+  <w:style w:type="character" w:customStyle="1" w:styleId="7-SadrajapstraktaikljunihreiChar">
+    <w:name w:val="7 - Sadržaj apstrakta i ključnih reči Char"/>
+    <w:basedOn w:val="DefaultParagraphFont"/>
+    <w:link w:val="7-Sadrajapstraktaikljunihrei"/>
+    <w:qFormat/>
+    <w:rsid w:val="00524514"/>
+    <w:rPr>
+      <w:rFonts w:asciiTheme="minorHAnsi" w:eastAsia="Times New Roman" w:hAnsiTheme="minorHAnsi"/>
+      <w:i/>
+      <w:iCs/>
+      <w:bdr w:val="none" w:sz="0" w:space="0" w:color="auto"/>
+      <w:lang w:val="sr-Latn-CS" w:eastAsia="en-US"/>
+    </w:rPr>
+  </w:style>
+  <w:style w:type="paragraph" w:customStyle="1" w:styleId="7-">
+    <w:name w:val="7 - Афилијација"/>
+    <w:basedOn w:val="Normal"/>
+    <w:link w:val="7-Char"/>
+    <w:qFormat/>
+    <w:rsid w:val="00524514"/>
+    <w:pPr>
+      <w:pBdr>
+        <w:top w:val="none" w:sz="0" w:space="0" w:color="auto"/>
+        <w:left w:val="none" w:sz="0" w:space="0" w:color="auto"/>
+        <w:bottom w:val="none" w:sz="0" w:space="0" w:color="auto"/>
+        <w:right w:val="none" w:sz="0" w:space="0" w:color="auto"/>
+        <w:between w:val="none" w:sz="0" w:space="0" w:color="auto"/>
+        <w:bar w:val="none" w:sz="0" w:color="auto"/>
+      </w:pBdr>
+      <w:suppressAutoHyphens/>
+      <w:spacing w:before="120"/>
+      <w:ind w:firstLine="360"/>
+      <w:jc w:val="center"/>
+    </w:pPr>
+    <w:rPr>
+      <w:rFonts w:eastAsia="Times New Roman"/>
+      <w:i/>
+      <w:iCs/>
+      <w:bdr w:val="none" w:sz="0" w:space="0" w:color="auto"/>
+      <w:lang w:val="sr-Latn-CS"/>
+    </w:rPr>
+  </w:style>
+  <w:style w:type="character" w:customStyle="1" w:styleId="7-Char">
+    <w:name w:val="7 - Афилијација Char"/>
+    <w:basedOn w:val="DefaultParagraphFont"/>
+    <w:link w:val="7-"/>
+    <w:qFormat/>
+    <w:rsid w:val="00524514"/>
+    <w:rPr>
+      <w:rFonts w:eastAsia="Times New Roman"/>
+      <w:i/>
+      <w:iCs/>
+      <w:sz w:val="24"/>
+      <w:szCs w:val="24"/>
+      <w:bdr w:val="none" w:sz="0" w:space="0" w:color="auto"/>
+      <w:lang w:val="sr-Latn-CS" w:eastAsia="en-US"/>
     </w:rPr>
   </w:style>
 </w:styles>

</xml_diff>